<commit_message>
Assigned who is doing what
</commit_message>
<xml_diff>
--- a/Documents/User Groups & Profiles.docx
+++ b/Documents/User Groups & Profiles.docx
@@ -5,11 +5,20 @@
     <w:p>
       <w:pPr>
         <w:pStyle w:val="Heading1"/>
+        <w:rPr>
+          <w:u w:val="single"/>
+        </w:rPr>
       </w:pPr>
       <w:r>
+        <w:rPr>
+          <w:u w:val="single"/>
+        </w:rPr>
         <w:t xml:space="preserve">Veterinary </w:t>
       </w:r>
       <w:r>
+        <w:rPr>
+          <w:u w:val="single"/>
+        </w:rPr>
         <w:t>Hospital User Groups &amp; Profiles</w:t>
       </w:r>
     </w:p>
@@ -19,10 +28,22 @@
         <w:pStyle w:val="Heading2"/>
       </w:pPr>
       <w:r>
-        <w:t>User</w:t>
-      </w:r>
-      <w:r>
-        <w:t xml:space="preserve"> Group Needs, Wants, &amp; Pain Points</w:t>
+        <w:t>Description of User Groups</w:t>
+      </w:r>
+      <w:r>
+        <w:t xml:space="preserve"> (Dylan)</w:t>
+      </w:r>
+    </w:p>
+    <w:p/>
+    <w:p>
+      <w:pPr>
+        <w:pStyle w:val="Heading3"/>
+      </w:pPr>
+      <w:r>
+        <w:t>Subgroups</w:t>
+      </w:r>
+      <w:r>
+        <w:t xml:space="preserve"> (Dylan)</w:t>
       </w:r>
     </w:p>
     <w:p/>
@@ -31,16 +52,10 @@
         <w:pStyle w:val="Heading2"/>
       </w:pPr>
       <w:r>
-        <w:t>Description of User Groups</w:t>
-      </w:r>
-    </w:p>
-    <w:p/>
-    <w:p>
-      <w:pPr>
-        <w:pStyle w:val="Heading3"/>
-      </w:pPr>
-      <w:r>
-        <w:t>Subgroups</w:t>
+        <w:t>User Group Needs, Wants, &amp; Pain Points</w:t>
+      </w:r>
+      <w:r>
+        <w:t xml:space="preserve"> (Calvin)</w:t>
       </w:r>
     </w:p>
     <w:p/>
@@ -54,6 +69,12 @@
       <w:r>
         <w:t>ies</w:t>
       </w:r>
+      <w:r>
+        <w:t xml:space="preserve"> (Nath</w:t>
+      </w:r>
+      <w:r>
+        <w:t>an)</w:t>
+      </w:r>
     </w:p>
     <w:p/>
     <w:p>
@@ -63,6 +84,9 @@
       <w:r>
         <w:t>Profiles</w:t>
       </w:r>
+      <w:r>
+        <w:t xml:space="preserve"> (Triv)</w:t>
+      </w:r>
     </w:p>
     <w:p/>
     <w:p>
@@ -71,6 +95,9 @@
       </w:pPr>
       <w:r>
         <w:t>Group Priorities &amp; Why</w:t>
+      </w:r>
+      <w:r>
+        <w:t xml:space="preserve"> (Triv)</w:t>
       </w:r>
     </w:p>
     <w:sectPr>

</xml_diff>

<commit_message>
(Triv) added to document
I added the user profiles for the Patient, Vet Tech, and Front-End Staff as well as a paragraph to why we're going to focus on the Patient Experience most.
</commit_message>
<xml_diff>
--- a/Documents/User Groups & Profiles.docx
+++ b/Documents/User Groups & Profiles.docx
@@ -38,6 +38,7 @@
     <w:p>
       <w:pPr>
         <w:pStyle w:val="Heading3"/>
+        <w:ind w:firstLine="720"/>
       </w:pPr>
       <w:r>
         <w:t>Subgroups</w:t>
@@ -88,9 +89,1135 @@
         <w:t xml:space="preserve"> (Triv)</w:t>
       </w:r>
     </w:p>
+    <w:p>
+      <w:pPr>
+        <w:pStyle w:val="Heading3"/>
+        <w:ind w:firstLine="360"/>
+      </w:pPr>
+      <w:r>
+        <w:t>Patient</w:t>
+      </w:r>
+    </w:p>
+    <w:p>
+      <w:pPr>
+        <w:ind w:firstLine="720"/>
+        <w:rPr>
+          <w:b/>
+          <w:bCs/>
+        </w:rPr>
+      </w:pPr>
+      <w:r>
+        <w:rPr>
+          <w:b/>
+          <w:bCs/>
+        </w:rPr>
+        <w:t>Demographics</w:t>
+      </w:r>
+    </w:p>
+    <w:p>
+      <w:pPr>
+        <w:numPr>
+          <w:ilvl w:val="0"/>
+          <w:numId w:val="1"/>
+        </w:numPr>
+        <w:tabs>
+          <w:tab w:val="num" w:pos="720"/>
+        </w:tabs>
+      </w:pPr>
+      <w:r>
+        <w:rPr>
+          <w:b/>
+          <w:bCs/>
+        </w:rPr>
+        <w:t>Name:</w:t>
+      </w:r>
+      <w:r>
+        <w:t xml:space="preserve"> Varies (pet owners of any gender)</w:t>
+      </w:r>
+    </w:p>
+    <w:p>
+      <w:pPr>
+        <w:numPr>
+          <w:ilvl w:val="0"/>
+          <w:numId w:val="1"/>
+        </w:numPr>
+        <w:tabs>
+          <w:tab w:val="num" w:pos="720"/>
+        </w:tabs>
+      </w:pPr>
+      <w:r>
+        <w:rPr>
+          <w:b/>
+          <w:bCs/>
+        </w:rPr>
+        <w:t>Age Range:</w:t>
+      </w:r>
+      <w:r>
+        <w:t xml:space="preserve"> 20–60 years old</w:t>
+      </w:r>
+    </w:p>
+    <w:p>
+      <w:pPr>
+        <w:numPr>
+          <w:ilvl w:val="0"/>
+          <w:numId w:val="1"/>
+        </w:numPr>
+        <w:tabs>
+          <w:tab w:val="num" w:pos="720"/>
+        </w:tabs>
+      </w:pPr>
+      <w:r>
+        <w:rPr>
+          <w:b/>
+          <w:bCs/>
+        </w:rPr>
+        <w:t>Location:</w:t>
+      </w:r>
+      <w:r>
+        <w:t xml:space="preserve"> Lives near the veterinary hospital</w:t>
+      </w:r>
+    </w:p>
+    <w:p>
+      <w:pPr>
+        <w:numPr>
+          <w:ilvl w:val="0"/>
+          <w:numId w:val="1"/>
+        </w:numPr>
+        <w:tabs>
+          <w:tab w:val="num" w:pos="720"/>
+        </w:tabs>
+      </w:pPr>
+      <w:r>
+        <w:rPr>
+          <w:b/>
+          <w:bCs/>
+        </w:rPr>
+        <w:t>Occupation:</w:t>
+      </w:r>
+      <w:r>
+        <w:t xml:space="preserve"> </w:t>
+      </w:r>
+      <w:proofErr w:type="gramStart"/>
+      <w:r>
+        <w:t>Working</w:t>
+      </w:r>
+      <w:proofErr w:type="gramEnd"/>
+      <w:r>
+        <w:t xml:space="preserve"> adult, student, parent, or retired</w:t>
+      </w:r>
+    </w:p>
+    <w:p>
+      <w:pPr>
+        <w:numPr>
+          <w:ilvl w:val="0"/>
+          <w:numId w:val="1"/>
+        </w:numPr>
+        <w:tabs>
+          <w:tab w:val="num" w:pos="720"/>
+        </w:tabs>
+      </w:pPr>
+      <w:r>
+        <w:rPr>
+          <w:b/>
+          <w:bCs/>
+        </w:rPr>
+        <w:t>Education:</w:t>
+      </w:r>
+      <w:r>
+        <w:t xml:space="preserve"> High school or college educated</w:t>
+      </w:r>
+    </w:p>
     <w:p/>
     <w:p>
       <w:pPr>
+        <w:ind w:firstLine="720"/>
+        <w:rPr>
+          <w:b/>
+          <w:bCs/>
+        </w:rPr>
+      </w:pPr>
+      <w:r>
+        <w:rPr>
+          <w:b/>
+          <w:bCs/>
+        </w:rPr>
+        <w:t>Technology Use</w:t>
+      </w:r>
+    </w:p>
+    <w:p>
+      <w:pPr>
+        <w:numPr>
+          <w:ilvl w:val="0"/>
+          <w:numId w:val="2"/>
+        </w:numPr>
+        <w:tabs>
+          <w:tab w:val="num" w:pos="720"/>
+        </w:tabs>
+      </w:pPr>
+      <w:proofErr w:type="gramStart"/>
+      <w:r>
+        <w:t>Uses</w:t>
+      </w:r>
+      <w:proofErr w:type="gramEnd"/>
+      <w:r>
+        <w:t xml:space="preserve"> smartphone the most</w:t>
+      </w:r>
+    </w:p>
+    <w:p>
+      <w:pPr>
+        <w:numPr>
+          <w:ilvl w:val="0"/>
+          <w:numId w:val="2"/>
+        </w:numPr>
+        <w:tabs>
+          <w:tab w:val="num" w:pos="720"/>
+        </w:tabs>
+      </w:pPr>
+      <w:proofErr w:type="gramStart"/>
+      <w:r>
+        <w:t>Sometimes</w:t>
+      </w:r>
+      <w:proofErr w:type="gramEnd"/>
+      <w:r>
+        <w:t xml:space="preserve"> </w:t>
+      </w:r>
+      <w:proofErr w:type="gramStart"/>
+      <w:r>
+        <w:t>uses</w:t>
+      </w:r>
+      <w:proofErr w:type="gramEnd"/>
+      <w:r>
+        <w:t xml:space="preserve"> a laptop to book appointments</w:t>
+      </w:r>
+    </w:p>
+    <w:p>
+      <w:pPr>
+        <w:numPr>
+          <w:ilvl w:val="0"/>
+          <w:numId w:val="2"/>
+        </w:numPr>
+        <w:tabs>
+          <w:tab w:val="num" w:pos="720"/>
+        </w:tabs>
+      </w:pPr>
+      <w:r>
+        <w:t>Searches on Google to find the vet’s website</w:t>
+      </w:r>
+    </w:p>
+    <w:p>
+      <w:pPr>
+        <w:numPr>
+          <w:ilvl w:val="0"/>
+          <w:numId w:val="2"/>
+        </w:numPr>
+        <w:tabs>
+          <w:tab w:val="num" w:pos="720"/>
+        </w:tabs>
+      </w:pPr>
+      <w:r>
+        <w:t>Prefers online booking instead of calling</w:t>
+      </w:r>
+    </w:p>
+    <w:p>
+      <w:pPr>
+        <w:numPr>
+          <w:ilvl w:val="0"/>
+          <w:numId w:val="2"/>
+        </w:numPr>
+        <w:tabs>
+          <w:tab w:val="num" w:pos="720"/>
+        </w:tabs>
+      </w:pPr>
+      <w:r>
+        <w:t>Reads reviews before choosing a vet</w:t>
+      </w:r>
+    </w:p>
+    <w:p>
+      <w:pPr>
+        <w:numPr>
+          <w:ilvl w:val="0"/>
+          <w:numId w:val="2"/>
+        </w:numPr>
+        <w:tabs>
+          <w:tab w:val="num" w:pos="720"/>
+        </w:tabs>
+      </w:pPr>
+      <w:proofErr w:type="gramStart"/>
+      <w:r>
+        <w:t>Likes</w:t>
+      </w:r>
+      <w:proofErr w:type="gramEnd"/>
+      <w:r>
+        <w:t xml:space="preserve"> clear buttons and simple steps</w:t>
+      </w:r>
+    </w:p>
+    <w:p/>
+    <w:p>
+      <w:pPr>
+        <w:ind w:firstLine="720"/>
+        <w:rPr>
+          <w:b/>
+          <w:bCs/>
+        </w:rPr>
+      </w:pPr>
+      <w:r>
+        <w:rPr>
+          <w:b/>
+          <w:bCs/>
+        </w:rPr>
+        <w:t>Motivations and Goals</w:t>
+      </w:r>
+    </w:p>
+    <w:p>
+      <w:pPr>
+        <w:numPr>
+          <w:ilvl w:val="0"/>
+          <w:numId w:val="3"/>
+        </w:numPr>
+        <w:tabs>
+          <w:tab w:val="num" w:pos="720"/>
+        </w:tabs>
+      </w:pPr>
+      <w:r>
+        <w:t>Keep their pet healthy</w:t>
+      </w:r>
+    </w:p>
+    <w:p>
+      <w:pPr>
+        <w:numPr>
+          <w:ilvl w:val="0"/>
+          <w:numId w:val="3"/>
+        </w:numPr>
+        <w:tabs>
+          <w:tab w:val="num" w:pos="720"/>
+        </w:tabs>
+      </w:pPr>
+      <w:r>
+        <w:t>Book appointments quickly and easily</w:t>
+      </w:r>
+    </w:p>
+    <w:p>
+      <w:pPr>
+        <w:numPr>
+          <w:ilvl w:val="0"/>
+          <w:numId w:val="3"/>
+        </w:numPr>
+        <w:tabs>
+          <w:tab w:val="num" w:pos="720"/>
+        </w:tabs>
+      </w:pPr>
+      <w:r>
+        <w:t>Know prices ahead of time if possible</w:t>
+      </w:r>
+    </w:p>
+    <w:p>
+      <w:pPr>
+        <w:numPr>
+          <w:ilvl w:val="0"/>
+          <w:numId w:val="3"/>
+        </w:numPr>
+        <w:tabs>
+          <w:tab w:val="num" w:pos="720"/>
+        </w:tabs>
+      </w:pPr>
+      <w:r>
+        <w:t>Get reminders so they don’t forget</w:t>
+      </w:r>
+    </w:p>
+    <w:p>
+      <w:pPr>
+        <w:numPr>
+          <w:ilvl w:val="0"/>
+          <w:numId w:val="3"/>
+        </w:numPr>
+        <w:tabs>
+          <w:tab w:val="num" w:pos="720"/>
+        </w:tabs>
+      </w:pPr>
+      <w:r>
+        <w:t>Feel like their pet is cared about</w:t>
+      </w:r>
+    </w:p>
+    <w:p/>
+    <w:p>
+      <w:pPr>
+        <w:ind w:firstLine="720"/>
+        <w:rPr>
+          <w:b/>
+          <w:bCs/>
+        </w:rPr>
+      </w:pPr>
+      <w:r>
+        <w:rPr>
+          <w:b/>
+          <w:bCs/>
+        </w:rPr>
+        <w:t>Challenges and Pain Points</w:t>
+      </w:r>
+    </w:p>
+    <w:p>
+      <w:pPr>
+        <w:numPr>
+          <w:ilvl w:val="0"/>
+          <w:numId w:val="4"/>
+        </w:numPr>
+        <w:tabs>
+          <w:tab w:val="num" w:pos="720"/>
+        </w:tabs>
+      </w:pPr>
+      <w:r>
+        <w:t>Hard to find available appointment times</w:t>
+      </w:r>
+    </w:p>
+    <w:p>
+      <w:pPr>
+        <w:numPr>
+          <w:ilvl w:val="0"/>
+          <w:numId w:val="4"/>
+        </w:numPr>
+        <w:tabs>
+          <w:tab w:val="num" w:pos="720"/>
+        </w:tabs>
+      </w:pPr>
+      <w:r>
+        <w:t>Confusing forms that take too long</w:t>
+      </w:r>
+    </w:p>
+    <w:p>
+      <w:pPr>
+        <w:numPr>
+          <w:ilvl w:val="0"/>
+          <w:numId w:val="4"/>
+        </w:numPr>
+        <w:tabs>
+          <w:tab w:val="num" w:pos="720"/>
+        </w:tabs>
+      </w:pPr>
+      <w:r>
+        <w:t>Not knowing what services cost</w:t>
+      </w:r>
+    </w:p>
+    <w:p>
+      <w:pPr>
+        <w:numPr>
+          <w:ilvl w:val="0"/>
+          <w:numId w:val="4"/>
+        </w:numPr>
+        <w:tabs>
+          <w:tab w:val="num" w:pos="720"/>
+        </w:tabs>
+      </w:pPr>
+      <w:r>
+        <w:t>Being put on hold when calling</w:t>
+      </w:r>
+    </w:p>
+    <w:p>
+      <w:pPr>
+        <w:numPr>
+          <w:ilvl w:val="0"/>
+          <w:numId w:val="4"/>
+        </w:numPr>
+        <w:tabs>
+          <w:tab w:val="num" w:pos="720"/>
+        </w:tabs>
+      </w:pPr>
+      <w:proofErr w:type="gramStart"/>
+      <w:r>
+        <w:t>Website not working</w:t>
+      </w:r>
+      <w:proofErr w:type="gramEnd"/>
+      <w:r>
+        <w:t xml:space="preserve"> well on phone</w:t>
+      </w:r>
+    </w:p>
+    <w:p>
+      <w:pPr>
+        <w:numPr>
+          <w:ilvl w:val="0"/>
+          <w:numId w:val="4"/>
+        </w:numPr>
+      </w:pPr>
+      <w:r>
+        <w:t>Not sure what to do in an emergency</w:t>
+      </w:r>
+    </w:p>
+    <w:p/>
+    <w:p>
+      <w:pPr>
+        <w:pStyle w:val="Heading3"/>
+        <w:ind w:firstLine="360"/>
+      </w:pPr>
+      <w:r>
+        <w:t>Veterinary Technician</w:t>
+      </w:r>
+    </w:p>
+    <w:p>
+      <w:pPr>
+        <w:ind w:firstLine="720"/>
+        <w:rPr>
+          <w:b/>
+          <w:bCs/>
+        </w:rPr>
+      </w:pPr>
+      <w:r>
+        <w:rPr>
+          <w:b/>
+          <w:bCs/>
+        </w:rPr>
+        <w:t>Demographics</w:t>
+      </w:r>
+    </w:p>
+    <w:p>
+      <w:pPr>
+        <w:numPr>
+          <w:ilvl w:val="0"/>
+          <w:numId w:val="5"/>
+        </w:numPr>
+      </w:pPr>
+      <w:r>
+        <w:rPr>
+          <w:b/>
+          <w:bCs/>
+        </w:rPr>
+        <w:t>Name:</w:t>
+      </w:r>
+      <w:r>
+        <w:t xml:space="preserve"> Varies</w:t>
+      </w:r>
+    </w:p>
+    <w:p>
+      <w:pPr>
+        <w:numPr>
+          <w:ilvl w:val="0"/>
+          <w:numId w:val="5"/>
+        </w:numPr>
+      </w:pPr>
+      <w:r>
+        <w:rPr>
+          <w:b/>
+          <w:bCs/>
+        </w:rPr>
+        <w:t>Age Range:</w:t>
+      </w:r>
+      <w:r>
+        <w:t xml:space="preserve"> 20–40 years old</w:t>
+      </w:r>
+    </w:p>
+    <w:p>
+      <w:pPr>
+        <w:numPr>
+          <w:ilvl w:val="0"/>
+          <w:numId w:val="5"/>
+        </w:numPr>
+      </w:pPr>
+      <w:r>
+        <w:rPr>
+          <w:b/>
+          <w:bCs/>
+        </w:rPr>
+        <w:t>Occupation:</w:t>
+      </w:r>
+      <w:r>
+        <w:t xml:space="preserve"> Full-time veterinary technician</w:t>
+      </w:r>
+    </w:p>
+    <w:p>
+      <w:pPr>
+        <w:numPr>
+          <w:ilvl w:val="0"/>
+          <w:numId w:val="5"/>
+        </w:numPr>
+      </w:pPr>
+      <w:r>
+        <w:rPr>
+          <w:b/>
+          <w:bCs/>
+        </w:rPr>
+        <w:t>Education:</w:t>
+      </w:r>
+      <w:r>
+        <w:t xml:space="preserve"> Vet tech degree or certification</w:t>
+      </w:r>
+    </w:p>
+    <w:p/>
+    <w:p>
+      <w:pPr>
+        <w:ind w:firstLine="720"/>
+        <w:rPr>
+          <w:b/>
+          <w:bCs/>
+        </w:rPr>
+      </w:pPr>
+      <w:r>
+        <w:rPr>
+          <w:b/>
+          <w:bCs/>
+        </w:rPr>
+        <w:t>Technology Use</w:t>
+      </w:r>
+    </w:p>
+    <w:p>
+      <w:pPr>
+        <w:numPr>
+          <w:ilvl w:val="0"/>
+          <w:numId w:val="6"/>
+        </w:numPr>
+      </w:pPr>
+      <w:r>
+        <w:t>Uses desktop computer at the clinic</w:t>
+      </w:r>
+    </w:p>
+    <w:p>
+      <w:pPr>
+        <w:numPr>
+          <w:ilvl w:val="0"/>
+          <w:numId w:val="6"/>
+        </w:numPr>
+      </w:pPr>
+      <w:r>
+        <w:t>Uses scheduling software during work hours</w:t>
+      </w:r>
+    </w:p>
+    <w:p>
+      <w:pPr>
+        <w:numPr>
+          <w:ilvl w:val="0"/>
+          <w:numId w:val="6"/>
+        </w:numPr>
+      </w:pPr>
+      <w:r>
+        <w:t>Checks appointment notes before seeing patients</w:t>
+      </w:r>
+    </w:p>
+    <w:p>
+      <w:pPr>
+        <w:numPr>
+          <w:ilvl w:val="0"/>
+          <w:numId w:val="6"/>
+        </w:numPr>
+      </w:pPr>
+      <w:r>
+        <w:t xml:space="preserve">Sometimes answers </w:t>
+      </w:r>
+      <w:proofErr w:type="gramStart"/>
+      <w:r>
+        <w:t>calls</w:t>
+      </w:r>
+      <w:proofErr w:type="gramEnd"/>
+      <w:r>
+        <w:t xml:space="preserve"> about bookings</w:t>
+      </w:r>
+    </w:p>
+    <w:p/>
+    <w:p>
+      <w:pPr>
+        <w:ind w:firstLine="720"/>
+        <w:rPr>
+          <w:b/>
+          <w:bCs/>
+        </w:rPr>
+      </w:pPr>
+      <w:r>
+        <w:rPr>
+          <w:b/>
+          <w:bCs/>
+        </w:rPr>
+        <w:t>Motivations and Goals</w:t>
+      </w:r>
+    </w:p>
+    <w:p>
+      <w:pPr>
+        <w:numPr>
+          <w:ilvl w:val="0"/>
+          <w:numId w:val="7"/>
+        </w:numPr>
+      </w:pPr>
+      <w:r>
+        <w:t>Keep the daily schedule organized</w:t>
+      </w:r>
+    </w:p>
+    <w:p>
+      <w:pPr>
+        <w:numPr>
+          <w:ilvl w:val="0"/>
+          <w:numId w:val="7"/>
+        </w:numPr>
+      </w:pPr>
+      <w:r>
+        <w:t>Avoid double bookings</w:t>
+      </w:r>
+    </w:p>
+    <w:p>
+      <w:pPr>
+        <w:numPr>
+          <w:ilvl w:val="0"/>
+          <w:numId w:val="7"/>
+        </w:numPr>
+      </w:pPr>
+      <w:r>
+        <w:t>Have clear notes from pet owners before visits</w:t>
+      </w:r>
+    </w:p>
+    <w:p>
+      <w:pPr>
+        <w:numPr>
+          <w:ilvl w:val="0"/>
+          <w:numId w:val="7"/>
+        </w:numPr>
+      </w:pPr>
+      <w:r>
+        <w:t>Save time during busy shifts</w:t>
+      </w:r>
+    </w:p>
+    <w:p>
+      <w:pPr>
+        <w:numPr>
+          <w:ilvl w:val="0"/>
+          <w:numId w:val="7"/>
+        </w:numPr>
+      </w:pPr>
+      <w:r>
+        <w:t>Help pets quickly and safely</w:t>
+      </w:r>
+    </w:p>
+    <w:p/>
+    <w:p>
+      <w:pPr>
+        <w:ind w:firstLine="720"/>
+        <w:rPr>
+          <w:b/>
+          <w:bCs/>
+        </w:rPr>
+      </w:pPr>
+      <w:r>
+        <w:rPr>
+          <w:b/>
+          <w:bCs/>
+        </w:rPr>
+        <w:t>Challenges and Pain Points</w:t>
+      </w:r>
+    </w:p>
+    <w:p>
+      <w:pPr>
+        <w:numPr>
+          <w:ilvl w:val="0"/>
+          <w:numId w:val="8"/>
+        </w:numPr>
+      </w:pPr>
+      <w:r>
+        <w:t>Incomplete information from online forms</w:t>
+      </w:r>
+    </w:p>
+    <w:p>
+      <w:pPr>
+        <w:numPr>
+          <w:ilvl w:val="0"/>
+          <w:numId w:val="8"/>
+        </w:numPr>
+      </w:pPr>
+      <w:r>
+        <w:t>Last-minute cancellations</w:t>
+      </w:r>
+    </w:p>
+    <w:p>
+      <w:pPr>
+        <w:numPr>
+          <w:ilvl w:val="0"/>
+          <w:numId w:val="8"/>
+        </w:numPr>
+      </w:pPr>
+      <w:r>
+        <w:t>Overbooked schedules</w:t>
+      </w:r>
+    </w:p>
+    <w:p>
+      <w:pPr>
+        <w:numPr>
+          <w:ilvl w:val="0"/>
+          <w:numId w:val="8"/>
+        </w:numPr>
+      </w:pPr>
+      <w:r>
+        <w:t>Pet owners not filling out forms correctly</w:t>
+      </w:r>
+    </w:p>
+    <w:p>
+      <w:pPr>
+        <w:numPr>
+          <w:ilvl w:val="0"/>
+          <w:numId w:val="8"/>
+        </w:numPr>
+      </w:pPr>
+      <w:r>
+        <w:t>System glitches slowing things down</w:t>
+      </w:r>
+    </w:p>
+    <w:p/>
+    <w:p>
+      <w:pPr>
+        <w:pStyle w:val="Heading3"/>
+        <w:ind w:firstLine="360"/>
+      </w:pPr>
+      <w:r>
+        <w:t>Front-End Staff (Reception)</w:t>
+      </w:r>
+    </w:p>
+    <w:p>
+      <w:pPr>
+        <w:ind w:firstLine="720"/>
+        <w:rPr>
+          <w:b/>
+          <w:bCs/>
+        </w:rPr>
+      </w:pPr>
+      <w:r>
+        <w:rPr>
+          <w:b/>
+          <w:bCs/>
+        </w:rPr>
+        <w:t>Demographics</w:t>
+      </w:r>
+    </w:p>
+    <w:p>
+      <w:pPr>
+        <w:numPr>
+          <w:ilvl w:val="0"/>
+          <w:numId w:val="9"/>
+        </w:numPr>
+      </w:pPr>
+      <w:r>
+        <w:rPr>
+          <w:b/>
+          <w:bCs/>
+        </w:rPr>
+        <w:t>Name:</w:t>
+      </w:r>
+      <w:r>
+        <w:t xml:space="preserve"> Varies</w:t>
+      </w:r>
+    </w:p>
+    <w:p>
+      <w:pPr>
+        <w:numPr>
+          <w:ilvl w:val="0"/>
+          <w:numId w:val="9"/>
+        </w:numPr>
+      </w:pPr>
+      <w:r>
+        <w:rPr>
+          <w:b/>
+          <w:bCs/>
+        </w:rPr>
+        <w:t>Age Range:</w:t>
+      </w:r>
+      <w:r>
+        <w:t xml:space="preserve"> 22–55 years old</w:t>
+      </w:r>
+    </w:p>
+    <w:p>
+      <w:pPr>
+        <w:numPr>
+          <w:ilvl w:val="0"/>
+          <w:numId w:val="9"/>
+        </w:numPr>
+      </w:pPr>
+      <w:r>
+        <w:rPr>
+          <w:b/>
+          <w:bCs/>
+        </w:rPr>
+        <w:t>Occupation:</w:t>
+      </w:r>
+      <w:r>
+        <w:t xml:space="preserve"> Receptionist or front desk staff</w:t>
+      </w:r>
+    </w:p>
+    <w:p>
+      <w:pPr>
+        <w:numPr>
+          <w:ilvl w:val="0"/>
+          <w:numId w:val="9"/>
+        </w:numPr>
+      </w:pPr>
+      <w:r>
+        <w:rPr>
+          <w:b/>
+          <w:bCs/>
+        </w:rPr>
+        <w:t>Education:</w:t>
+      </w:r>
+      <w:r>
+        <w:t xml:space="preserve"> High school diploma or some college</w:t>
+      </w:r>
+    </w:p>
+    <w:p/>
+    <w:p>
+      <w:pPr>
+        <w:ind w:firstLine="720"/>
+        <w:rPr>
+          <w:b/>
+          <w:bCs/>
+        </w:rPr>
+      </w:pPr>
+      <w:r>
+        <w:rPr>
+          <w:b/>
+          <w:bCs/>
+        </w:rPr>
+        <w:t>Technology Use</w:t>
+      </w:r>
+    </w:p>
+    <w:p>
+      <w:pPr>
+        <w:numPr>
+          <w:ilvl w:val="0"/>
+          <w:numId w:val="10"/>
+        </w:numPr>
+        <w:tabs>
+          <w:tab w:val="num" w:pos="720"/>
+        </w:tabs>
+      </w:pPr>
+      <w:proofErr w:type="gramStart"/>
+      <w:r>
+        <w:t>Uses</w:t>
+      </w:r>
+      <w:proofErr w:type="gramEnd"/>
+      <w:r>
+        <w:t xml:space="preserve"> office </w:t>
+      </w:r>
+      <w:proofErr w:type="gramStart"/>
+      <w:r>
+        <w:t>computer</w:t>
+      </w:r>
+      <w:proofErr w:type="gramEnd"/>
+      <w:r>
+        <w:t xml:space="preserve"> all day</w:t>
+      </w:r>
+    </w:p>
+    <w:p>
+      <w:pPr>
+        <w:numPr>
+          <w:ilvl w:val="0"/>
+          <w:numId w:val="10"/>
+        </w:numPr>
+        <w:tabs>
+          <w:tab w:val="num" w:pos="720"/>
+        </w:tabs>
+      </w:pPr>
+      <w:r>
+        <w:t>Answers phone calls for appointments</w:t>
+      </w:r>
+    </w:p>
+    <w:p>
+      <w:pPr>
+        <w:numPr>
+          <w:ilvl w:val="0"/>
+          <w:numId w:val="10"/>
+        </w:numPr>
+        <w:tabs>
+          <w:tab w:val="num" w:pos="720"/>
+        </w:tabs>
+      </w:pPr>
+      <w:r>
+        <w:t>Confirms online bookings</w:t>
+      </w:r>
+    </w:p>
+    <w:p>
+      <w:pPr>
+        <w:numPr>
+          <w:ilvl w:val="0"/>
+          <w:numId w:val="10"/>
+        </w:numPr>
+        <w:tabs>
+          <w:tab w:val="num" w:pos="720"/>
+        </w:tabs>
+      </w:pPr>
+      <w:proofErr w:type="gramStart"/>
+      <w:r>
+        <w:t>Sends</w:t>
+      </w:r>
+      <w:proofErr w:type="gramEnd"/>
+      <w:r>
+        <w:t xml:space="preserve"> reminder emails or texts</w:t>
+      </w:r>
+    </w:p>
+    <w:p/>
+    <w:p>
+      <w:pPr>
+        <w:ind w:firstLine="720"/>
+        <w:rPr>
+          <w:b/>
+          <w:bCs/>
+        </w:rPr>
+      </w:pPr>
+      <w:r>
+        <w:rPr>
+          <w:b/>
+          <w:bCs/>
+        </w:rPr>
+        <w:t>Motivations and Goals</w:t>
+      </w:r>
+    </w:p>
+    <w:p>
+      <w:pPr>
+        <w:numPr>
+          <w:ilvl w:val="0"/>
+          <w:numId w:val="11"/>
+        </w:numPr>
+        <w:tabs>
+          <w:tab w:val="num" w:pos="720"/>
+        </w:tabs>
+      </w:pPr>
+      <w:r>
+        <w:t>Keep appointment calendar accurate</w:t>
+      </w:r>
+    </w:p>
+    <w:p>
+      <w:pPr>
+        <w:numPr>
+          <w:ilvl w:val="0"/>
+          <w:numId w:val="11"/>
+        </w:numPr>
+        <w:tabs>
+          <w:tab w:val="num" w:pos="720"/>
+        </w:tabs>
+      </w:pPr>
+      <w:r>
+        <w:t>Answer questions clearly</w:t>
+      </w:r>
+    </w:p>
+    <w:p>
+      <w:pPr>
+        <w:numPr>
+          <w:ilvl w:val="0"/>
+          <w:numId w:val="11"/>
+        </w:numPr>
+        <w:tabs>
+          <w:tab w:val="num" w:pos="720"/>
+        </w:tabs>
+      </w:pPr>
+      <w:r>
+        <w:t>Help pet owners feel welcome</w:t>
+      </w:r>
+    </w:p>
+    <w:p>
+      <w:pPr>
+        <w:numPr>
+          <w:ilvl w:val="0"/>
+          <w:numId w:val="11"/>
+        </w:numPr>
+        <w:tabs>
+          <w:tab w:val="num" w:pos="720"/>
+        </w:tabs>
+      </w:pPr>
+      <w:r>
+        <w:t>Reduce time spent on phone calls</w:t>
+      </w:r>
+    </w:p>
+    <w:p>
+      <w:pPr>
+        <w:numPr>
+          <w:ilvl w:val="0"/>
+          <w:numId w:val="11"/>
+        </w:numPr>
+        <w:tabs>
+          <w:tab w:val="num" w:pos="720"/>
+        </w:tabs>
+      </w:pPr>
+      <w:r>
+        <w:t>Keep the front desk organized</w:t>
+      </w:r>
+    </w:p>
+    <w:p/>
+    <w:p>
+      <w:pPr>
+        <w:ind w:left="360" w:firstLine="720"/>
+        <w:rPr>
+          <w:b/>
+          <w:bCs/>
+        </w:rPr>
+      </w:pPr>
+      <w:r>
+        <w:rPr>
+          <w:b/>
+          <w:bCs/>
+        </w:rPr>
+        <w:t>Challenges and Pain Points</w:t>
+      </w:r>
+    </w:p>
+    <w:p>
+      <w:pPr>
+        <w:numPr>
+          <w:ilvl w:val="0"/>
+          <w:numId w:val="12"/>
+        </w:numPr>
+        <w:tabs>
+          <w:tab w:val="num" w:pos="720"/>
+        </w:tabs>
+      </w:pPr>
+      <w:r>
+        <w:t>High call volume during busy hours</w:t>
+      </w:r>
+    </w:p>
+    <w:p>
+      <w:pPr>
+        <w:numPr>
+          <w:ilvl w:val="0"/>
+          <w:numId w:val="12"/>
+        </w:numPr>
+        <w:tabs>
+          <w:tab w:val="num" w:pos="720"/>
+        </w:tabs>
+      </w:pPr>
+      <w:r>
+        <w:t>Fixing mistakes from online bookings</w:t>
+      </w:r>
+    </w:p>
+    <w:p>
+      <w:pPr>
+        <w:numPr>
+          <w:ilvl w:val="0"/>
+          <w:numId w:val="12"/>
+        </w:numPr>
+        <w:tabs>
+          <w:tab w:val="num" w:pos="720"/>
+        </w:tabs>
+      </w:pPr>
+      <w:r>
+        <w:t>Angry or stressed pet owners</w:t>
+      </w:r>
+    </w:p>
+    <w:p>
+      <w:pPr>
+        <w:numPr>
+          <w:ilvl w:val="0"/>
+          <w:numId w:val="12"/>
+        </w:numPr>
+        <w:tabs>
+          <w:tab w:val="num" w:pos="720"/>
+        </w:tabs>
+      </w:pPr>
+      <w:r>
+        <w:t>System running slow</w:t>
+      </w:r>
+    </w:p>
+    <w:p>
+      <w:pPr>
+        <w:numPr>
+          <w:ilvl w:val="0"/>
+          <w:numId w:val="12"/>
+        </w:numPr>
+        <w:tabs>
+          <w:tab w:val="num" w:pos="720"/>
+        </w:tabs>
+      </w:pPr>
+      <w:r>
+        <w:t>Trying to multitask between calls and in-person check-ins</w:t>
+      </w:r>
+    </w:p>
+    <w:p/>
+    <w:p>
+      <w:pPr>
         <w:pStyle w:val="Heading2"/>
       </w:pPr>
       <w:r>
@@ -100,6 +1227,51 @@
         <w:t xml:space="preserve"> (Triv)</w:t>
       </w:r>
     </w:p>
+    <w:p>
+      <w:pPr>
+        <w:rPr>
+          <w:b/>
+          <w:bCs/>
+          <w:u w:val="single"/>
+        </w:rPr>
+      </w:pPr>
+      <w:r>
+        <w:rPr>
+          <w:b/>
+          <w:bCs/>
+          <w:u w:val="single"/>
+        </w:rPr>
+        <w:t xml:space="preserve">Why We Will Focus on </w:t>
+      </w:r>
+      <w:r>
+        <w:rPr>
+          <w:b/>
+          <w:bCs/>
+          <w:u w:val="single"/>
+        </w:rPr>
+        <w:t>Patient</w:t>
+      </w:r>
+      <w:r>
+        <w:rPr>
+          <w:b/>
+          <w:bCs/>
+          <w:u w:val="single"/>
+        </w:rPr>
+        <w:t xml:space="preserve"> User Experience</w:t>
+      </w:r>
+    </w:p>
+    <w:p>
+      <w:r>
+        <w:t xml:space="preserve">We are going to focus mostly on the patient (pet owner) user experience because they are the main people using the website. If booking an appointment is simple and clear for them, it helps everyone else too. When pet owners can easily schedule online and fill out forms correctly, it saves time for the front desk and the vet techs. It also reduces phone calls and mistakes. If the website works well for patients, they are more likely to come back and recommend the hospital to others. </w:t>
+      </w:r>
+      <w:r>
+        <w:t>So,</w:t>
+      </w:r>
+      <w:r>
+        <w:t xml:space="preserve"> improving their experience helps the whole clinic run better.</w:t>
+      </w:r>
+    </w:p>
+    <w:p/>
     <w:sectPr>
       <w:pgSz w:w="12240" w:h="15840"/>
       <w:pgMar w:top="1440" w:right="1440" w:bottom="1440" w:left="1440" w:header="720" w:footer="720" w:gutter="0"/>
@@ -108,6 +1280,1835 @@
     </w:sectPr>
   </w:body>
 </w:document>
+</file>
+
+<file path=word/numbering.xml><?xml version="1.0" encoding="utf-8"?>
+<w:numbering xmlns:wpc="http://schemas.microsoft.com/office/word/2010/wordprocessingCanvas" xmlns:cx="http://schemas.microsoft.com/office/drawing/2014/chartex" xmlns:cx1="http://schemas.microsoft.com/office/drawing/2015/9/8/chartex" xmlns:cx2="http://schemas.microsoft.com/office/drawing/2015/10/21/chartex" xmlns:cx3="http://schemas.microsoft.com/office/drawing/2016/5/9/chartex" xmlns:cx4="http://schemas.microsoft.com/office/drawing/2016/5/10/chartex" xmlns:cx5="http://schemas.microsoft.com/office/drawing/2016/5/11/chartex" xmlns:cx6="http://schemas.microsoft.com/office/drawing/2016/5/12/chartex" xmlns:cx7="http://schemas.microsoft.com/office/drawing/2016/5/13/chartex" xmlns:cx8="http://schemas.microsoft.com/office/drawing/2016/5/14/chartex" xmlns:mc="http://schemas.openxmlformats.org/markup-compatibility/2006" xmlns:aink="http://schemas.microsoft.com/office/drawing/2016/ink" xmlns:am3d="http://schemas.microsoft.com/office/drawing/2017/model3d" xmlns:o="urn:schemas-microsoft-com:office:office" xmlns:oel="http://schemas.microsoft.com/office/2019/extlst" xmlns:r="http://schemas.openxmlformats.org/officeDocument/2006/relationships" xmlns:m="http://schemas.openxmlformats.org/officeDocument/2006/math" xmlns:v="urn:schemas-microsoft-com:vml" xmlns:wp14="http://schemas.microsoft.com/office/word/2010/wordprocessingDrawing" xmlns:wp="http://schemas.openxmlformats.org/drawingml/2006/wordprocessingDrawing" xmlns:w10="urn:schemas-microsoft-com:office:word" xmlns:w="http://schemas.openxmlformats.org/wordprocessingml/2006/main" xmlns:w14="http://schemas.microsoft.com/office/word/2010/wordml" xmlns:w15="http://schemas.microsoft.com/office/word/2012/wordml" xmlns:w16cex="http://schemas.microsoft.com/office/word/2018/wordml/cex" xmlns:w16cid="http://schemas.microsoft.com/office/word/2016/wordml/cid" xmlns:w16="http://schemas.microsoft.com/office/word/2018/wordml" xmlns:w16du="http://schemas.microsoft.com/office/word/2023/wordml/word16du" xmlns:w16sdtdh="http://schemas.microsoft.com/office/word/2020/wordml/sdtdatahash" xmlns:w16sdtfl="http://schemas.microsoft.com/office/word/2024/wordml/sdtformatlock" xmlns:w16se="http://schemas.microsoft.com/office/word/2015/wordml/symex" xmlns:wpg="http://schemas.microsoft.com/office/word/2010/wordprocessingGroup" xmlns:wpi="http://schemas.microsoft.com/office/word/2010/wordprocessingInk" xmlns:wne="http://schemas.microsoft.com/office/word/2006/wordml" xmlns:wps="http://schemas.microsoft.com/office/word/2010/wordprocessingShape" mc:Ignorable="w14 w15 w16se w16cid w16 w16cex w16sdtdh w16sdtfl w16du wp14">
+  <w:abstractNum w:abstractNumId="0" w15:restartNumberingAfterBreak="0">
+    <w:nsid w:val="025A7864"/>
+    <w:multiLevelType w:val="multilevel"/>
+    <w:tmpl w:val="C5341176"/>
+    <w:lvl w:ilvl="0">
+      <w:start w:val="1"/>
+      <w:numFmt w:val="bullet"/>
+      <w:lvlText w:val=""/>
+      <w:lvlJc w:val="left"/>
+      <w:pPr>
+        <w:tabs>
+          <w:tab w:val="num" w:pos="1440"/>
+        </w:tabs>
+        <w:ind w:left="1440" w:hanging="360"/>
+      </w:pPr>
+      <w:rPr>
+        <w:rFonts w:ascii="Symbol" w:hAnsi="Symbol" w:hint="default"/>
+        <w:sz w:val="20"/>
+      </w:rPr>
+    </w:lvl>
+    <w:lvl w:ilvl="1" w:tentative="1">
+      <w:start w:val="1"/>
+      <w:numFmt w:val="bullet"/>
+      <w:lvlText w:val="o"/>
+      <w:lvlJc w:val="left"/>
+      <w:pPr>
+        <w:tabs>
+          <w:tab w:val="num" w:pos="2160"/>
+        </w:tabs>
+        <w:ind w:left="2160" w:hanging="360"/>
+      </w:pPr>
+      <w:rPr>
+        <w:rFonts w:ascii="Courier New" w:hAnsi="Courier New" w:hint="default"/>
+        <w:sz w:val="20"/>
+      </w:rPr>
+    </w:lvl>
+    <w:lvl w:ilvl="2" w:tentative="1">
+      <w:start w:val="1"/>
+      <w:numFmt w:val="bullet"/>
+      <w:lvlText w:val=""/>
+      <w:lvlJc w:val="left"/>
+      <w:pPr>
+        <w:tabs>
+          <w:tab w:val="num" w:pos="2880"/>
+        </w:tabs>
+        <w:ind w:left="2880" w:hanging="360"/>
+      </w:pPr>
+      <w:rPr>
+        <w:rFonts w:ascii="Wingdings" w:hAnsi="Wingdings" w:hint="default"/>
+        <w:sz w:val="20"/>
+      </w:rPr>
+    </w:lvl>
+    <w:lvl w:ilvl="3" w:tentative="1">
+      <w:start w:val="1"/>
+      <w:numFmt w:val="bullet"/>
+      <w:lvlText w:val=""/>
+      <w:lvlJc w:val="left"/>
+      <w:pPr>
+        <w:tabs>
+          <w:tab w:val="num" w:pos="3600"/>
+        </w:tabs>
+        <w:ind w:left="3600" w:hanging="360"/>
+      </w:pPr>
+      <w:rPr>
+        <w:rFonts w:ascii="Wingdings" w:hAnsi="Wingdings" w:hint="default"/>
+        <w:sz w:val="20"/>
+      </w:rPr>
+    </w:lvl>
+    <w:lvl w:ilvl="4" w:tentative="1">
+      <w:start w:val="1"/>
+      <w:numFmt w:val="bullet"/>
+      <w:lvlText w:val=""/>
+      <w:lvlJc w:val="left"/>
+      <w:pPr>
+        <w:tabs>
+          <w:tab w:val="num" w:pos="4320"/>
+        </w:tabs>
+        <w:ind w:left="4320" w:hanging="360"/>
+      </w:pPr>
+      <w:rPr>
+        <w:rFonts w:ascii="Wingdings" w:hAnsi="Wingdings" w:hint="default"/>
+        <w:sz w:val="20"/>
+      </w:rPr>
+    </w:lvl>
+    <w:lvl w:ilvl="5" w:tentative="1">
+      <w:start w:val="1"/>
+      <w:numFmt w:val="bullet"/>
+      <w:lvlText w:val=""/>
+      <w:lvlJc w:val="left"/>
+      <w:pPr>
+        <w:tabs>
+          <w:tab w:val="num" w:pos="5040"/>
+        </w:tabs>
+        <w:ind w:left="5040" w:hanging="360"/>
+      </w:pPr>
+      <w:rPr>
+        <w:rFonts w:ascii="Wingdings" w:hAnsi="Wingdings" w:hint="default"/>
+        <w:sz w:val="20"/>
+      </w:rPr>
+    </w:lvl>
+    <w:lvl w:ilvl="6" w:tentative="1">
+      <w:start w:val="1"/>
+      <w:numFmt w:val="bullet"/>
+      <w:lvlText w:val=""/>
+      <w:lvlJc w:val="left"/>
+      <w:pPr>
+        <w:tabs>
+          <w:tab w:val="num" w:pos="5760"/>
+        </w:tabs>
+        <w:ind w:left="5760" w:hanging="360"/>
+      </w:pPr>
+      <w:rPr>
+        <w:rFonts w:ascii="Wingdings" w:hAnsi="Wingdings" w:hint="default"/>
+        <w:sz w:val="20"/>
+      </w:rPr>
+    </w:lvl>
+    <w:lvl w:ilvl="7" w:tentative="1">
+      <w:start w:val="1"/>
+      <w:numFmt w:val="bullet"/>
+      <w:lvlText w:val=""/>
+      <w:lvlJc w:val="left"/>
+      <w:pPr>
+        <w:tabs>
+          <w:tab w:val="num" w:pos="6480"/>
+        </w:tabs>
+        <w:ind w:left="6480" w:hanging="360"/>
+      </w:pPr>
+      <w:rPr>
+        <w:rFonts w:ascii="Wingdings" w:hAnsi="Wingdings" w:hint="default"/>
+        <w:sz w:val="20"/>
+      </w:rPr>
+    </w:lvl>
+    <w:lvl w:ilvl="8" w:tentative="1">
+      <w:start w:val="1"/>
+      <w:numFmt w:val="bullet"/>
+      <w:lvlText w:val=""/>
+      <w:lvlJc w:val="left"/>
+      <w:pPr>
+        <w:tabs>
+          <w:tab w:val="num" w:pos="7200"/>
+        </w:tabs>
+        <w:ind w:left="7200" w:hanging="360"/>
+      </w:pPr>
+      <w:rPr>
+        <w:rFonts w:ascii="Wingdings" w:hAnsi="Wingdings" w:hint="default"/>
+        <w:sz w:val="20"/>
+      </w:rPr>
+    </w:lvl>
+  </w:abstractNum>
+  <w:abstractNum w:abstractNumId="1" w15:restartNumberingAfterBreak="0">
+    <w:nsid w:val="03BF672A"/>
+    <w:multiLevelType w:val="multilevel"/>
+    <w:tmpl w:val="F65CD00E"/>
+    <w:lvl w:ilvl="0">
+      <w:start w:val="1"/>
+      <w:numFmt w:val="bullet"/>
+      <w:lvlText w:val=""/>
+      <w:lvlJc w:val="left"/>
+      <w:pPr>
+        <w:tabs>
+          <w:tab w:val="num" w:pos="1440"/>
+        </w:tabs>
+        <w:ind w:left="1440" w:hanging="360"/>
+      </w:pPr>
+      <w:rPr>
+        <w:rFonts w:ascii="Symbol" w:hAnsi="Symbol" w:hint="default"/>
+        <w:sz w:val="20"/>
+      </w:rPr>
+    </w:lvl>
+    <w:lvl w:ilvl="1" w:tentative="1">
+      <w:start w:val="1"/>
+      <w:numFmt w:val="bullet"/>
+      <w:lvlText w:val="o"/>
+      <w:lvlJc w:val="left"/>
+      <w:pPr>
+        <w:tabs>
+          <w:tab w:val="num" w:pos="2160"/>
+        </w:tabs>
+        <w:ind w:left="2160" w:hanging="360"/>
+      </w:pPr>
+      <w:rPr>
+        <w:rFonts w:ascii="Courier New" w:hAnsi="Courier New" w:hint="default"/>
+        <w:sz w:val="20"/>
+      </w:rPr>
+    </w:lvl>
+    <w:lvl w:ilvl="2" w:tentative="1">
+      <w:start w:val="1"/>
+      <w:numFmt w:val="bullet"/>
+      <w:lvlText w:val=""/>
+      <w:lvlJc w:val="left"/>
+      <w:pPr>
+        <w:tabs>
+          <w:tab w:val="num" w:pos="2880"/>
+        </w:tabs>
+        <w:ind w:left="2880" w:hanging="360"/>
+      </w:pPr>
+      <w:rPr>
+        <w:rFonts w:ascii="Wingdings" w:hAnsi="Wingdings" w:hint="default"/>
+        <w:sz w:val="20"/>
+      </w:rPr>
+    </w:lvl>
+    <w:lvl w:ilvl="3" w:tentative="1">
+      <w:start w:val="1"/>
+      <w:numFmt w:val="bullet"/>
+      <w:lvlText w:val=""/>
+      <w:lvlJc w:val="left"/>
+      <w:pPr>
+        <w:tabs>
+          <w:tab w:val="num" w:pos="3600"/>
+        </w:tabs>
+        <w:ind w:left="3600" w:hanging="360"/>
+      </w:pPr>
+      <w:rPr>
+        <w:rFonts w:ascii="Wingdings" w:hAnsi="Wingdings" w:hint="default"/>
+        <w:sz w:val="20"/>
+      </w:rPr>
+    </w:lvl>
+    <w:lvl w:ilvl="4" w:tentative="1">
+      <w:start w:val="1"/>
+      <w:numFmt w:val="bullet"/>
+      <w:lvlText w:val=""/>
+      <w:lvlJc w:val="left"/>
+      <w:pPr>
+        <w:tabs>
+          <w:tab w:val="num" w:pos="4320"/>
+        </w:tabs>
+        <w:ind w:left="4320" w:hanging="360"/>
+      </w:pPr>
+      <w:rPr>
+        <w:rFonts w:ascii="Wingdings" w:hAnsi="Wingdings" w:hint="default"/>
+        <w:sz w:val="20"/>
+      </w:rPr>
+    </w:lvl>
+    <w:lvl w:ilvl="5" w:tentative="1">
+      <w:start w:val="1"/>
+      <w:numFmt w:val="bullet"/>
+      <w:lvlText w:val=""/>
+      <w:lvlJc w:val="left"/>
+      <w:pPr>
+        <w:tabs>
+          <w:tab w:val="num" w:pos="5040"/>
+        </w:tabs>
+        <w:ind w:left="5040" w:hanging="360"/>
+      </w:pPr>
+      <w:rPr>
+        <w:rFonts w:ascii="Wingdings" w:hAnsi="Wingdings" w:hint="default"/>
+        <w:sz w:val="20"/>
+      </w:rPr>
+    </w:lvl>
+    <w:lvl w:ilvl="6" w:tentative="1">
+      <w:start w:val="1"/>
+      <w:numFmt w:val="bullet"/>
+      <w:lvlText w:val=""/>
+      <w:lvlJc w:val="left"/>
+      <w:pPr>
+        <w:tabs>
+          <w:tab w:val="num" w:pos="5760"/>
+        </w:tabs>
+        <w:ind w:left="5760" w:hanging="360"/>
+      </w:pPr>
+      <w:rPr>
+        <w:rFonts w:ascii="Wingdings" w:hAnsi="Wingdings" w:hint="default"/>
+        <w:sz w:val="20"/>
+      </w:rPr>
+    </w:lvl>
+    <w:lvl w:ilvl="7" w:tentative="1">
+      <w:start w:val="1"/>
+      <w:numFmt w:val="bullet"/>
+      <w:lvlText w:val=""/>
+      <w:lvlJc w:val="left"/>
+      <w:pPr>
+        <w:tabs>
+          <w:tab w:val="num" w:pos="6480"/>
+        </w:tabs>
+        <w:ind w:left="6480" w:hanging="360"/>
+      </w:pPr>
+      <w:rPr>
+        <w:rFonts w:ascii="Wingdings" w:hAnsi="Wingdings" w:hint="default"/>
+        <w:sz w:val="20"/>
+      </w:rPr>
+    </w:lvl>
+    <w:lvl w:ilvl="8" w:tentative="1">
+      <w:start w:val="1"/>
+      <w:numFmt w:val="bullet"/>
+      <w:lvlText w:val=""/>
+      <w:lvlJc w:val="left"/>
+      <w:pPr>
+        <w:tabs>
+          <w:tab w:val="num" w:pos="7200"/>
+        </w:tabs>
+        <w:ind w:left="7200" w:hanging="360"/>
+      </w:pPr>
+      <w:rPr>
+        <w:rFonts w:ascii="Wingdings" w:hAnsi="Wingdings" w:hint="default"/>
+        <w:sz w:val="20"/>
+      </w:rPr>
+    </w:lvl>
+  </w:abstractNum>
+  <w:abstractNum w:abstractNumId="2" w15:restartNumberingAfterBreak="0">
+    <w:nsid w:val="18B16FB8"/>
+    <w:multiLevelType w:val="multilevel"/>
+    <w:tmpl w:val="72965624"/>
+    <w:lvl w:ilvl="0">
+      <w:start w:val="1"/>
+      <w:numFmt w:val="bullet"/>
+      <w:lvlText w:val=""/>
+      <w:lvlJc w:val="left"/>
+      <w:pPr>
+        <w:tabs>
+          <w:tab w:val="num" w:pos="1440"/>
+        </w:tabs>
+        <w:ind w:left="1440" w:hanging="360"/>
+      </w:pPr>
+      <w:rPr>
+        <w:rFonts w:ascii="Symbol" w:hAnsi="Symbol" w:hint="default"/>
+        <w:sz w:val="20"/>
+      </w:rPr>
+    </w:lvl>
+    <w:lvl w:ilvl="1" w:tentative="1">
+      <w:start w:val="1"/>
+      <w:numFmt w:val="bullet"/>
+      <w:lvlText w:val="o"/>
+      <w:lvlJc w:val="left"/>
+      <w:pPr>
+        <w:tabs>
+          <w:tab w:val="num" w:pos="2160"/>
+        </w:tabs>
+        <w:ind w:left="2160" w:hanging="360"/>
+      </w:pPr>
+      <w:rPr>
+        <w:rFonts w:ascii="Courier New" w:hAnsi="Courier New" w:hint="default"/>
+        <w:sz w:val="20"/>
+      </w:rPr>
+    </w:lvl>
+    <w:lvl w:ilvl="2" w:tentative="1">
+      <w:start w:val="1"/>
+      <w:numFmt w:val="bullet"/>
+      <w:lvlText w:val=""/>
+      <w:lvlJc w:val="left"/>
+      <w:pPr>
+        <w:tabs>
+          <w:tab w:val="num" w:pos="2880"/>
+        </w:tabs>
+        <w:ind w:left="2880" w:hanging="360"/>
+      </w:pPr>
+      <w:rPr>
+        <w:rFonts w:ascii="Wingdings" w:hAnsi="Wingdings" w:hint="default"/>
+        <w:sz w:val="20"/>
+      </w:rPr>
+    </w:lvl>
+    <w:lvl w:ilvl="3" w:tentative="1">
+      <w:start w:val="1"/>
+      <w:numFmt w:val="bullet"/>
+      <w:lvlText w:val=""/>
+      <w:lvlJc w:val="left"/>
+      <w:pPr>
+        <w:tabs>
+          <w:tab w:val="num" w:pos="3600"/>
+        </w:tabs>
+        <w:ind w:left="3600" w:hanging="360"/>
+      </w:pPr>
+      <w:rPr>
+        <w:rFonts w:ascii="Wingdings" w:hAnsi="Wingdings" w:hint="default"/>
+        <w:sz w:val="20"/>
+      </w:rPr>
+    </w:lvl>
+    <w:lvl w:ilvl="4" w:tentative="1">
+      <w:start w:val="1"/>
+      <w:numFmt w:val="bullet"/>
+      <w:lvlText w:val=""/>
+      <w:lvlJc w:val="left"/>
+      <w:pPr>
+        <w:tabs>
+          <w:tab w:val="num" w:pos="4320"/>
+        </w:tabs>
+        <w:ind w:left="4320" w:hanging="360"/>
+      </w:pPr>
+      <w:rPr>
+        <w:rFonts w:ascii="Wingdings" w:hAnsi="Wingdings" w:hint="default"/>
+        <w:sz w:val="20"/>
+      </w:rPr>
+    </w:lvl>
+    <w:lvl w:ilvl="5" w:tentative="1">
+      <w:start w:val="1"/>
+      <w:numFmt w:val="bullet"/>
+      <w:lvlText w:val=""/>
+      <w:lvlJc w:val="left"/>
+      <w:pPr>
+        <w:tabs>
+          <w:tab w:val="num" w:pos="5040"/>
+        </w:tabs>
+        <w:ind w:left="5040" w:hanging="360"/>
+      </w:pPr>
+      <w:rPr>
+        <w:rFonts w:ascii="Wingdings" w:hAnsi="Wingdings" w:hint="default"/>
+        <w:sz w:val="20"/>
+      </w:rPr>
+    </w:lvl>
+    <w:lvl w:ilvl="6" w:tentative="1">
+      <w:start w:val="1"/>
+      <w:numFmt w:val="bullet"/>
+      <w:lvlText w:val=""/>
+      <w:lvlJc w:val="left"/>
+      <w:pPr>
+        <w:tabs>
+          <w:tab w:val="num" w:pos="5760"/>
+        </w:tabs>
+        <w:ind w:left="5760" w:hanging="360"/>
+      </w:pPr>
+      <w:rPr>
+        <w:rFonts w:ascii="Wingdings" w:hAnsi="Wingdings" w:hint="default"/>
+        <w:sz w:val="20"/>
+      </w:rPr>
+    </w:lvl>
+    <w:lvl w:ilvl="7" w:tentative="1">
+      <w:start w:val="1"/>
+      <w:numFmt w:val="bullet"/>
+      <w:lvlText w:val=""/>
+      <w:lvlJc w:val="left"/>
+      <w:pPr>
+        <w:tabs>
+          <w:tab w:val="num" w:pos="6480"/>
+        </w:tabs>
+        <w:ind w:left="6480" w:hanging="360"/>
+      </w:pPr>
+      <w:rPr>
+        <w:rFonts w:ascii="Wingdings" w:hAnsi="Wingdings" w:hint="default"/>
+        <w:sz w:val="20"/>
+      </w:rPr>
+    </w:lvl>
+    <w:lvl w:ilvl="8" w:tentative="1">
+      <w:start w:val="1"/>
+      <w:numFmt w:val="bullet"/>
+      <w:lvlText w:val=""/>
+      <w:lvlJc w:val="left"/>
+      <w:pPr>
+        <w:tabs>
+          <w:tab w:val="num" w:pos="7200"/>
+        </w:tabs>
+        <w:ind w:left="7200" w:hanging="360"/>
+      </w:pPr>
+      <w:rPr>
+        <w:rFonts w:ascii="Wingdings" w:hAnsi="Wingdings" w:hint="default"/>
+        <w:sz w:val="20"/>
+      </w:rPr>
+    </w:lvl>
+  </w:abstractNum>
+  <w:abstractNum w:abstractNumId="3" w15:restartNumberingAfterBreak="0">
+    <w:nsid w:val="191D1BF8"/>
+    <w:multiLevelType w:val="multilevel"/>
+    <w:tmpl w:val="6AAE2020"/>
+    <w:lvl w:ilvl="0">
+      <w:start w:val="1"/>
+      <w:numFmt w:val="bullet"/>
+      <w:lvlText w:val=""/>
+      <w:lvlJc w:val="left"/>
+      <w:pPr>
+        <w:tabs>
+          <w:tab w:val="num" w:pos="1440"/>
+        </w:tabs>
+        <w:ind w:left="1440" w:hanging="360"/>
+      </w:pPr>
+      <w:rPr>
+        <w:rFonts w:ascii="Symbol" w:hAnsi="Symbol" w:hint="default"/>
+        <w:sz w:val="20"/>
+      </w:rPr>
+    </w:lvl>
+    <w:lvl w:ilvl="1" w:tentative="1">
+      <w:start w:val="1"/>
+      <w:numFmt w:val="bullet"/>
+      <w:lvlText w:val="o"/>
+      <w:lvlJc w:val="left"/>
+      <w:pPr>
+        <w:tabs>
+          <w:tab w:val="num" w:pos="2160"/>
+        </w:tabs>
+        <w:ind w:left="2160" w:hanging="360"/>
+      </w:pPr>
+      <w:rPr>
+        <w:rFonts w:ascii="Courier New" w:hAnsi="Courier New" w:hint="default"/>
+        <w:sz w:val="20"/>
+      </w:rPr>
+    </w:lvl>
+    <w:lvl w:ilvl="2" w:tentative="1">
+      <w:start w:val="1"/>
+      <w:numFmt w:val="bullet"/>
+      <w:lvlText w:val=""/>
+      <w:lvlJc w:val="left"/>
+      <w:pPr>
+        <w:tabs>
+          <w:tab w:val="num" w:pos="2880"/>
+        </w:tabs>
+        <w:ind w:left="2880" w:hanging="360"/>
+      </w:pPr>
+      <w:rPr>
+        <w:rFonts w:ascii="Wingdings" w:hAnsi="Wingdings" w:hint="default"/>
+        <w:sz w:val="20"/>
+      </w:rPr>
+    </w:lvl>
+    <w:lvl w:ilvl="3" w:tentative="1">
+      <w:start w:val="1"/>
+      <w:numFmt w:val="bullet"/>
+      <w:lvlText w:val=""/>
+      <w:lvlJc w:val="left"/>
+      <w:pPr>
+        <w:tabs>
+          <w:tab w:val="num" w:pos="3600"/>
+        </w:tabs>
+        <w:ind w:left="3600" w:hanging="360"/>
+      </w:pPr>
+      <w:rPr>
+        <w:rFonts w:ascii="Wingdings" w:hAnsi="Wingdings" w:hint="default"/>
+        <w:sz w:val="20"/>
+      </w:rPr>
+    </w:lvl>
+    <w:lvl w:ilvl="4" w:tentative="1">
+      <w:start w:val="1"/>
+      <w:numFmt w:val="bullet"/>
+      <w:lvlText w:val=""/>
+      <w:lvlJc w:val="left"/>
+      <w:pPr>
+        <w:tabs>
+          <w:tab w:val="num" w:pos="4320"/>
+        </w:tabs>
+        <w:ind w:left="4320" w:hanging="360"/>
+      </w:pPr>
+      <w:rPr>
+        <w:rFonts w:ascii="Wingdings" w:hAnsi="Wingdings" w:hint="default"/>
+        <w:sz w:val="20"/>
+      </w:rPr>
+    </w:lvl>
+    <w:lvl w:ilvl="5" w:tentative="1">
+      <w:start w:val="1"/>
+      <w:numFmt w:val="bullet"/>
+      <w:lvlText w:val=""/>
+      <w:lvlJc w:val="left"/>
+      <w:pPr>
+        <w:tabs>
+          <w:tab w:val="num" w:pos="5040"/>
+        </w:tabs>
+        <w:ind w:left="5040" w:hanging="360"/>
+      </w:pPr>
+      <w:rPr>
+        <w:rFonts w:ascii="Wingdings" w:hAnsi="Wingdings" w:hint="default"/>
+        <w:sz w:val="20"/>
+      </w:rPr>
+    </w:lvl>
+    <w:lvl w:ilvl="6" w:tentative="1">
+      <w:start w:val="1"/>
+      <w:numFmt w:val="bullet"/>
+      <w:lvlText w:val=""/>
+      <w:lvlJc w:val="left"/>
+      <w:pPr>
+        <w:tabs>
+          <w:tab w:val="num" w:pos="5760"/>
+        </w:tabs>
+        <w:ind w:left="5760" w:hanging="360"/>
+      </w:pPr>
+      <w:rPr>
+        <w:rFonts w:ascii="Wingdings" w:hAnsi="Wingdings" w:hint="default"/>
+        <w:sz w:val="20"/>
+      </w:rPr>
+    </w:lvl>
+    <w:lvl w:ilvl="7" w:tentative="1">
+      <w:start w:val="1"/>
+      <w:numFmt w:val="bullet"/>
+      <w:lvlText w:val=""/>
+      <w:lvlJc w:val="left"/>
+      <w:pPr>
+        <w:tabs>
+          <w:tab w:val="num" w:pos="6480"/>
+        </w:tabs>
+        <w:ind w:left="6480" w:hanging="360"/>
+      </w:pPr>
+      <w:rPr>
+        <w:rFonts w:ascii="Wingdings" w:hAnsi="Wingdings" w:hint="default"/>
+        <w:sz w:val="20"/>
+      </w:rPr>
+    </w:lvl>
+    <w:lvl w:ilvl="8" w:tentative="1">
+      <w:start w:val="1"/>
+      <w:numFmt w:val="bullet"/>
+      <w:lvlText w:val=""/>
+      <w:lvlJc w:val="left"/>
+      <w:pPr>
+        <w:tabs>
+          <w:tab w:val="num" w:pos="7200"/>
+        </w:tabs>
+        <w:ind w:left="7200" w:hanging="360"/>
+      </w:pPr>
+      <w:rPr>
+        <w:rFonts w:ascii="Wingdings" w:hAnsi="Wingdings" w:hint="default"/>
+        <w:sz w:val="20"/>
+      </w:rPr>
+    </w:lvl>
+  </w:abstractNum>
+  <w:abstractNum w:abstractNumId="4" w15:restartNumberingAfterBreak="0">
+    <w:nsid w:val="2CB44174"/>
+    <w:multiLevelType w:val="multilevel"/>
+    <w:tmpl w:val="9FF293B2"/>
+    <w:lvl w:ilvl="0">
+      <w:start w:val="1"/>
+      <w:numFmt w:val="bullet"/>
+      <w:lvlText w:val=""/>
+      <w:lvlJc w:val="left"/>
+      <w:pPr>
+        <w:tabs>
+          <w:tab w:val="num" w:pos="1440"/>
+        </w:tabs>
+        <w:ind w:left="1440" w:hanging="360"/>
+      </w:pPr>
+      <w:rPr>
+        <w:rFonts w:ascii="Symbol" w:hAnsi="Symbol" w:hint="default"/>
+        <w:sz w:val="20"/>
+      </w:rPr>
+    </w:lvl>
+    <w:lvl w:ilvl="1" w:tentative="1">
+      <w:start w:val="1"/>
+      <w:numFmt w:val="bullet"/>
+      <w:lvlText w:val="o"/>
+      <w:lvlJc w:val="left"/>
+      <w:pPr>
+        <w:tabs>
+          <w:tab w:val="num" w:pos="2160"/>
+        </w:tabs>
+        <w:ind w:left="2160" w:hanging="360"/>
+      </w:pPr>
+      <w:rPr>
+        <w:rFonts w:ascii="Courier New" w:hAnsi="Courier New" w:hint="default"/>
+        <w:sz w:val="20"/>
+      </w:rPr>
+    </w:lvl>
+    <w:lvl w:ilvl="2" w:tentative="1">
+      <w:start w:val="1"/>
+      <w:numFmt w:val="bullet"/>
+      <w:lvlText w:val=""/>
+      <w:lvlJc w:val="left"/>
+      <w:pPr>
+        <w:tabs>
+          <w:tab w:val="num" w:pos="2880"/>
+        </w:tabs>
+        <w:ind w:left="2880" w:hanging="360"/>
+      </w:pPr>
+      <w:rPr>
+        <w:rFonts w:ascii="Wingdings" w:hAnsi="Wingdings" w:hint="default"/>
+        <w:sz w:val="20"/>
+      </w:rPr>
+    </w:lvl>
+    <w:lvl w:ilvl="3" w:tentative="1">
+      <w:start w:val="1"/>
+      <w:numFmt w:val="bullet"/>
+      <w:lvlText w:val=""/>
+      <w:lvlJc w:val="left"/>
+      <w:pPr>
+        <w:tabs>
+          <w:tab w:val="num" w:pos="3600"/>
+        </w:tabs>
+        <w:ind w:left="3600" w:hanging="360"/>
+      </w:pPr>
+      <w:rPr>
+        <w:rFonts w:ascii="Wingdings" w:hAnsi="Wingdings" w:hint="default"/>
+        <w:sz w:val="20"/>
+      </w:rPr>
+    </w:lvl>
+    <w:lvl w:ilvl="4" w:tentative="1">
+      <w:start w:val="1"/>
+      <w:numFmt w:val="bullet"/>
+      <w:lvlText w:val=""/>
+      <w:lvlJc w:val="left"/>
+      <w:pPr>
+        <w:tabs>
+          <w:tab w:val="num" w:pos="4320"/>
+        </w:tabs>
+        <w:ind w:left="4320" w:hanging="360"/>
+      </w:pPr>
+      <w:rPr>
+        <w:rFonts w:ascii="Wingdings" w:hAnsi="Wingdings" w:hint="default"/>
+        <w:sz w:val="20"/>
+      </w:rPr>
+    </w:lvl>
+    <w:lvl w:ilvl="5" w:tentative="1">
+      <w:start w:val="1"/>
+      <w:numFmt w:val="bullet"/>
+      <w:lvlText w:val=""/>
+      <w:lvlJc w:val="left"/>
+      <w:pPr>
+        <w:tabs>
+          <w:tab w:val="num" w:pos="5040"/>
+        </w:tabs>
+        <w:ind w:left="5040" w:hanging="360"/>
+      </w:pPr>
+      <w:rPr>
+        <w:rFonts w:ascii="Wingdings" w:hAnsi="Wingdings" w:hint="default"/>
+        <w:sz w:val="20"/>
+      </w:rPr>
+    </w:lvl>
+    <w:lvl w:ilvl="6" w:tentative="1">
+      <w:start w:val="1"/>
+      <w:numFmt w:val="bullet"/>
+      <w:lvlText w:val=""/>
+      <w:lvlJc w:val="left"/>
+      <w:pPr>
+        <w:tabs>
+          <w:tab w:val="num" w:pos="5760"/>
+        </w:tabs>
+        <w:ind w:left="5760" w:hanging="360"/>
+      </w:pPr>
+      <w:rPr>
+        <w:rFonts w:ascii="Wingdings" w:hAnsi="Wingdings" w:hint="default"/>
+        <w:sz w:val="20"/>
+      </w:rPr>
+    </w:lvl>
+    <w:lvl w:ilvl="7" w:tentative="1">
+      <w:start w:val="1"/>
+      <w:numFmt w:val="bullet"/>
+      <w:lvlText w:val=""/>
+      <w:lvlJc w:val="left"/>
+      <w:pPr>
+        <w:tabs>
+          <w:tab w:val="num" w:pos="6480"/>
+        </w:tabs>
+        <w:ind w:left="6480" w:hanging="360"/>
+      </w:pPr>
+      <w:rPr>
+        <w:rFonts w:ascii="Wingdings" w:hAnsi="Wingdings" w:hint="default"/>
+        <w:sz w:val="20"/>
+      </w:rPr>
+    </w:lvl>
+    <w:lvl w:ilvl="8" w:tentative="1">
+      <w:start w:val="1"/>
+      <w:numFmt w:val="bullet"/>
+      <w:lvlText w:val=""/>
+      <w:lvlJc w:val="left"/>
+      <w:pPr>
+        <w:tabs>
+          <w:tab w:val="num" w:pos="7200"/>
+        </w:tabs>
+        <w:ind w:left="7200" w:hanging="360"/>
+      </w:pPr>
+      <w:rPr>
+        <w:rFonts w:ascii="Wingdings" w:hAnsi="Wingdings" w:hint="default"/>
+        <w:sz w:val="20"/>
+      </w:rPr>
+    </w:lvl>
+  </w:abstractNum>
+  <w:abstractNum w:abstractNumId="5" w15:restartNumberingAfterBreak="0">
+    <w:nsid w:val="424B7BFD"/>
+    <w:multiLevelType w:val="multilevel"/>
+    <w:tmpl w:val="BBAE9C78"/>
+    <w:lvl w:ilvl="0">
+      <w:start w:val="1"/>
+      <w:numFmt w:val="bullet"/>
+      <w:lvlText w:val=""/>
+      <w:lvlJc w:val="left"/>
+      <w:pPr>
+        <w:tabs>
+          <w:tab w:val="num" w:pos="1440"/>
+        </w:tabs>
+        <w:ind w:left="1440" w:hanging="360"/>
+      </w:pPr>
+      <w:rPr>
+        <w:rFonts w:ascii="Symbol" w:hAnsi="Symbol" w:hint="default"/>
+        <w:sz w:val="20"/>
+      </w:rPr>
+    </w:lvl>
+    <w:lvl w:ilvl="1" w:tentative="1">
+      <w:start w:val="1"/>
+      <w:numFmt w:val="bullet"/>
+      <w:lvlText w:val="o"/>
+      <w:lvlJc w:val="left"/>
+      <w:pPr>
+        <w:tabs>
+          <w:tab w:val="num" w:pos="2160"/>
+        </w:tabs>
+        <w:ind w:left="2160" w:hanging="360"/>
+      </w:pPr>
+      <w:rPr>
+        <w:rFonts w:ascii="Courier New" w:hAnsi="Courier New" w:hint="default"/>
+        <w:sz w:val="20"/>
+      </w:rPr>
+    </w:lvl>
+    <w:lvl w:ilvl="2" w:tentative="1">
+      <w:start w:val="1"/>
+      <w:numFmt w:val="bullet"/>
+      <w:lvlText w:val=""/>
+      <w:lvlJc w:val="left"/>
+      <w:pPr>
+        <w:tabs>
+          <w:tab w:val="num" w:pos="2880"/>
+        </w:tabs>
+        <w:ind w:left="2880" w:hanging="360"/>
+      </w:pPr>
+      <w:rPr>
+        <w:rFonts w:ascii="Wingdings" w:hAnsi="Wingdings" w:hint="default"/>
+        <w:sz w:val="20"/>
+      </w:rPr>
+    </w:lvl>
+    <w:lvl w:ilvl="3" w:tentative="1">
+      <w:start w:val="1"/>
+      <w:numFmt w:val="bullet"/>
+      <w:lvlText w:val=""/>
+      <w:lvlJc w:val="left"/>
+      <w:pPr>
+        <w:tabs>
+          <w:tab w:val="num" w:pos="3600"/>
+        </w:tabs>
+        <w:ind w:left="3600" w:hanging="360"/>
+      </w:pPr>
+      <w:rPr>
+        <w:rFonts w:ascii="Wingdings" w:hAnsi="Wingdings" w:hint="default"/>
+        <w:sz w:val="20"/>
+      </w:rPr>
+    </w:lvl>
+    <w:lvl w:ilvl="4" w:tentative="1">
+      <w:start w:val="1"/>
+      <w:numFmt w:val="bullet"/>
+      <w:lvlText w:val=""/>
+      <w:lvlJc w:val="left"/>
+      <w:pPr>
+        <w:tabs>
+          <w:tab w:val="num" w:pos="4320"/>
+        </w:tabs>
+        <w:ind w:left="4320" w:hanging="360"/>
+      </w:pPr>
+      <w:rPr>
+        <w:rFonts w:ascii="Wingdings" w:hAnsi="Wingdings" w:hint="default"/>
+        <w:sz w:val="20"/>
+      </w:rPr>
+    </w:lvl>
+    <w:lvl w:ilvl="5" w:tentative="1">
+      <w:start w:val="1"/>
+      <w:numFmt w:val="bullet"/>
+      <w:lvlText w:val=""/>
+      <w:lvlJc w:val="left"/>
+      <w:pPr>
+        <w:tabs>
+          <w:tab w:val="num" w:pos="5040"/>
+        </w:tabs>
+        <w:ind w:left="5040" w:hanging="360"/>
+      </w:pPr>
+      <w:rPr>
+        <w:rFonts w:ascii="Wingdings" w:hAnsi="Wingdings" w:hint="default"/>
+        <w:sz w:val="20"/>
+      </w:rPr>
+    </w:lvl>
+    <w:lvl w:ilvl="6" w:tentative="1">
+      <w:start w:val="1"/>
+      <w:numFmt w:val="bullet"/>
+      <w:lvlText w:val=""/>
+      <w:lvlJc w:val="left"/>
+      <w:pPr>
+        <w:tabs>
+          <w:tab w:val="num" w:pos="5760"/>
+        </w:tabs>
+        <w:ind w:left="5760" w:hanging="360"/>
+      </w:pPr>
+      <w:rPr>
+        <w:rFonts w:ascii="Wingdings" w:hAnsi="Wingdings" w:hint="default"/>
+        <w:sz w:val="20"/>
+      </w:rPr>
+    </w:lvl>
+    <w:lvl w:ilvl="7" w:tentative="1">
+      <w:start w:val="1"/>
+      <w:numFmt w:val="bullet"/>
+      <w:lvlText w:val=""/>
+      <w:lvlJc w:val="left"/>
+      <w:pPr>
+        <w:tabs>
+          <w:tab w:val="num" w:pos="6480"/>
+        </w:tabs>
+        <w:ind w:left="6480" w:hanging="360"/>
+      </w:pPr>
+      <w:rPr>
+        <w:rFonts w:ascii="Wingdings" w:hAnsi="Wingdings" w:hint="default"/>
+        <w:sz w:val="20"/>
+      </w:rPr>
+    </w:lvl>
+    <w:lvl w:ilvl="8" w:tentative="1">
+      <w:start w:val="1"/>
+      <w:numFmt w:val="bullet"/>
+      <w:lvlText w:val=""/>
+      <w:lvlJc w:val="left"/>
+      <w:pPr>
+        <w:tabs>
+          <w:tab w:val="num" w:pos="7200"/>
+        </w:tabs>
+        <w:ind w:left="7200" w:hanging="360"/>
+      </w:pPr>
+      <w:rPr>
+        <w:rFonts w:ascii="Wingdings" w:hAnsi="Wingdings" w:hint="default"/>
+        <w:sz w:val="20"/>
+      </w:rPr>
+    </w:lvl>
+  </w:abstractNum>
+  <w:abstractNum w:abstractNumId="6" w15:restartNumberingAfterBreak="0">
+    <w:nsid w:val="427309C0"/>
+    <w:multiLevelType w:val="multilevel"/>
+    <w:tmpl w:val="94DC2C6A"/>
+    <w:lvl w:ilvl="0">
+      <w:start w:val="1"/>
+      <w:numFmt w:val="bullet"/>
+      <w:lvlText w:val=""/>
+      <w:lvlJc w:val="left"/>
+      <w:pPr>
+        <w:tabs>
+          <w:tab w:val="num" w:pos="1440"/>
+        </w:tabs>
+        <w:ind w:left="1440" w:hanging="360"/>
+      </w:pPr>
+      <w:rPr>
+        <w:rFonts w:ascii="Symbol" w:hAnsi="Symbol" w:hint="default"/>
+        <w:sz w:val="20"/>
+      </w:rPr>
+    </w:lvl>
+    <w:lvl w:ilvl="1" w:tentative="1">
+      <w:start w:val="1"/>
+      <w:numFmt w:val="bullet"/>
+      <w:lvlText w:val="o"/>
+      <w:lvlJc w:val="left"/>
+      <w:pPr>
+        <w:tabs>
+          <w:tab w:val="num" w:pos="2160"/>
+        </w:tabs>
+        <w:ind w:left="2160" w:hanging="360"/>
+      </w:pPr>
+      <w:rPr>
+        <w:rFonts w:ascii="Courier New" w:hAnsi="Courier New" w:hint="default"/>
+        <w:sz w:val="20"/>
+      </w:rPr>
+    </w:lvl>
+    <w:lvl w:ilvl="2" w:tentative="1">
+      <w:start w:val="1"/>
+      <w:numFmt w:val="bullet"/>
+      <w:lvlText w:val=""/>
+      <w:lvlJc w:val="left"/>
+      <w:pPr>
+        <w:tabs>
+          <w:tab w:val="num" w:pos="2880"/>
+        </w:tabs>
+        <w:ind w:left="2880" w:hanging="360"/>
+      </w:pPr>
+      <w:rPr>
+        <w:rFonts w:ascii="Wingdings" w:hAnsi="Wingdings" w:hint="default"/>
+        <w:sz w:val="20"/>
+      </w:rPr>
+    </w:lvl>
+    <w:lvl w:ilvl="3" w:tentative="1">
+      <w:start w:val="1"/>
+      <w:numFmt w:val="bullet"/>
+      <w:lvlText w:val=""/>
+      <w:lvlJc w:val="left"/>
+      <w:pPr>
+        <w:tabs>
+          <w:tab w:val="num" w:pos="3600"/>
+        </w:tabs>
+        <w:ind w:left="3600" w:hanging="360"/>
+      </w:pPr>
+      <w:rPr>
+        <w:rFonts w:ascii="Wingdings" w:hAnsi="Wingdings" w:hint="default"/>
+        <w:sz w:val="20"/>
+      </w:rPr>
+    </w:lvl>
+    <w:lvl w:ilvl="4" w:tentative="1">
+      <w:start w:val="1"/>
+      <w:numFmt w:val="bullet"/>
+      <w:lvlText w:val=""/>
+      <w:lvlJc w:val="left"/>
+      <w:pPr>
+        <w:tabs>
+          <w:tab w:val="num" w:pos="4320"/>
+        </w:tabs>
+        <w:ind w:left="4320" w:hanging="360"/>
+      </w:pPr>
+      <w:rPr>
+        <w:rFonts w:ascii="Wingdings" w:hAnsi="Wingdings" w:hint="default"/>
+        <w:sz w:val="20"/>
+      </w:rPr>
+    </w:lvl>
+    <w:lvl w:ilvl="5" w:tentative="1">
+      <w:start w:val="1"/>
+      <w:numFmt w:val="bullet"/>
+      <w:lvlText w:val=""/>
+      <w:lvlJc w:val="left"/>
+      <w:pPr>
+        <w:tabs>
+          <w:tab w:val="num" w:pos="5040"/>
+        </w:tabs>
+        <w:ind w:left="5040" w:hanging="360"/>
+      </w:pPr>
+      <w:rPr>
+        <w:rFonts w:ascii="Wingdings" w:hAnsi="Wingdings" w:hint="default"/>
+        <w:sz w:val="20"/>
+      </w:rPr>
+    </w:lvl>
+    <w:lvl w:ilvl="6" w:tentative="1">
+      <w:start w:val="1"/>
+      <w:numFmt w:val="bullet"/>
+      <w:lvlText w:val=""/>
+      <w:lvlJc w:val="left"/>
+      <w:pPr>
+        <w:tabs>
+          <w:tab w:val="num" w:pos="5760"/>
+        </w:tabs>
+        <w:ind w:left="5760" w:hanging="360"/>
+      </w:pPr>
+      <w:rPr>
+        <w:rFonts w:ascii="Wingdings" w:hAnsi="Wingdings" w:hint="default"/>
+        <w:sz w:val="20"/>
+      </w:rPr>
+    </w:lvl>
+    <w:lvl w:ilvl="7" w:tentative="1">
+      <w:start w:val="1"/>
+      <w:numFmt w:val="bullet"/>
+      <w:lvlText w:val=""/>
+      <w:lvlJc w:val="left"/>
+      <w:pPr>
+        <w:tabs>
+          <w:tab w:val="num" w:pos="6480"/>
+        </w:tabs>
+        <w:ind w:left="6480" w:hanging="360"/>
+      </w:pPr>
+      <w:rPr>
+        <w:rFonts w:ascii="Wingdings" w:hAnsi="Wingdings" w:hint="default"/>
+        <w:sz w:val="20"/>
+      </w:rPr>
+    </w:lvl>
+    <w:lvl w:ilvl="8" w:tentative="1">
+      <w:start w:val="1"/>
+      <w:numFmt w:val="bullet"/>
+      <w:lvlText w:val=""/>
+      <w:lvlJc w:val="left"/>
+      <w:pPr>
+        <w:tabs>
+          <w:tab w:val="num" w:pos="7200"/>
+        </w:tabs>
+        <w:ind w:left="7200" w:hanging="360"/>
+      </w:pPr>
+      <w:rPr>
+        <w:rFonts w:ascii="Wingdings" w:hAnsi="Wingdings" w:hint="default"/>
+        <w:sz w:val="20"/>
+      </w:rPr>
+    </w:lvl>
+  </w:abstractNum>
+  <w:abstractNum w:abstractNumId="7" w15:restartNumberingAfterBreak="0">
+    <w:nsid w:val="489A0335"/>
+    <w:multiLevelType w:val="multilevel"/>
+    <w:tmpl w:val="7556CA08"/>
+    <w:lvl w:ilvl="0">
+      <w:start w:val="1"/>
+      <w:numFmt w:val="bullet"/>
+      <w:lvlText w:val=""/>
+      <w:lvlJc w:val="left"/>
+      <w:pPr>
+        <w:tabs>
+          <w:tab w:val="num" w:pos="1440"/>
+        </w:tabs>
+        <w:ind w:left="1440" w:hanging="360"/>
+      </w:pPr>
+      <w:rPr>
+        <w:rFonts w:ascii="Symbol" w:hAnsi="Symbol" w:hint="default"/>
+        <w:sz w:val="20"/>
+      </w:rPr>
+    </w:lvl>
+    <w:lvl w:ilvl="1" w:tentative="1">
+      <w:start w:val="1"/>
+      <w:numFmt w:val="bullet"/>
+      <w:lvlText w:val="o"/>
+      <w:lvlJc w:val="left"/>
+      <w:pPr>
+        <w:tabs>
+          <w:tab w:val="num" w:pos="2160"/>
+        </w:tabs>
+        <w:ind w:left="2160" w:hanging="360"/>
+      </w:pPr>
+      <w:rPr>
+        <w:rFonts w:ascii="Courier New" w:hAnsi="Courier New" w:hint="default"/>
+        <w:sz w:val="20"/>
+      </w:rPr>
+    </w:lvl>
+    <w:lvl w:ilvl="2" w:tentative="1">
+      <w:start w:val="1"/>
+      <w:numFmt w:val="bullet"/>
+      <w:lvlText w:val=""/>
+      <w:lvlJc w:val="left"/>
+      <w:pPr>
+        <w:tabs>
+          <w:tab w:val="num" w:pos="2880"/>
+        </w:tabs>
+        <w:ind w:left="2880" w:hanging="360"/>
+      </w:pPr>
+      <w:rPr>
+        <w:rFonts w:ascii="Wingdings" w:hAnsi="Wingdings" w:hint="default"/>
+        <w:sz w:val="20"/>
+      </w:rPr>
+    </w:lvl>
+    <w:lvl w:ilvl="3" w:tentative="1">
+      <w:start w:val="1"/>
+      <w:numFmt w:val="bullet"/>
+      <w:lvlText w:val=""/>
+      <w:lvlJc w:val="left"/>
+      <w:pPr>
+        <w:tabs>
+          <w:tab w:val="num" w:pos="3600"/>
+        </w:tabs>
+        <w:ind w:left="3600" w:hanging="360"/>
+      </w:pPr>
+      <w:rPr>
+        <w:rFonts w:ascii="Wingdings" w:hAnsi="Wingdings" w:hint="default"/>
+        <w:sz w:val="20"/>
+      </w:rPr>
+    </w:lvl>
+    <w:lvl w:ilvl="4" w:tentative="1">
+      <w:start w:val="1"/>
+      <w:numFmt w:val="bullet"/>
+      <w:lvlText w:val=""/>
+      <w:lvlJc w:val="left"/>
+      <w:pPr>
+        <w:tabs>
+          <w:tab w:val="num" w:pos="4320"/>
+        </w:tabs>
+        <w:ind w:left="4320" w:hanging="360"/>
+      </w:pPr>
+      <w:rPr>
+        <w:rFonts w:ascii="Wingdings" w:hAnsi="Wingdings" w:hint="default"/>
+        <w:sz w:val="20"/>
+      </w:rPr>
+    </w:lvl>
+    <w:lvl w:ilvl="5" w:tentative="1">
+      <w:start w:val="1"/>
+      <w:numFmt w:val="bullet"/>
+      <w:lvlText w:val=""/>
+      <w:lvlJc w:val="left"/>
+      <w:pPr>
+        <w:tabs>
+          <w:tab w:val="num" w:pos="5040"/>
+        </w:tabs>
+        <w:ind w:left="5040" w:hanging="360"/>
+      </w:pPr>
+      <w:rPr>
+        <w:rFonts w:ascii="Wingdings" w:hAnsi="Wingdings" w:hint="default"/>
+        <w:sz w:val="20"/>
+      </w:rPr>
+    </w:lvl>
+    <w:lvl w:ilvl="6" w:tentative="1">
+      <w:start w:val="1"/>
+      <w:numFmt w:val="bullet"/>
+      <w:lvlText w:val=""/>
+      <w:lvlJc w:val="left"/>
+      <w:pPr>
+        <w:tabs>
+          <w:tab w:val="num" w:pos="5760"/>
+        </w:tabs>
+        <w:ind w:left="5760" w:hanging="360"/>
+      </w:pPr>
+      <w:rPr>
+        <w:rFonts w:ascii="Wingdings" w:hAnsi="Wingdings" w:hint="default"/>
+        <w:sz w:val="20"/>
+      </w:rPr>
+    </w:lvl>
+    <w:lvl w:ilvl="7" w:tentative="1">
+      <w:start w:val="1"/>
+      <w:numFmt w:val="bullet"/>
+      <w:lvlText w:val=""/>
+      <w:lvlJc w:val="left"/>
+      <w:pPr>
+        <w:tabs>
+          <w:tab w:val="num" w:pos="6480"/>
+        </w:tabs>
+        <w:ind w:left="6480" w:hanging="360"/>
+      </w:pPr>
+      <w:rPr>
+        <w:rFonts w:ascii="Wingdings" w:hAnsi="Wingdings" w:hint="default"/>
+        <w:sz w:val="20"/>
+      </w:rPr>
+    </w:lvl>
+    <w:lvl w:ilvl="8" w:tentative="1">
+      <w:start w:val="1"/>
+      <w:numFmt w:val="bullet"/>
+      <w:lvlText w:val=""/>
+      <w:lvlJc w:val="left"/>
+      <w:pPr>
+        <w:tabs>
+          <w:tab w:val="num" w:pos="7200"/>
+        </w:tabs>
+        <w:ind w:left="7200" w:hanging="360"/>
+      </w:pPr>
+      <w:rPr>
+        <w:rFonts w:ascii="Wingdings" w:hAnsi="Wingdings" w:hint="default"/>
+        <w:sz w:val="20"/>
+      </w:rPr>
+    </w:lvl>
+  </w:abstractNum>
+  <w:abstractNum w:abstractNumId="8" w15:restartNumberingAfterBreak="0">
+    <w:nsid w:val="52CC2653"/>
+    <w:multiLevelType w:val="multilevel"/>
+    <w:tmpl w:val="DDB2897A"/>
+    <w:lvl w:ilvl="0">
+      <w:start w:val="1"/>
+      <w:numFmt w:val="bullet"/>
+      <w:lvlText w:val=""/>
+      <w:lvlJc w:val="left"/>
+      <w:pPr>
+        <w:tabs>
+          <w:tab w:val="num" w:pos="1440"/>
+        </w:tabs>
+        <w:ind w:left="1440" w:hanging="360"/>
+      </w:pPr>
+      <w:rPr>
+        <w:rFonts w:ascii="Symbol" w:hAnsi="Symbol" w:hint="default"/>
+        <w:sz w:val="20"/>
+      </w:rPr>
+    </w:lvl>
+    <w:lvl w:ilvl="1" w:tentative="1">
+      <w:start w:val="1"/>
+      <w:numFmt w:val="bullet"/>
+      <w:lvlText w:val="o"/>
+      <w:lvlJc w:val="left"/>
+      <w:pPr>
+        <w:tabs>
+          <w:tab w:val="num" w:pos="2160"/>
+        </w:tabs>
+        <w:ind w:left="2160" w:hanging="360"/>
+      </w:pPr>
+      <w:rPr>
+        <w:rFonts w:ascii="Courier New" w:hAnsi="Courier New" w:hint="default"/>
+        <w:sz w:val="20"/>
+      </w:rPr>
+    </w:lvl>
+    <w:lvl w:ilvl="2" w:tentative="1">
+      <w:start w:val="1"/>
+      <w:numFmt w:val="bullet"/>
+      <w:lvlText w:val=""/>
+      <w:lvlJc w:val="left"/>
+      <w:pPr>
+        <w:tabs>
+          <w:tab w:val="num" w:pos="2880"/>
+        </w:tabs>
+        <w:ind w:left="2880" w:hanging="360"/>
+      </w:pPr>
+      <w:rPr>
+        <w:rFonts w:ascii="Wingdings" w:hAnsi="Wingdings" w:hint="default"/>
+        <w:sz w:val="20"/>
+      </w:rPr>
+    </w:lvl>
+    <w:lvl w:ilvl="3" w:tentative="1">
+      <w:start w:val="1"/>
+      <w:numFmt w:val="bullet"/>
+      <w:lvlText w:val=""/>
+      <w:lvlJc w:val="left"/>
+      <w:pPr>
+        <w:tabs>
+          <w:tab w:val="num" w:pos="3600"/>
+        </w:tabs>
+        <w:ind w:left="3600" w:hanging="360"/>
+      </w:pPr>
+      <w:rPr>
+        <w:rFonts w:ascii="Wingdings" w:hAnsi="Wingdings" w:hint="default"/>
+        <w:sz w:val="20"/>
+      </w:rPr>
+    </w:lvl>
+    <w:lvl w:ilvl="4" w:tentative="1">
+      <w:start w:val="1"/>
+      <w:numFmt w:val="bullet"/>
+      <w:lvlText w:val=""/>
+      <w:lvlJc w:val="left"/>
+      <w:pPr>
+        <w:tabs>
+          <w:tab w:val="num" w:pos="4320"/>
+        </w:tabs>
+        <w:ind w:left="4320" w:hanging="360"/>
+      </w:pPr>
+      <w:rPr>
+        <w:rFonts w:ascii="Wingdings" w:hAnsi="Wingdings" w:hint="default"/>
+        <w:sz w:val="20"/>
+      </w:rPr>
+    </w:lvl>
+    <w:lvl w:ilvl="5" w:tentative="1">
+      <w:start w:val="1"/>
+      <w:numFmt w:val="bullet"/>
+      <w:lvlText w:val=""/>
+      <w:lvlJc w:val="left"/>
+      <w:pPr>
+        <w:tabs>
+          <w:tab w:val="num" w:pos="5040"/>
+        </w:tabs>
+        <w:ind w:left="5040" w:hanging="360"/>
+      </w:pPr>
+      <w:rPr>
+        <w:rFonts w:ascii="Wingdings" w:hAnsi="Wingdings" w:hint="default"/>
+        <w:sz w:val="20"/>
+      </w:rPr>
+    </w:lvl>
+    <w:lvl w:ilvl="6" w:tentative="1">
+      <w:start w:val="1"/>
+      <w:numFmt w:val="bullet"/>
+      <w:lvlText w:val=""/>
+      <w:lvlJc w:val="left"/>
+      <w:pPr>
+        <w:tabs>
+          <w:tab w:val="num" w:pos="5760"/>
+        </w:tabs>
+        <w:ind w:left="5760" w:hanging="360"/>
+      </w:pPr>
+      <w:rPr>
+        <w:rFonts w:ascii="Wingdings" w:hAnsi="Wingdings" w:hint="default"/>
+        <w:sz w:val="20"/>
+      </w:rPr>
+    </w:lvl>
+    <w:lvl w:ilvl="7" w:tentative="1">
+      <w:start w:val="1"/>
+      <w:numFmt w:val="bullet"/>
+      <w:lvlText w:val=""/>
+      <w:lvlJc w:val="left"/>
+      <w:pPr>
+        <w:tabs>
+          <w:tab w:val="num" w:pos="6480"/>
+        </w:tabs>
+        <w:ind w:left="6480" w:hanging="360"/>
+      </w:pPr>
+      <w:rPr>
+        <w:rFonts w:ascii="Wingdings" w:hAnsi="Wingdings" w:hint="default"/>
+        <w:sz w:val="20"/>
+      </w:rPr>
+    </w:lvl>
+    <w:lvl w:ilvl="8" w:tentative="1">
+      <w:start w:val="1"/>
+      <w:numFmt w:val="bullet"/>
+      <w:lvlText w:val=""/>
+      <w:lvlJc w:val="left"/>
+      <w:pPr>
+        <w:tabs>
+          <w:tab w:val="num" w:pos="7200"/>
+        </w:tabs>
+        <w:ind w:left="7200" w:hanging="360"/>
+      </w:pPr>
+      <w:rPr>
+        <w:rFonts w:ascii="Wingdings" w:hAnsi="Wingdings" w:hint="default"/>
+        <w:sz w:val="20"/>
+      </w:rPr>
+    </w:lvl>
+  </w:abstractNum>
+  <w:abstractNum w:abstractNumId="9" w15:restartNumberingAfterBreak="0">
+    <w:nsid w:val="736E26B3"/>
+    <w:multiLevelType w:val="multilevel"/>
+    <w:tmpl w:val="C3029BAE"/>
+    <w:lvl w:ilvl="0">
+      <w:start w:val="1"/>
+      <w:numFmt w:val="bullet"/>
+      <w:lvlText w:val=""/>
+      <w:lvlJc w:val="left"/>
+      <w:pPr>
+        <w:tabs>
+          <w:tab w:val="num" w:pos="1440"/>
+        </w:tabs>
+        <w:ind w:left="1440" w:hanging="360"/>
+      </w:pPr>
+      <w:rPr>
+        <w:rFonts w:ascii="Symbol" w:hAnsi="Symbol" w:hint="default"/>
+        <w:sz w:val="20"/>
+      </w:rPr>
+    </w:lvl>
+    <w:lvl w:ilvl="1" w:tentative="1">
+      <w:start w:val="1"/>
+      <w:numFmt w:val="bullet"/>
+      <w:lvlText w:val="o"/>
+      <w:lvlJc w:val="left"/>
+      <w:pPr>
+        <w:tabs>
+          <w:tab w:val="num" w:pos="2160"/>
+        </w:tabs>
+        <w:ind w:left="2160" w:hanging="360"/>
+      </w:pPr>
+      <w:rPr>
+        <w:rFonts w:ascii="Courier New" w:hAnsi="Courier New" w:hint="default"/>
+        <w:sz w:val="20"/>
+      </w:rPr>
+    </w:lvl>
+    <w:lvl w:ilvl="2" w:tentative="1">
+      <w:start w:val="1"/>
+      <w:numFmt w:val="bullet"/>
+      <w:lvlText w:val=""/>
+      <w:lvlJc w:val="left"/>
+      <w:pPr>
+        <w:tabs>
+          <w:tab w:val="num" w:pos="2880"/>
+        </w:tabs>
+        <w:ind w:left="2880" w:hanging="360"/>
+      </w:pPr>
+      <w:rPr>
+        <w:rFonts w:ascii="Wingdings" w:hAnsi="Wingdings" w:hint="default"/>
+        <w:sz w:val="20"/>
+      </w:rPr>
+    </w:lvl>
+    <w:lvl w:ilvl="3" w:tentative="1">
+      <w:start w:val="1"/>
+      <w:numFmt w:val="bullet"/>
+      <w:lvlText w:val=""/>
+      <w:lvlJc w:val="left"/>
+      <w:pPr>
+        <w:tabs>
+          <w:tab w:val="num" w:pos="3600"/>
+        </w:tabs>
+        <w:ind w:left="3600" w:hanging="360"/>
+      </w:pPr>
+      <w:rPr>
+        <w:rFonts w:ascii="Wingdings" w:hAnsi="Wingdings" w:hint="default"/>
+        <w:sz w:val="20"/>
+      </w:rPr>
+    </w:lvl>
+    <w:lvl w:ilvl="4" w:tentative="1">
+      <w:start w:val="1"/>
+      <w:numFmt w:val="bullet"/>
+      <w:lvlText w:val=""/>
+      <w:lvlJc w:val="left"/>
+      <w:pPr>
+        <w:tabs>
+          <w:tab w:val="num" w:pos="4320"/>
+        </w:tabs>
+        <w:ind w:left="4320" w:hanging="360"/>
+      </w:pPr>
+      <w:rPr>
+        <w:rFonts w:ascii="Wingdings" w:hAnsi="Wingdings" w:hint="default"/>
+        <w:sz w:val="20"/>
+      </w:rPr>
+    </w:lvl>
+    <w:lvl w:ilvl="5" w:tentative="1">
+      <w:start w:val="1"/>
+      <w:numFmt w:val="bullet"/>
+      <w:lvlText w:val=""/>
+      <w:lvlJc w:val="left"/>
+      <w:pPr>
+        <w:tabs>
+          <w:tab w:val="num" w:pos="5040"/>
+        </w:tabs>
+        <w:ind w:left="5040" w:hanging="360"/>
+      </w:pPr>
+      <w:rPr>
+        <w:rFonts w:ascii="Wingdings" w:hAnsi="Wingdings" w:hint="default"/>
+        <w:sz w:val="20"/>
+      </w:rPr>
+    </w:lvl>
+    <w:lvl w:ilvl="6" w:tentative="1">
+      <w:start w:val="1"/>
+      <w:numFmt w:val="bullet"/>
+      <w:lvlText w:val=""/>
+      <w:lvlJc w:val="left"/>
+      <w:pPr>
+        <w:tabs>
+          <w:tab w:val="num" w:pos="5760"/>
+        </w:tabs>
+        <w:ind w:left="5760" w:hanging="360"/>
+      </w:pPr>
+      <w:rPr>
+        <w:rFonts w:ascii="Wingdings" w:hAnsi="Wingdings" w:hint="default"/>
+        <w:sz w:val="20"/>
+      </w:rPr>
+    </w:lvl>
+    <w:lvl w:ilvl="7" w:tentative="1">
+      <w:start w:val="1"/>
+      <w:numFmt w:val="bullet"/>
+      <w:lvlText w:val=""/>
+      <w:lvlJc w:val="left"/>
+      <w:pPr>
+        <w:tabs>
+          <w:tab w:val="num" w:pos="6480"/>
+        </w:tabs>
+        <w:ind w:left="6480" w:hanging="360"/>
+      </w:pPr>
+      <w:rPr>
+        <w:rFonts w:ascii="Wingdings" w:hAnsi="Wingdings" w:hint="default"/>
+        <w:sz w:val="20"/>
+      </w:rPr>
+    </w:lvl>
+    <w:lvl w:ilvl="8" w:tentative="1">
+      <w:start w:val="1"/>
+      <w:numFmt w:val="bullet"/>
+      <w:lvlText w:val=""/>
+      <w:lvlJc w:val="left"/>
+      <w:pPr>
+        <w:tabs>
+          <w:tab w:val="num" w:pos="7200"/>
+        </w:tabs>
+        <w:ind w:left="7200" w:hanging="360"/>
+      </w:pPr>
+      <w:rPr>
+        <w:rFonts w:ascii="Wingdings" w:hAnsi="Wingdings" w:hint="default"/>
+        <w:sz w:val="20"/>
+      </w:rPr>
+    </w:lvl>
+  </w:abstractNum>
+  <w:abstractNum w:abstractNumId="10" w15:restartNumberingAfterBreak="0">
+    <w:nsid w:val="74E66EA7"/>
+    <w:multiLevelType w:val="multilevel"/>
+    <w:tmpl w:val="88A0F08A"/>
+    <w:lvl w:ilvl="0">
+      <w:start w:val="1"/>
+      <w:numFmt w:val="bullet"/>
+      <w:lvlText w:val=""/>
+      <w:lvlJc w:val="left"/>
+      <w:pPr>
+        <w:tabs>
+          <w:tab w:val="num" w:pos="1440"/>
+        </w:tabs>
+        <w:ind w:left="1440" w:hanging="360"/>
+      </w:pPr>
+      <w:rPr>
+        <w:rFonts w:ascii="Symbol" w:hAnsi="Symbol" w:hint="default"/>
+        <w:sz w:val="20"/>
+      </w:rPr>
+    </w:lvl>
+    <w:lvl w:ilvl="1" w:tentative="1">
+      <w:start w:val="1"/>
+      <w:numFmt w:val="bullet"/>
+      <w:lvlText w:val="o"/>
+      <w:lvlJc w:val="left"/>
+      <w:pPr>
+        <w:tabs>
+          <w:tab w:val="num" w:pos="2160"/>
+        </w:tabs>
+        <w:ind w:left="2160" w:hanging="360"/>
+      </w:pPr>
+      <w:rPr>
+        <w:rFonts w:ascii="Courier New" w:hAnsi="Courier New" w:hint="default"/>
+        <w:sz w:val="20"/>
+      </w:rPr>
+    </w:lvl>
+    <w:lvl w:ilvl="2" w:tentative="1">
+      <w:start w:val="1"/>
+      <w:numFmt w:val="bullet"/>
+      <w:lvlText w:val=""/>
+      <w:lvlJc w:val="left"/>
+      <w:pPr>
+        <w:tabs>
+          <w:tab w:val="num" w:pos="2880"/>
+        </w:tabs>
+        <w:ind w:left="2880" w:hanging="360"/>
+      </w:pPr>
+      <w:rPr>
+        <w:rFonts w:ascii="Wingdings" w:hAnsi="Wingdings" w:hint="default"/>
+        <w:sz w:val="20"/>
+      </w:rPr>
+    </w:lvl>
+    <w:lvl w:ilvl="3" w:tentative="1">
+      <w:start w:val="1"/>
+      <w:numFmt w:val="bullet"/>
+      <w:lvlText w:val=""/>
+      <w:lvlJc w:val="left"/>
+      <w:pPr>
+        <w:tabs>
+          <w:tab w:val="num" w:pos="3600"/>
+        </w:tabs>
+        <w:ind w:left="3600" w:hanging="360"/>
+      </w:pPr>
+      <w:rPr>
+        <w:rFonts w:ascii="Wingdings" w:hAnsi="Wingdings" w:hint="default"/>
+        <w:sz w:val="20"/>
+      </w:rPr>
+    </w:lvl>
+    <w:lvl w:ilvl="4" w:tentative="1">
+      <w:start w:val="1"/>
+      <w:numFmt w:val="bullet"/>
+      <w:lvlText w:val=""/>
+      <w:lvlJc w:val="left"/>
+      <w:pPr>
+        <w:tabs>
+          <w:tab w:val="num" w:pos="4320"/>
+        </w:tabs>
+        <w:ind w:left="4320" w:hanging="360"/>
+      </w:pPr>
+      <w:rPr>
+        <w:rFonts w:ascii="Wingdings" w:hAnsi="Wingdings" w:hint="default"/>
+        <w:sz w:val="20"/>
+      </w:rPr>
+    </w:lvl>
+    <w:lvl w:ilvl="5" w:tentative="1">
+      <w:start w:val="1"/>
+      <w:numFmt w:val="bullet"/>
+      <w:lvlText w:val=""/>
+      <w:lvlJc w:val="left"/>
+      <w:pPr>
+        <w:tabs>
+          <w:tab w:val="num" w:pos="5040"/>
+        </w:tabs>
+        <w:ind w:left="5040" w:hanging="360"/>
+      </w:pPr>
+      <w:rPr>
+        <w:rFonts w:ascii="Wingdings" w:hAnsi="Wingdings" w:hint="default"/>
+        <w:sz w:val="20"/>
+      </w:rPr>
+    </w:lvl>
+    <w:lvl w:ilvl="6" w:tentative="1">
+      <w:start w:val="1"/>
+      <w:numFmt w:val="bullet"/>
+      <w:lvlText w:val=""/>
+      <w:lvlJc w:val="left"/>
+      <w:pPr>
+        <w:tabs>
+          <w:tab w:val="num" w:pos="5760"/>
+        </w:tabs>
+        <w:ind w:left="5760" w:hanging="360"/>
+      </w:pPr>
+      <w:rPr>
+        <w:rFonts w:ascii="Wingdings" w:hAnsi="Wingdings" w:hint="default"/>
+        <w:sz w:val="20"/>
+      </w:rPr>
+    </w:lvl>
+    <w:lvl w:ilvl="7" w:tentative="1">
+      <w:start w:val="1"/>
+      <w:numFmt w:val="bullet"/>
+      <w:lvlText w:val=""/>
+      <w:lvlJc w:val="left"/>
+      <w:pPr>
+        <w:tabs>
+          <w:tab w:val="num" w:pos="6480"/>
+        </w:tabs>
+        <w:ind w:left="6480" w:hanging="360"/>
+      </w:pPr>
+      <w:rPr>
+        <w:rFonts w:ascii="Wingdings" w:hAnsi="Wingdings" w:hint="default"/>
+        <w:sz w:val="20"/>
+      </w:rPr>
+    </w:lvl>
+    <w:lvl w:ilvl="8" w:tentative="1">
+      <w:start w:val="1"/>
+      <w:numFmt w:val="bullet"/>
+      <w:lvlText w:val=""/>
+      <w:lvlJc w:val="left"/>
+      <w:pPr>
+        <w:tabs>
+          <w:tab w:val="num" w:pos="7200"/>
+        </w:tabs>
+        <w:ind w:left="7200" w:hanging="360"/>
+      </w:pPr>
+      <w:rPr>
+        <w:rFonts w:ascii="Wingdings" w:hAnsi="Wingdings" w:hint="default"/>
+        <w:sz w:val="20"/>
+      </w:rPr>
+    </w:lvl>
+  </w:abstractNum>
+  <w:abstractNum w:abstractNumId="11" w15:restartNumberingAfterBreak="0">
+    <w:nsid w:val="78B45D32"/>
+    <w:multiLevelType w:val="multilevel"/>
+    <w:tmpl w:val="19428030"/>
+    <w:lvl w:ilvl="0">
+      <w:start w:val="1"/>
+      <w:numFmt w:val="bullet"/>
+      <w:lvlText w:val=""/>
+      <w:lvlJc w:val="left"/>
+      <w:pPr>
+        <w:tabs>
+          <w:tab w:val="num" w:pos="1080"/>
+        </w:tabs>
+        <w:ind w:left="1080" w:hanging="360"/>
+      </w:pPr>
+      <w:rPr>
+        <w:rFonts w:ascii="Symbol" w:hAnsi="Symbol" w:hint="default"/>
+        <w:sz w:val="20"/>
+      </w:rPr>
+    </w:lvl>
+    <w:lvl w:ilvl="1" w:tentative="1">
+      <w:start w:val="1"/>
+      <w:numFmt w:val="bullet"/>
+      <w:lvlText w:val="o"/>
+      <w:lvlJc w:val="left"/>
+      <w:pPr>
+        <w:tabs>
+          <w:tab w:val="num" w:pos="1800"/>
+        </w:tabs>
+        <w:ind w:left="1800" w:hanging="360"/>
+      </w:pPr>
+      <w:rPr>
+        <w:rFonts w:ascii="Courier New" w:hAnsi="Courier New" w:hint="default"/>
+        <w:sz w:val="20"/>
+      </w:rPr>
+    </w:lvl>
+    <w:lvl w:ilvl="2" w:tentative="1">
+      <w:start w:val="1"/>
+      <w:numFmt w:val="bullet"/>
+      <w:lvlText w:val=""/>
+      <w:lvlJc w:val="left"/>
+      <w:pPr>
+        <w:tabs>
+          <w:tab w:val="num" w:pos="2520"/>
+        </w:tabs>
+        <w:ind w:left="2520" w:hanging="360"/>
+      </w:pPr>
+      <w:rPr>
+        <w:rFonts w:ascii="Wingdings" w:hAnsi="Wingdings" w:hint="default"/>
+        <w:sz w:val="20"/>
+      </w:rPr>
+    </w:lvl>
+    <w:lvl w:ilvl="3" w:tentative="1">
+      <w:start w:val="1"/>
+      <w:numFmt w:val="bullet"/>
+      <w:lvlText w:val=""/>
+      <w:lvlJc w:val="left"/>
+      <w:pPr>
+        <w:tabs>
+          <w:tab w:val="num" w:pos="3240"/>
+        </w:tabs>
+        <w:ind w:left="3240" w:hanging="360"/>
+      </w:pPr>
+      <w:rPr>
+        <w:rFonts w:ascii="Wingdings" w:hAnsi="Wingdings" w:hint="default"/>
+        <w:sz w:val="20"/>
+      </w:rPr>
+    </w:lvl>
+    <w:lvl w:ilvl="4" w:tentative="1">
+      <w:start w:val="1"/>
+      <w:numFmt w:val="bullet"/>
+      <w:lvlText w:val=""/>
+      <w:lvlJc w:val="left"/>
+      <w:pPr>
+        <w:tabs>
+          <w:tab w:val="num" w:pos="3960"/>
+        </w:tabs>
+        <w:ind w:left="3960" w:hanging="360"/>
+      </w:pPr>
+      <w:rPr>
+        <w:rFonts w:ascii="Wingdings" w:hAnsi="Wingdings" w:hint="default"/>
+        <w:sz w:val="20"/>
+      </w:rPr>
+    </w:lvl>
+    <w:lvl w:ilvl="5" w:tentative="1">
+      <w:start w:val="1"/>
+      <w:numFmt w:val="bullet"/>
+      <w:lvlText w:val=""/>
+      <w:lvlJc w:val="left"/>
+      <w:pPr>
+        <w:tabs>
+          <w:tab w:val="num" w:pos="4680"/>
+        </w:tabs>
+        <w:ind w:left="4680" w:hanging="360"/>
+      </w:pPr>
+      <w:rPr>
+        <w:rFonts w:ascii="Wingdings" w:hAnsi="Wingdings" w:hint="default"/>
+        <w:sz w:val="20"/>
+      </w:rPr>
+    </w:lvl>
+    <w:lvl w:ilvl="6" w:tentative="1">
+      <w:start w:val="1"/>
+      <w:numFmt w:val="bullet"/>
+      <w:lvlText w:val=""/>
+      <w:lvlJc w:val="left"/>
+      <w:pPr>
+        <w:tabs>
+          <w:tab w:val="num" w:pos="5400"/>
+        </w:tabs>
+        <w:ind w:left="5400" w:hanging="360"/>
+      </w:pPr>
+      <w:rPr>
+        <w:rFonts w:ascii="Wingdings" w:hAnsi="Wingdings" w:hint="default"/>
+        <w:sz w:val="20"/>
+      </w:rPr>
+    </w:lvl>
+    <w:lvl w:ilvl="7" w:tentative="1">
+      <w:start w:val="1"/>
+      <w:numFmt w:val="bullet"/>
+      <w:lvlText w:val=""/>
+      <w:lvlJc w:val="left"/>
+      <w:pPr>
+        <w:tabs>
+          <w:tab w:val="num" w:pos="6120"/>
+        </w:tabs>
+        <w:ind w:left="6120" w:hanging="360"/>
+      </w:pPr>
+      <w:rPr>
+        <w:rFonts w:ascii="Wingdings" w:hAnsi="Wingdings" w:hint="default"/>
+        <w:sz w:val="20"/>
+      </w:rPr>
+    </w:lvl>
+    <w:lvl w:ilvl="8" w:tentative="1">
+      <w:start w:val="1"/>
+      <w:numFmt w:val="bullet"/>
+      <w:lvlText w:val=""/>
+      <w:lvlJc w:val="left"/>
+      <w:pPr>
+        <w:tabs>
+          <w:tab w:val="num" w:pos="6840"/>
+        </w:tabs>
+        <w:ind w:left="6840" w:hanging="360"/>
+      </w:pPr>
+      <w:rPr>
+        <w:rFonts w:ascii="Wingdings" w:hAnsi="Wingdings" w:hint="default"/>
+        <w:sz w:val="20"/>
+      </w:rPr>
+    </w:lvl>
+  </w:abstractNum>
+  <w:num w:numId="1" w16cid:durableId="394008686">
+    <w:abstractNumId w:val="11"/>
+  </w:num>
+  <w:num w:numId="2" w16cid:durableId="1240552510">
+    <w:abstractNumId w:val="10"/>
+  </w:num>
+  <w:num w:numId="3" w16cid:durableId="669211974">
+    <w:abstractNumId w:val="1"/>
+  </w:num>
+  <w:num w:numId="4" w16cid:durableId="1805000679">
+    <w:abstractNumId w:val="3"/>
+  </w:num>
+  <w:num w:numId="5" w16cid:durableId="142815469">
+    <w:abstractNumId w:val="2"/>
+  </w:num>
+  <w:num w:numId="6" w16cid:durableId="1123576063">
+    <w:abstractNumId w:val="4"/>
+  </w:num>
+  <w:num w:numId="7" w16cid:durableId="977226698">
+    <w:abstractNumId w:val="8"/>
+  </w:num>
+  <w:num w:numId="8" w16cid:durableId="432015627">
+    <w:abstractNumId w:val="7"/>
+  </w:num>
+  <w:num w:numId="9" w16cid:durableId="493648365">
+    <w:abstractNumId w:val="5"/>
+  </w:num>
+  <w:num w:numId="10" w16cid:durableId="344213054">
+    <w:abstractNumId w:val="6"/>
+  </w:num>
+  <w:num w:numId="11" w16cid:durableId="1998610581">
+    <w:abstractNumId w:val="9"/>
+  </w:num>
+  <w:num w:numId="12" w16cid:durableId="542376058">
+    <w:abstractNumId w:val="0"/>
+  </w:num>
+</w:numbering>
 </file>
 
 <file path=word/styles.xml><?xml version="1.0" encoding="utf-8"?>
@@ -711,7 +3712,6 @@
   <w:style w:type="character" w:default="1" w:styleId="DefaultParagraphFont">
     <w:name w:val="Default Paragraph Font"/>
     <w:uiPriority w:val="1"/>
-    <w:semiHidden/>
     <w:unhideWhenUsed/>
   </w:style>
   <w:style w:type="table" w:default="1" w:styleId="TableNormal">

</xml_diff>

<commit_message>
Edited the User Group doc for readability
</commit_message>
<xml_diff>
--- a/Documents/User Groups & Profiles.docx
+++ b/Documents/User Groups & Profiles.docx
@@ -34,7 +34,6 @@
         <w:t xml:space="preserve"> (Dylan)</w:t>
       </w:r>
     </w:p>
-    <w:p/>
     <w:p>
       <w:pPr>
         <w:pStyle w:val="Heading3"/>
@@ -45,6 +44,17 @@
       </w:r>
       <w:r>
         <w:t xml:space="preserve"> (Dylan)</w:t>
+      </w:r>
+    </w:p>
+    <w:p>
+      <w:pPr>
+        <w:pStyle w:val="Heading2"/>
+      </w:pPr>
+      <w:r>
+        <w:t>User Group Needs, Wants, &amp; Pain Points</w:t>
+      </w:r>
+      <w:r>
+        <w:t xml:space="preserve"> (Calvin)</w:t>
       </w:r>
     </w:p>
     <w:p/>
@@ -53,18 +63,6 @@
         <w:pStyle w:val="Heading2"/>
       </w:pPr>
       <w:r>
-        <w:t>User Group Needs, Wants, &amp; Pain Points</w:t>
-      </w:r>
-      <w:r>
-        <w:t xml:space="preserve"> (Calvin)</w:t>
-      </w:r>
-    </w:p>
-    <w:p/>
-    <w:p>
-      <w:pPr>
-        <w:pStyle w:val="Heading2"/>
-      </w:pPr>
-      <w:r>
         <w:t>Key Behaviors/Needs &amp; Sample Functionalit</w:t>
       </w:r>
       <w:r>
@@ -88,17 +86,11 @@
     </w:p>
     <w:p>
       <w:pPr>
+        <w:pStyle w:val="Heading4"/>
         <w:ind w:firstLine="720"/>
       </w:pPr>
       <w:r>
-        <w:rPr>
-          <w:b/>
-          <w:bCs/>
-        </w:rPr>
-        <w:t>Key Behaviors:</w:t>
-      </w:r>
-      <w:r>
-        <w:t> </w:t>
+        <w:t>Key Behaviors: </w:t>
       </w:r>
     </w:p>
     <w:p>
@@ -197,17 +189,11 @@
     </w:p>
     <w:p>
       <w:pPr>
+        <w:pStyle w:val="Heading4"/>
         <w:ind w:firstLine="720"/>
       </w:pPr>
       <w:r>
-        <w:rPr>
-          <w:b/>
-          <w:bCs/>
-        </w:rPr>
-        <w:t>Key Needs:</w:t>
-      </w:r>
-      <w:r>
-        <w:t> </w:t>
+        <w:t>Key Needs: </w:t>
       </w:r>
     </w:p>
     <w:p>
@@ -320,17 +306,11 @@
     </w:p>
     <w:p>
       <w:pPr>
+        <w:pStyle w:val="Heading4"/>
         <w:ind w:left="360" w:firstLine="360"/>
       </w:pPr>
       <w:r>
-        <w:rPr>
-          <w:b/>
-          <w:bCs/>
-        </w:rPr>
-        <w:t>Sample Functionalities:</w:t>
-      </w:r>
-      <w:r>
-        <w:t> </w:t>
+        <w:t>Sample Functionalities: </w:t>
       </w:r>
     </w:p>
     <w:p>
@@ -512,17 +492,11 @@
     </w:p>
     <w:p>
       <w:pPr>
-        <w:ind w:left="360" w:firstLine="360"/>
-      </w:pPr>
-      <w:r>
-        <w:rPr>
-          <w:b/>
-          <w:bCs/>
-        </w:rPr>
-        <w:t>Key Behaviors:</w:t>
-      </w:r>
-      <w:r>
-        <w:t> </w:t>
+        <w:pStyle w:val="Heading4"/>
+        <w:ind w:firstLine="720"/>
+      </w:pPr>
+      <w:r>
+        <w:t>Key Behaviors: </w:t>
       </w:r>
     </w:p>
     <w:p>
@@ -655,17 +629,11 @@
     </w:p>
     <w:p>
       <w:pPr>
-        <w:ind w:left="360" w:firstLine="360"/>
-      </w:pPr>
-      <w:r>
-        <w:rPr>
-          <w:b/>
-          <w:bCs/>
-        </w:rPr>
-        <w:t>Key Needs:</w:t>
-      </w:r>
-      <w:r>
-        <w:t> </w:t>
+        <w:pStyle w:val="Heading4"/>
+        <w:ind w:firstLine="720"/>
+      </w:pPr>
+      <w:r>
+        <w:t>Key Needs: </w:t>
       </w:r>
     </w:p>
     <w:p>
@@ -798,17 +766,11 @@
     </w:p>
     <w:p>
       <w:pPr>
-        <w:ind w:left="360" w:firstLine="360"/>
-      </w:pPr>
-      <w:r>
-        <w:rPr>
-          <w:b/>
-          <w:bCs/>
-        </w:rPr>
-        <w:t>Sample Functionalities:</w:t>
-      </w:r>
-      <w:r>
-        <w:t> </w:t>
+        <w:pStyle w:val="Heading4"/>
+        <w:ind w:firstLine="720"/>
+      </w:pPr>
+      <w:r>
+        <w:t>Sample Functionalities: </w:t>
       </w:r>
     </w:p>
     <w:p>
@@ -982,17 +944,11 @@
     </w:p>
     <w:p>
       <w:pPr>
+        <w:pStyle w:val="Heading4"/>
         <w:ind w:firstLine="720"/>
       </w:pPr>
       <w:r>
-        <w:rPr>
-          <w:b/>
-          <w:bCs/>
-        </w:rPr>
-        <w:t>Key Behaviors:</w:t>
-      </w:r>
-      <w:r>
-        <w:t> </w:t>
+        <w:t>Key Behaviors: </w:t>
       </w:r>
     </w:p>
     <w:p>
@@ -1138,17 +1094,11 @@
     </w:p>
     <w:p>
       <w:pPr>
-        <w:ind w:left="720"/>
-      </w:pPr>
-      <w:r>
-        <w:rPr>
-          <w:b/>
-          <w:bCs/>
-        </w:rPr>
-        <w:t>Key Needs:</w:t>
-      </w:r>
-      <w:r>
-        <w:t> </w:t>
+        <w:pStyle w:val="Heading4"/>
+        <w:ind w:firstLine="720"/>
+      </w:pPr>
+      <w:r>
+        <w:t>Key Needs: </w:t>
       </w:r>
     </w:p>
     <w:p>
@@ -1281,17 +1231,11 @@
     </w:p>
     <w:p>
       <w:pPr>
-        <w:ind w:left="720"/>
-      </w:pPr>
-      <w:r>
-        <w:rPr>
-          <w:b/>
-          <w:bCs/>
-        </w:rPr>
-        <w:t>Sample Functionalities:</w:t>
-      </w:r>
-      <w:r>
-        <w:t> </w:t>
+        <w:pStyle w:val="Heading4"/>
+        <w:ind w:firstLine="720"/>
+      </w:pPr>
+      <w:r>
+        <w:t>Sample Functionalities: </w:t>
       </w:r>
     </w:p>
     <w:p>
@@ -1477,17 +1421,10 @@
     </w:p>
     <w:p>
       <w:pPr>
+        <w:pStyle w:val="Heading4"/>
         <w:ind w:firstLine="720"/>
-        <w:rPr>
-          <w:b/>
-          <w:bCs/>
-        </w:rPr>
-      </w:pPr>
-      <w:r>
-        <w:rPr>
-          <w:b/>
-          <w:bCs/>
-        </w:rPr>
+      </w:pPr>
+      <w:r>
         <w:t>Demographics</w:t>
       </w:r>
     </w:p>
@@ -1607,17 +1544,10 @@
     <w:p/>
     <w:p>
       <w:pPr>
+        <w:pStyle w:val="Heading4"/>
         <w:ind w:firstLine="720"/>
-        <w:rPr>
-          <w:b/>
-          <w:bCs/>
-        </w:rPr>
-      </w:pPr>
-      <w:r>
-        <w:rPr>
-          <w:b/>
-          <w:bCs/>
-        </w:rPr>
+      </w:pPr>
+      <w:r>
         <w:t>Technology Use</w:t>
       </w:r>
     </w:p>
@@ -1731,17 +1661,10 @@
     <w:p/>
     <w:p>
       <w:pPr>
+        <w:pStyle w:val="Heading4"/>
         <w:ind w:firstLine="720"/>
-        <w:rPr>
-          <w:b/>
-          <w:bCs/>
-        </w:rPr>
-      </w:pPr>
-      <w:r>
-        <w:rPr>
-          <w:b/>
-          <w:bCs/>
-        </w:rPr>
+      </w:pPr>
+      <w:r>
         <w:t>Motivations and Goals</w:t>
       </w:r>
     </w:p>
@@ -1818,17 +1741,10 @@
     <w:p/>
     <w:p>
       <w:pPr>
+        <w:pStyle w:val="Heading4"/>
         <w:ind w:firstLine="720"/>
-        <w:rPr>
-          <w:b/>
-          <w:bCs/>
-        </w:rPr>
-      </w:pPr>
-      <w:r>
-        <w:rPr>
-          <w:b/>
-          <w:bCs/>
-        </w:rPr>
+      </w:pPr>
+      <w:r>
         <w:t>Challenges and Pain Points</w:t>
       </w:r>
     </w:p>
@@ -1930,17 +1846,10 @@
     </w:p>
     <w:p>
       <w:pPr>
+        <w:pStyle w:val="Heading4"/>
         <w:ind w:firstLine="720"/>
-        <w:rPr>
-          <w:b/>
-          <w:bCs/>
-        </w:rPr>
-      </w:pPr>
-      <w:r>
-        <w:rPr>
-          <w:b/>
-          <w:bCs/>
-        </w:rPr>
+      </w:pPr>
+      <w:r>
         <w:t>Demographics</w:t>
       </w:r>
     </w:p>
@@ -2019,17 +1928,10 @@
     <w:p/>
     <w:p>
       <w:pPr>
+        <w:pStyle w:val="Heading4"/>
         <w:ind w:firstLine="720"/>
-        <w:rPr>
-          <w:b/>
-          <w:bCs/>
-        </w:rPr>
-      </w:pPr>
-      <w:r>
-        <w:rPr>
-          <w:b/>
-          <w:bCs/>
-        </w:rPr>
+      </w:pPr>
+      <w:r>
         <w:t>Technology Use</w:t>
       </w:r>
     </w:p>
@@ -2088,17 +1990,11 @@
     <w:p/>
     <w:p>
       <w:pPr>
+        <w:pStyle w:val="Heading4"/>
         <w:ind w:firstLine="720"/>
-        <w:rPr>
-          <w:b/>
-          <w:bCs/>
-        </w:rPr>
-      </w:pPr>
-      <w:r>
-        <w:rPr>
-          <w:b/>
-          <w:bCs/>
-        </w:rPr>
+      </w:pPr>
+      <w:r>
+        <w:lastRenderedPageBreak/>
         <w:t>Motivations and Goals</w:t>
       </w:r>
     </w:p>
@@ -2160,17 +2056,10 @@
     <w:p/>
     <w:p>
       <w:pPr>
+        <w:pStyle w:val="Heading4"/>
         <w:ind w:firstLine="720"/>
-        <w:rPr>
-          <w:b/>
-          <w:bCs/>
-        </w:rPr>
-      </w:pPr>
-      <w:r>
-        <w:rPr>
-          <w:b/>
-          <w:bCs/>
-        </w:rPr>
+      </w:pPr>
+      <w:r>
         <w:t>Challenges and Pain Points</w:t>
       </w:r>
     </w:p>
@@ -2241,17 +2130,10 @@
     </w:p>
     <w:p>
       <w:pPr>
+        <w:pStyle w:val="Heading4"/>
         <w:ind w:firstLine="720"/>
-        <w:rPr>
-          <w:b/>
-          <w:bCs/>
-        </w:rPr>
-      </w:pPr>
-      <w:r>
-        <w:rPr>
-          <w:b/>
-          <w:bCs/>
-        </w:rPr>
+      </w:pPr>
+      <w:r>
         <w:t>Demographics</w:t>
       </w:r>
     </w:p>
@@ -2330,17 +2212,10 @@
     <w:p/>
     <w:p>
       <w:pPr>
+        <w:pStyle w:val="Heading4"/>
         <w:ind w:firstLine="720"/>
-        <w:rPr>
-          <w:b/>
-          <w:bCs/>
-        </w:rPr>
-      </w:pPr>
-      <w:r>
-        <w:rPr>
-          <w:b/>
-          <w:bCs/>
-        </w:rPr>
+      </w:pPr>
+      <w:r>
         <w:t>Technology Use</w:t>
       </w:r>
     </w:p>
@@ -2421,17 +2296,10 @@
     <w:p/>
     <w:p>
       <w:pPr>
+        <w:pStyle w:val="Heading4"/>
         <w:ind w:firstLine="720"/>
-        <w:rPr>
-          <w:b/>
-          <w:bCs/>
-        </w:rPr>
-      </w:pPr>
-      <w:r>
-        <w:rPr>
-          <w:b/>
-          <w:bCs/>
-        </w:rPr>
+      </w:pPr>
+      <w:r>
         <w:t>Motivations and Goals</w:t>
       </w:r>
     </w:p>
@@ -2508,17 +2376,10 @@
     <w:p/>
     <w:p>
       <w:pPr>
-        <w:ind w:left="360" w:firstLine="720"/>
-        <w:rPr>
-          <w:b/>
-          <w:bCs/>
-        </w:rPr>
-      </w:pPr>
-      <w:r>
-        <w:rPr>
-          <w:b/>
-          <w:bCs/>
-        </w:rPr>
+        <w:pStyle w:val="Heading4"/>
+        <w:ind w:firstLine="720"/>
+      </w:pPr>
+      <w:r>
         <w:t>Challenges and Pain Points</w:t>
       </w:r>
     </w:p>
@@ -2606,34 +2467,15 @@
     </w:p>
     <w:p>
       <w:pPr>
-        <w:rPr>
-          <w:b/>
-          <w:bCs/>
-          <w:u w:val="single"/>
-        </w:rPr>
-      </w:pPr>
-      <w:r>
-        <w:rPr>
-          <w:b/>
-          <w:bCs/>
-          <w:u w:val="single"/>
-        </w:rPr>
+        <w:pStyle w:val="Heading3"/>
+      </w:pPr>
+      <w:r>
         <w:t xml:space="preserve">Why We Will Focus on </w:t>
       </w:r>
       <w:r>
-        <w:rPr>
-          <w:b/>
-          <w:bCs/>
-          <w:u w:val="single"/>
-        </w:rPr>
         <w:t>Patient</w:t>
       </w:r>
       <w:r>
-        <w:rPr>
-          <w:b/>
-          <w:bCs/>
-          <w:u w:val="single"/>
-        </w:rPr>
         <w:t xml:space="preserve"> User Experience</w:t>
       </w:r>
     </w:p>
@@ -15337,9 +15179,9 @@
       <w:lvlJc w:val="left"/>
       <w:pPr>
         <w:tabs>
-          <w:tab w:val="num" w:pos="1080"/>
-        </w:tabs>
-        <w:ind w:left="1080" w:hanging="360"/>
+          <w:tab w:val="num" w:pos="1440"/>
+        </w:tabs>
+        <w:ind w:left="1440" w:hanging="360"/>
       </w:pPr>
       <w:rPr>
         <w:rFonts w:ascii="Symbol" w:hAnsi="Symbol" w:hint="default"/>
@@ -15353,9 +15195,9 @@
       <w:lvlJc w:val="left"/>
       <w:pPr>
         <w:tabs>
-          <w:tab w:val="num" w:pos="1800"/>
-        </w:tabs>
-        <w:ind w:left="1800" w:hanging="360"/>
+          <w:tab w:val="num" w:pos="2160"/>
+        </w:tabs>
+        <w:ind w:left="2160" w:hanging="360"/>
       </w:pPr>
       <w:rPr>
         <w:rFonts w:ascii="Courier New" w:hAnsi="Courier New" w:hint="default"/>
@@ -15369,9 +15211,9 @@
       <w:lvlJc w:val="left"/>
       <w:pPr>
         <w:tabs>
-          <w:tab w:val="num" w:pos="2520"/>
-        </w:tabs>
-        <w:ind w:left="2520" w:hanging="360"/>
+          <w:tab w:val="num" w:pos="2880"/>
+        </w:tabs>
+        <w:ind w:left="2880" w:hanging="360"/>
       </w:pPr>
       <w:rPr>
         <w:rFonts w:ascii="Wingdings" w:hAnsi="Wingdings" w:hint="default"/>
@@ -15385,9 +15227,9 @@
       <w:lvlJc w:val="left"/>
       <w:pPr>
         <w:tabs>
-          <w:tab w:val="num" w:pos="3240"/>
-        </w:tabs>
-        <w:ind w:left="3240" w:hanging="360"/>
+          <w:tab w:val="num" w:pos="3600"/>
+        </w:tabs>
+        <w:ind w:left="3600" w:hanging="360"/>
       </w:pPr>
       <w:rPr>
         <w:rFonts w:ascii="Wingdings" w:hAnsi="Wingdings" w:hint="default"/>
@@ -15401,9 +15243,9 @@
       <w:lvlJc w:val="left"/>
       <w:pPr>
         <w:tabs>
-          <w:tab w:val="num" w:pos="3960"/>
-        </w:tabs>
-        <w:ind w:left="3960" w:hanging="360"/>
+          <w:tab w:val="num" w:pos="4320"/>
+        </w:tabs>
+        <w:ind w:left="4320" w:hanging="360"/>
       </w:pPr>
       <w:rPr>
         <w:rFonts w:ascii="Wingdings" w:hAnsi="Wingdings" w:hint="default"/>
@@ -15417,9 +15259,9 @@
       <w:lvlJc w:val="left"/>
       <w:pPr>
         <w:tabs>
-          <w:tab w:val="num" w:pos="4680"/>
-        </w:tabs>
-        <w:ind w:left="4680" w:hanging="360"/>
+          <w:tab w:val="num" w:pos="5040"/>
+        </w:tabs>
+        <w:ind w:left="5040" w:hanging="360"/>
       </w:pPr>
       <w:rPr>
         <w:rFonts w:ascii="Wingdings" w:hAnsi="Wingdings" w:hint="default"/>
@@ -15433,9 +15275,9 @@
       <w:lvlJc w:val="left"/>
       <w:pPr>
         <w:tabs>
-          <w:tab w:val="num" w:pos="5400"/>
-        </w:tabs>
-        <w:ind w:left="5400" w:hanging="360"/>
+          <w:tab w:val="num" w:pos="5760"/>
+        </w:tabs>
+        <w:ind w:left="5760" w:hanging="360"/>
       </w:pPr>
       <w:rPr>
         <w:rFonts w:ascii="Wingdings" w:hAnsi="Wingdings" w:hint="default"/>
@@ -15449,9 +15291,9 @@
       <w:lvlJc w:val="left"/>
       <w:pPr>
         <w:tabs>
-          <w:tab w:val="num" w:pos="6120"/>
-        </w:tabs>
-        <w:ind w:left="6120" w:hanging="360"/>
+          <w:tab w:val="num" w:pos="6480"/>
+        </w:tabs>
+        <w:ind w:left="6480" w:hanging="360"/>
       </w:pPr>
       <w:rPr>
         <w:rFonts w:ascii="Wingdings" w:hAnsi="Wingdings" w:hint="default"/>
@@ -15465,9 +15307,9 @@
       <w:lvlJc w:val="left"/>
       <w:pPr>
         <w:tabs>
-          <w:tab w:val="num" w:pos="6840"/>
-        </w:tabs>
-        <w:ind w:left="6840" w:hanging="360"/>
+          <w:tab w:val="num" w:pos="7200"/>
+        </w:tabs>
+        <w:ind w:left="7200" w:hanging="360"/>
       </w:pPr>
       <w:rPr>
         <w:rFonts w:ascii="Wingdings" w:hAnsi="Wingdings" w:hint="default"/>
@@ -16512,7 +16354,6 @@
     <w:next w:val="Normal"/>
     <w:link w:val="Heading4Char"/>
     <w:uiPriority w:val="9"/>
-    <w:semiHidden/>
     <w:unhideWhenUsed/>
     <w:qFormat/>
     <w:rsid w:val="00B00C87"/>
@@ -16641,6 +16482,7 @@
   <w:style w:type="character" w:default="1" w:styleId="DefaultParagraphFont">
     <w:name w:val="Default Paragraph Font"/>
     <w:uiPriority w:val="1"/>
+    <w:semiHidden/>
     <w:unhideWhenUsed/>
   </w:style>
   <w:style w:type="table" w:default="1" w:styleId="TableNormal">
@@ -16708,7 +16550,6 @@
     <w:basedOn w:val="DefaultParagraphFont"/>
     <w:link w:val="Heading4"/>
     <w:uiPriority w:val="9"/>
-    <w:semiHidden/>
     <w:rsid w:val="00B00C87"/>
     <w:rPr>
       <w:rFonts w:eastAsiaTheme="majorEastAsia" w:cstheme="majorBidi"/>

</xml_diff>

<commit_message>
Added Dylan's Part to the User Group Document
</commit_message>
<xml_diff>
--- a/Documents/User Groups & Profiles.docx
+++ b/Documents/User Groups & Profiles.docx
@@ -31,21 +31,248 @@
         <w:t>Description of User Groups</w:t>
       </w:r>
       <w:r>
-        <w:t xml:space="preserve"> (Dylan)</w:t>
+        <w:t xml:space="preserve"> </w:t>
+      </w:r>
+      <w:r>
+        <w:t>&amp; Subgroups</w:t>
+      </w:r>
+      <w:r>
+        <w:t>(Dylan)</w:t>
       </w:r>
     </w:p>
     <w:p>
       <w:pPr>
         <w:pStyle w:val="Heading3"/>
+        <w:ind w:firstLine="360"/>
+      </w:pPr>
+      <w:r>
+        <w:t>1) Pet Owners</w:t>
+      </w:r>
+    </w:p>
+    <w:p>
+      <w:pPr>
+        <w:ind w:left="720"/>
+      </w:pPr>
+      <w:r>
+        <w:t>Pet owners are the primary clients of the clinic who schedule appointments and complete pre-visit forms for their pets. They depend on a system that is easy to use, saves time, and ensures their pet’s information is accurately recorded before arrival. A smooth scheduling and check-in process reduces stress and improves their overall experience with the clinic.</w:t>
+      </w:r>
+    </w:p>
+    <w:p>
+      <w:pPr>
+        <w:pStyle w:val="Heading4"/>
         <w:ind w:firstLine="720"/>
       </w:pPr>
       <w:r>
-        <w:t>Subgroups</w:t>
-      </w:r>
-      <w:r>
-        <w:t xml:space="preserve"> (Dylan)</w:t>
-      </w:r>
-    </w:p>
+        <w:t>Subgroups Identified:</w:t>
+      </w:r>
+    </w:p>
+    <w:p>
+      <w:pPr>
+        <w:numPr>
+          <w:ilvl w:val="0"/>
+          <w:numId w:val="89"/>
+        </w:numPr>
+        <w:tabs>
+          <w:tab w:val="clear" w:pos="1440"/>
+          <w:tab w:val="num" w:pos="720"/>
+        </w:tabs>
+      </w:pPr>
+      <w:r>
+        <w:rPr>
+          <w:b/>
+          <w:bCs/>
+        </w:rPr>
+        <w:t>New Clients:</w:t>
+      </w:r>
+      <w:r>
+        <w:t xml:space="preserve"> First-time visitors who must create accounts and provide complete pet and contact information before their appointment.</w:t>
+      </w:r>
+    </w:p>
+    <w:p>
+      <w:pPr>
+        <w:numPr>
+          <w:ilvl w:val="0"/>
+          <w:numId w:val="89"/>
+        </w:numPr>
+        <w:tabs>
+          <w:tab w:val="clear" w:pos="1440"/>
+          <w:tab w:val="num" w:pos="720"/>
+        </w:tabs>
+      </w:pPr>
+      <w:r>
+        <w:rPr>
+          <w:b/>
+          <w:bCs/>
+        </w:rPr>
+        <w:t>Returning Clients:</w:t>
+      </w:r>
+      <w:r>
+        <w:t xml:space="preserve"> Existing clients whose information is already on file and who benefit from faster scheduling and streamlined check-in.</w:t>
+      </w:r>
+    </w:p>
+    <w:p>
+      <w:pPr>
+        <w:numPr>
+          <w:ilvl w:val="0"/>
+          <w:numId w:val="89"/>
+        </w:numPr>
+        <w:tabs>
+          <w:tab w:val="clear" w:pos="1440"/>
+          <w:tab w:val="num" w:pos="720"/>
+        </w:tabs>
+      </w:pPr>
+      <w:r>
+        <w:rPr>
+          <w:b/>
+          <w:bCs/>
+        </w:rPr>
+        <w:t>Multi-Pet Owners:</w:t>
+      </w:r>
+      <w:r>
+        <w:t xml:space="preserve"> Clients who manage appointments and medical records for multiple pets and need an efficient way to organize each animal’s information.</w:t>
+      </w:r>
+    </w:p>
+    <w:p>
+      <w:pPr>
+        <w:pStyle w:val="Heading3"/>
+        <w:ind w:firstLine="360"/>
+      </w:pPr>
+      <w:r>
+        <w:t>2) Front Desk Staff</w:t>
+      </w:r>
+    </w:p>
+    <w:p>
+      <w:pPr>
+        <w:ind w:left="720"/>
+      </w:pPr>
+      <w:r>
+        <w:t>Front desk staff are administrative team members responsible for managing appointments, handling client communications, and overseeing the check-in process. They serve as the first point of contact for clients and play a key role in maintaining an organized, efficient daily schedule. Their effectiveness depends on having clear access to appointment details, client records, and completed forms.</w:t>
+      </w:r>
+    </w:p>
+    <w:p>
+      <w:pPr>
+        <w:pStyle w:val="Heading4"/>
+        <w:ind w:firstLine="720"/>
+      </w:pPr>
+      <w:r>
+        <w:t>Subgroups Identified:</w:t>
+      </w:r>
+    </w:p>
+    <w:p>
+      <w:pPr>
+        <w:numPr>
+          <w:ilvl w:val="0"/>
+          <w:numId w:val="90"/>
+        </w:numPr>
+        <w:tabs>
+          <w:tab w:val="clear" w:pos="1440"/>
+          <w:tab w:val="num" w:pos="720"/>
+        </w:tabs>
+      </w:pPr>
+      <w:r>
+        <w:rPr>
+          <w:b/>
+          <w:bCs/>
+        </w:rPr>
+        <w:t>Receptionists:</w:t>
+      </w:r>
+      <w:r>
+        <w:t xml:space="preserve"> Staff members who greet clients, answer calls, confirm appointments, and manage in-person check-ins.</w:t>
+      </w:r>
+    </w:p>
+    <w:p>
+      <w:pPr>
+        <w:numPr>
+          <w:ilvl w:val="0"/>
+          <w:numId w:val="90"/>
+        </w:numPr>
+        <w:tabs>
+          <w:tab w:val="clear" w:pos="1440"/>
+          <w:tab w:val="num" w:pos="720"/>
+        </w:tabs>
+      </w:pPr>
+      <w:r>
+        <w:rPr>
+          <w:b/>
+          <w:bCs/>
+        </w:rPr>
+        <w:t>Appointment Schedulers:</w:t>
+      </w:r>
+      <w:r>
+        <w:t xml:space="preserve"> Staff members who focus on booking, rescheduling, and coordinating appointments to maximize clinic efficiency.</w:t>
+      </w:r>
+    </w:p>
+    <w:p>
+      <w:pPr>
+        <w:pStyle w:val="Heading3"/>
+        <w:ind w:firstLine="360"/>
+      </w:pPr>
+      <w:r>
+        <w:t>3) Veterinary Technicians</w:t>
+      </w:r>
+    </w:p>
+    <w:p>
+      <w:pPr>
+        <w:ind w:left="720"/>
+      </w:pPr>
+      <w:r>
+        <w:t>Veterinary technicians are clinical staff who prepare for and assist during patient visits by reviewing forms, gathering patient history, and supporting the veterinarian during examinations. They rely on accurate, complete information to ensure each appointment runs smoothly and efficiently. Their role bridges administrative preparation and hands-on patient care.</w:t>
+      </w:r>
+    </w:p>
+    <w:p>
+      <w:pPr>
+        <w:pStyle w:val="Heading4"/>
+        <w:ind w:firstLine="720"/>
+      </w:pPr>
+      <w:r>
+        <w:t>Subgroups Identified:</w:t>
+      </w:r>
+    </w:p>
+    <w:p>
+      <w:pPr>
+        <w:numPr>
+          <w:ilvl w:val="0"/>
+          <w:numId w:val="91"/>
+        </w:numPr>
+        <w:tabs>
+          <w:tab w:val="clear" w:pos="1440"/>
+          <w:tab w:val="num" w:pos="720"/>
+        </w:tabs>
+      </w:pPr>
+      <w:r>
+        <w:rPr>
+          <w:b/>
+          <w:bCs/>
+        </w:rPr>
+        <w:t>Intake Techs:</w:t>
+      </w:r>
+      <w:r>
+        <w:t xml:space="preserve"> Technicians who review pre-visit forms, verify medical history, and collect initial patient information before the exam.</w:t>
+      </w:r>
+    </w:p>
+    <w:p>
+      <w:pPr>
+        <w:numPr>
+          <w:ilvl w:val="0"/>
+          <w:numId w:val="91"/>
+        </w:numPr>
+        <w:tabs>
+          <w:tab w:val="clear" w:pos="1440"/>
+          <w:tab w:val="num" w:pos="720"/>
+        </w:tabs>
+      </w:pPr>
+      <w:r>
+        <w:rPr>
+          <w:b/>
+          <w:bCs/>
+        </w:rPr>
+        <w:t>Exam/Prep Techs:</w:t>
+      </w:r>
+      <w:r>
+        <w:t xml:space="preserve"> Technicians who prepare exam rooms, assist during procedures, and support the veterinarian throughout the visit.</w:t>
+      </w:r>
+    </w:p>
+    <w:p/>
     <w:p>
       <w:pPr>
         <w:pStyle w:val="Heading2"/>
@@ -113,13 +340,8 @@
         </w:numPr>
         <w:ind w:left="1440"/>
       </w:pPr>
-      <w:proofErr w:type="gramStart"/>
-      <w:r>
-        <w:t>Contacts</w:t>
-      </w:r>
-      <w:proofErr w:type="gramEnd"/>
-      <w:r>
-        <w:t xml:space="preserve"> the clinic with questions </w:t>
+      <w:r>
+        <w:t>Contacts the clinic with questions </w:t>
       </w:r>
     </w:p>
     <w:p>
@@ -130,13 +352,8 @@
         </w:numPr>
         <w:ind w:left="1440"/>
       </w:pPr>
-      <w:proofErr w:type="gramStart"/>
-      <w:r>
-        <w:t>Reviews</w:t>
-      </w:r>
-      <w:proofErr w:type="gramEnd"/>
-      <w:r>
-        <w:t xml:space="preserve"> treatment plans and cost estimates </w:t>
+      <w:r>
+        <w:t>Reviews treatment plans and cost estimates </w:t>
       </w:r>
     </w:p>
     <w:p>
@@ -454,15 +671,7 @@
         <w:ind w:left="1440"/>
       </w:pPr>
       <w:r>
-        <w:t xml:space="preserve">Online </w:t>
-      </w:r>
-      <w:proofErr w:type="gramStart"/>
-      <w:r>
-        <w:t>bill</w:t>
-      </w:r>
-      <w:proofErr w:type="gramEnd"/>
-      <w:r>
-        <w:t xml:space="preserve"> pay and stored payment methods. </w:t>
+        <w:t>Online bill pay and stored payment methods. </w:t>
       </w:r>
     </w:p>
     <w:p>
@@ -713,6 +922,7 @@
         <w:ind w:left="1440"/>
       </w:pPr>
       <w:r>
+        <w:lastRenderedPageBreak/>
         <w:t>Reliable inventory availability. </w:t>
       </w:r>
     </w:p>
@@ -1012,15 +1222,7 @@
         <w:ind w:left="1440"/>
       </w:pPr>
       <w:r>
-        <w:t xml:space="preserve">Processes payments and </w:t>
-      </w:r>
-      <w:proofErr w:type="gramStart"/>
-      <w:r>
-        <w:t>prints</w:t>
-      </w:r>
-      <w:proofErr w:type="gramEnd"/>
-      <w:r>
-        <w:t xml:space="preserve"> invoices. </w:t>
+        <w:t>Processes payments and prints invoices. </w:t>
       </w:r>
     </w:p>
     <w:p>
@@ -1035,13 +1237,8 @@
         </w:tabs>
         <w:ind w:left="1440"/>
       </w:pPr>
-      <w:proofErr w:type="gramStart"/>
-      <w:r>
-        <w:t>Sends</w:t>
-      </w:r>
-      <w:proofErr w:type="gramEnd"/>
-      <w:r>
-        <w:t xml:space="preserve"> reminders and follow-ups. </w:t>
+      <w:r>
+        <w:t>Sends reminders and follow-ups. </w:t>
       </w:r>
     </w:p>
     <w:p>
@@ -1098,6 +1295,7 @@
         <w:ind w:firstLine="720"/>
       </w:pPr>
       <w:r>
+        <w:lastRenderedPageBreak/>
         <w:t>Key Needs: </w:t>
       </w:r>
     </w:p>
@@ -1485,6 +1683,7 @@
           <w:b/>
           <w:bCs/>
         </w:rPr>
+        <w:lastRenderedPageBreak/>
         <w:t>Location:</w:t>
       </w:r>
       <w:r>
@@ -1509,15 +1708,7 @@
         <w:t>Occupation:</w:t>
       </w:r>
       <w:r>
-        <w:t xml:space="preserve"> </w:t>
-      </w:r>
-      <w:proofErr w:type="gramStart"/>
-      <w:r>
-        <w:t>Working</w:t>
-      </w:r>
-      <w:proofErr w:type="gramEnd"/>
-      <w:r>
-        <w:t xml:space="preserve"> adult, student, parent, or retired</w:t>
+        <w:t xml:space="preserve"> Working adult, student, parent, or retired</w:t>
       </w:r>
     </w:p>
     <w:p>
@@ -1561,13 +1752,8 @@
           <w:tab w:val="num" w:pos="720"/>
         </w:tabs>
       </w:pPr>
-      <w:proofErr w:type="gramStart"/>
-      <w:r>
-        <w:t>Uses</w:t>
-      </w:r>
-      <w:proofErr w:type="gramEnd"/>
-      <w:r>
-        <w:t xml:space="preserve"> smartphone the most</w:t>
+      <w:r>
+        <w:t>Uses smartphone the most</w:t>
       </w:r>
     </w:p>
     <w:p>
@@ -1580,21 +1766,8 @@
           <w:tab w:val="num" w:pos="720"/>
         </w:tabs>
       </w:pPr>
-      <w:proofErr w:type="gramStart"/>
-      <w:r>
-        <w:t>Sometimes</w:t>
-      </w:r>
-      <w:proofErr w:type="gramEnd"/>
-      <w:r>
-        <w:t xml:space="preserve"> </w:t>
-      </w:r>
-      <w:proofErr w:type="gramStart"/>
-      <w:r>
-        <w:t>uses</w:t>
-      </w:r>
-      <w:proofErr w:type="gramEnd"/>
-      <w:r>
-        <w:t xml:space="preserve"> a laptop to book appointments</w:t>
+      <w:r>
+        <w:t>Sometimes uses a laptop to book appointments</w:t>
       </w:r>
     </w:p>
     <w:p>
@@ -1649,13 +1822,8 @@
           <w:tab w:val="num" w:pos="720"/>
         </w:tabs>
       </w:pPr>
-      <w:proofErr w:type="gramStart"/>
-      <w:r>
-        <w:t>Likes</w:t>
-      </w:r>
-      <w:proofErr w:type="gramEnd"/>
-      <w:r>
-        <w:t xml:space="preserve"> clear buttons and simple steps</w:t>
+      <w:r>
+        <w:t>Likes clear buttons and simple steps</w:t>
       </w:r>
     </w:p>
     <w:p/>
@@ -1814,13 +1982,8 @@
           <w:tab w:val="num" w:pos="720"/>
         </w:tabs>
       </w:pPr>
-      <w:proofErr w:type="gramStart"/>
-      <w:r>
-        <w:t>Website not working</w:t>
-      </w:r>
-      <w:proofErr w:type="gramEnd"/>
-      <w:r>
-        <w:t xml:space="preserve"> well on phone</w:t>
+      <w:r>
+        <w:t>Website not working well on phone</w:t>
       </w:r>
     </w:p>
     <w:p>
@@ -1841,6 +2004,7 @@
         <w:ind w:firstLine="360"/>
       </w:pPr>
       <w:r>
+        <w:lastRenderedPageBreak/>
         <w:t>Veterinary Technician</w:t>
       </w:r>
     </w:p>
@@ -1976,15 +2140,7 @@
         </w:numPr>
       </w:pPr>
       <w:r>
-        <w:t xml:space="preserve">Sometimes answers </w:t>
-      </w:r>
-      <w:proofErr w:type="gramStart"/>
-      <w:r>
-        <w:t>calls</w:t>
-      </w:r>
-      <w:proofErr w:type="gramEnd"/>
-      <w:r>
-        <w:t xml:space="preserve"> about bookings</w:t>
+        <w:t>Sometimes answers calls about bookings</w:t>
       </w:r>
     </w:p>
     <w:p/>
@@ -1994,7 +2150,6 @@
         <w:ind w:firstLine="720"/>
       </w:pPr>
       <w:r>
-        <w:lastRenderedPageBreak/>
         <w:t>Motivations and Goals</w:t>
       </w:r>
     </w:p>
@@ -2125,6 +2280,7 @@
         <w:ind w:firstLine="360"/>
       </w:pPr>
       <w:r>
+        <w:lastRenderedPageBreak/>
         <w:t>Front-End Staff (Reception)</w:t>
       </w:r>
     </w:p>
@@ -2229,21 +2385,8 @@
           <w:tab w:val="num" w:pos="720"/>
         </w:tabs>
       </w:pPr>
-      <w:proofErr w:type="gramStart"/>
-      <w:r>
-        <w:t>Uses</w:t>
-      </w:r>
-      <w:proofErr w:type="gramEnd"/>
-      <w:r>
-        <w:t xml:space="preserve"> office </w:t>
-      </w:r>
-      <w:proofErr w:type="gramStart"/>
-      <w:r>
-        <w:t>computer</w:t>
-      </w:r>
-      <w:proofErr w:type="gramEnd"/>
-      <w:r>
-        <w:t xml:space="preserve"> all day</w:t>
+      <w:r>
+        <w:t>Uses office computer all day</w:t>
       </w:r>
     </w:p>
     <w:p>
@@ -2284,13 +2427,8 @@
           <w:tab w:val="num" w:pos="720"/>
         </w:tabs>
       </w:pPr>
-      <w:proofErr w:type="gramStart"/>
-      <w:r>
-        <w:t>Sends</w:t>
-      </w:r>
-      <w:proofErr w:type="gramEnd"/>
-      <w:r>
-        <w:t xml:space="preserve"> reminder emails or texts</w:t>
+      <w:r>
+        <w:t>Sends reminder emails or texts</w:t>
       </w:r>
     </w:p>
     <w:p/>
@@ -2459,6 +2597,7 @@
         <w:pStyle w:val="Heading2"/>
       </w:pPr>
       <w:r>
+        <w:lastRenderedPageBreak/>
         <w:t>Group Priorities &amp; Why</w:t>
       </w:r>
       <w:r>
@@ -6229,6 +6368,155 @@
     </w:lvl>
   </w:abstractNum>
   <w:abstractNum w:abstractNumId="25" w15:restartNumberingAfterBreak="0">
+    <w:nsid w:val="23594E41"/>
+    <w:multiLevelType w:val="multilevel"/>
+    <w:tmpl w:val="B80E67CC"/>
+    <w:lvl w:ilvl="0">
+      <w:start w:val="1"/>
+      <w:numFmt w:val="bullet"/>
+      <w:lvlText w:val=""/>
+      <w:lvlJc w:val="left"/>
+      <w:pPr>
+        <w:tabs>
+          <w:tab w:val="num" w:pos="1440"/>
+        </w:tabs>
+        <w:ind w:left="1440" w:hanging="360"/>
+      </w:pPr>
+      <w:rPr>
+        <w:rFonts w:ascii="Symbol" w:hAnsi="Symbol" w:hint="default"/>
+        <w:sz w:val="20"/>
+      </w:rPr>
+    </w:lvl>
+    <w:lvl w:ilvl="1" w:tentative="1">
+      <w:start w:val="1"/>
+      <w:numFmt w:val="bullet"/>
+      <w:lvlText w:val="o"/>
+      <w:lvlJc w:val="left"/>
+      <w:pPr>
+        <w:tabs>
+          <w:tab w:val="num" w:pos="2160"/>
+        </w:tabs>
+        <w:ind w:left="2160" w:hanging="360"/>
+      </w:pPr>
+      <w:rPr>
+        <w:rFonts w:ascii="Courier New" w:hAnsi="Courier New" w:hint="default"/>
+        <w:sz w:val="20"/>
+      </w:rPr>
+    </w:lvl>
+    <w:lvl w:ilvl="2" w:tentative="1">
+      <w:start w:val="1"/>
+      <w:numFmt w:val="bullet"/>
+      <w:lvlText w:val=""/>
+      <w:lvlJc w:val="left"/>
+      <w:pPr>
+        <w:tabs>
+          <w:tab w:val="num" w:pos="2880"/>
+        </w:tabs>
+        <w:ind w:left="2880" w:hanging="360"/>
+      </w:pPr>
+      <w:rPr>
+        <w:rFonts w:ascii="Wingdings" w:hAnsi="Wingdings" w:hint="default"/>
+        <w:sz w:val="20"/>
+      </w:rPr>
+    </w:lvl>
+    <w:lvl w:ilvl="3" w:tentative="1">
+      <w:start w:val="1"/>
+      <w:numFmt w:val="bullet"/>
+      <w:lvlText w:val=""/>
+      <w:lvlJc w:val="left"/>
+      <w:pPr>
+        <w:tabs>
+          <w:tab w:val="num" w:pos="3600"/>
+        </w:tabs>
+        <w:ind w:left="3600" w:hanging="360"/>
+      </w:pPr>
+      <w:rPr>
+        <w:rFonts w:ascii="Wingdings" w:hAnsi="Wingdings" w:hint="default"/>
+        <w:sz w:val="20"/>
+      </w:rPr>
+    </w:lvl>
+    <w:lvl w:ilvl="4" w:tentative="1">
+      <w:start w:val="1"/>
+      <w:numFmt w:val="bullet"/>
+      <w:lvlText w:val=""/>
+      <w:lvlJc w:val="left"/>
+      <w:pPr>
+        <w:tabs>
+          <w:tab w:val="num" w:pos="4320"/>
+        </w:tabs>
+        <w:ind w:left="4320" w:hanging="360"/>
+      </w:pPr>
+      <w:rPr>
+        <w:rFonts w:ascii="Wingdings" w:hAnsi="Wingdings" w:hint="default"/>
+        <w:sz w:val="20"/>
+      </w:rPr>
+    </w:lvl>
+    <w:lvl w:ilvl="5" w:tentative="1">
+      <w:start w:val="1"/>
+      <w:numFmt w:val="bullet"/>
+      <w:lvlText w:val=""/>
+      <w:lvlJc w:val="left"/>
+      <w:pPr>
+        <w:tabs>
+          <w:tab w:val="num" w:pos="5040"/>
+        </w:tabs>
+        <w:ind w:left="5040" w:hanging="360"/>
+      </w:pPr>
+      <w:rPr>
+        <w:rFonts w:ascii="Wingdings" w:hAnsi="Wingdings" w:hint="default"/>
+        <w:sz w:val="20"/>
+      </w:rPr>
+    </w:lvl>
+    <w:lvl w:ilvl="6" w:tentative="1">
+      <w:start w:val="1"/>
+      <w:numFmt w:val="bullet"/>
+      <w:lvlText w:val=""/>
+      <w:lvlJc w:val="left"/>
+      <w:pPr>
+        <w:tabs>
+          <w:tab w:val="num" w:pos="5760"/>
+        </w:tabs>
+        <w:ind w:left="5760" w:hanging="360"/>
+      </w:pPr>
+      <w:rPr>
+        <w:rFonts w:ascii="Wingdings" w:hAnsi="Wingdings" w:hint="default"/>
+        <w:sz w:val="20"/>
+      </w:rPr>
+    </w:lvl>
+    <w:lvl w:ilvl="7" w:tentative="1">
+      <w:start w:val="1"/>
+      <w:numFmt w:val="bullet"/>
+      <w:lvlText w:val=""/>
+      <w:lvlJc w:val="left"/>
+      <w:pPr>
+        <w:tabs>
+          <w:tab w:val="num" w:pos="6480"/>
+        </w:tabs>
+        <w:ind w:left="6480" w:hanging="360"/>
+      </w:pPr>
+      <w:rPr>
+        <w:rFonts w:ascii="Wingdings" w:hAnsi="Wingdings" w:hint="default"/>
+        <w:sz w:val="20"/>
+      </w:rPr>
+    </w:lvl>
+    <w:lvl w:ilvl="8" w:tentative="1">
+      <w:start w:val="1"/>
+      <w:numFmt w:val="bullet"/>
+      <w:lvlText w:val=""/>
+      <w:lvlJc w:val="left"/>
+      <w:pPr>
+        <w:tabs>
+          <w:tab w:val="num" w:pos="7200"/>
+        </w:tabs>
+        <w:ind w:left="7200" w:hanging="360"/>
+      </w:pPr>
+      <w:rPr>
+        <w:rFonts w:ascii="Wingdings" w:hAnsi="Wingdings" w:hint="default"/>
+        <w:sz w:val="20"/>
+      </w:rPr>
+    </w:lvl>
+  </w:abstractNum>
+  <w:abstractNum w:abstractNumId="26" w15:restartNumberingAfterBreak="0">
     <w:nsid w:val="24DC3D27"/>
     <w:multiLevelType w:val="multilevel"/>
     <w:tmpl w:val="8B662A14"/>
@@ -6377,7 +6665,7 @@
       </w:rPr>
     </w:lvl>
   </w:abstractNum>
-  <w:abstractNum w:abstractNumId="26" w15:restartNumberingAfterBreak="0">
+  <w:abstractNum w:abstractNumId="27" w15:restartNumberingAfterBreak="0">
     <w:nsid w:val="283F26A2"/>
     <w:multiLevelType w:val="multilevel"/>
     <w:tmpl w:val="A4749BDA"/>
@@ -6526,7 +6814,7 @@
       </w:rPr>
     </w:lvl>
   </w:abstractNum>
-  <w:abstractNum w:abstractNumId="27" w15:restartNumberingAfterBreak="0">
+  <w:abstractNum w:abstractNumId="28" w15:restartNumberingAfterBreak="0">
     <w:nsid w:val="2A2B0184"/>
     <w:multiLevelType w:val="multilevel"/>
     <w:tmpl w:val="97E24718"/>
@@ -6675,7 +6963,7 @@
       </w:rPr>
     </w:lvl>
   </w:abstractNum>
-  <w:abstractNum w:abstractNumId="28" w15:restartNumberingAfterBreak="0">
+  <w:abstractNum w:abstractNumId="29" w15:restartNumberingAfterBreak="0">
     <w:nsid w:val="2B8E22D2"/>
     <w:multiLevelType w:val="multilevel"/>
     <w:tmpl w:val="01240506"/>
@@ -6824,7 +7112,7 @@
       </w:rPr>
     </w:lvl>
   </w:abstractNum>
-  <w:abstractNum w:abstractNumId="29" w15:restartNumberingAfterBreak="0">
+  <w:abstractNum w:abstractNumId="30" w15:restartNumberingAfterBreak="0">
     <w:nsid w:val="2CB44174"/>
     <w:multiLevelType w:val="multilevel"/>
     <w:tmpl w:val="9FF293B2"/>
@@ -6973,7 +7261,7 @@
       </w:rPr>
     </w:lvl>
   </w:abstractNum>
-  <w:abstractNum w:abstractNumId="30" w15:restartNumberingAfterBreak="0">
+  <w:abstractNum w:abstractNumId="31" w15:restartNumberingAfterBreak="0">
     <w:nsid w:val="2DD33811"/>
     <w:multiLevelType w:val="multilevel"/>
     <w:tmpl w:val="20C0B47A"/>
@@ -7122,7 +7410,7 @@
       </w:rPr>
     </w:lvl>
   </w:abstractNum>
-  <w:abstractNum w:abstractNumId="31" w15:restartNumberingAfterBreak="0">
+  <w:abstractNum w:abstractNumId="32" w15:restartNumberingAfterBreak="0">
     <w:nsid w:val="2EF07BF8"/>
     <w:multiLevelType w:val="multilevel"/>
     <w:tmpl w:val="57001F12"/>
@@ -7271,7 +7559,7 @@
       </w:rPr>
     </w:lvl>
   </w:abstractNum>
-  <w:abstractNum w:abstractNumId="32" w15:restartNumberingAfterBreak="0">
+  <w:abstractNum w:abstractNumId="33" w15:restartNumberingAfterBreak="0">
     <w:nsid w:val="34765DBB"/>
     <w:multiLevelType w:val="multilevel"/>
     <w:tmpl w:val="0DCCCE40"/>
@@ -7420,7 +7708,7 @@
       </w:rPr>
     </w:lvl>
   </w:abstractNum>
-  <w:abstractNum w:abstractNumId="33" w15:restartNumberingAfterBreak="0">
+  <w:abstractNum w:abstractNumId="34" w15:restartNumberingAfterBreak="0">
     <w:nsid w:val="34E02762"/>
     <w:multiLevelType w:val="multilevel"/>
     <w:tmpl w:val="1A347D38"/>
@@ -7569,7 +7857,7 @@
       </w:rPr>
     </w:lvl>
   </w:abstractNum>
-  <w:abstractNum w:abstractNumId="34" w15:restartNumberingAfterBreak="0">
+  <w:abstractNum w:abstractNumId="35" w15:restartNumberingAfterBreak="0">
     <w:nsid w:val="36D24C11"/>
     <w:multiLevelType w:val="multilevel"/>
     <w:tmpl w:val="EC783EDC"/>
@@ -7718,7 +8006,7 @@
       </w:rPr>
     </w:lvl>
   </w:abstractNum>
-  <w:abstractNum w:abstractNumId="35" w15:restartNumberingAfterBreak="0">
+  <w:abstractNum w:abstractNumId="36" w15:restartNumberingAfterBreak="0">
     <w:nsid w:val="372C6024"/>
     <w:multiLevelType w:val="multilevel"/>
     <w:tmpl w:val="208C128A"/>
@@ -7867,7 +8155,7 @@
       </w:rPr>
     </w:lvl>
   </w:abstractNum>
-  <w:abstractNum w:abstractNumId="36" w15:restartNumberingAfterBreak="0">
+  <w:abstractNum w:abstractNumId="37" w15:restartNumberingAfterBreak="0">
     <w:nsid w:val="38E313C7"/>
     <w:multiLevelType w:val="multilevel"/>
     <w:tmpl w:val="F35A4EBA"/>
@@ -8016,7 +8304,7 @@
       </w:rPr>
     </w:lvl>
   </w:abstractNum>
-  <w:abstractNum w:abstractNumId="37" w15:restartNumberingAfterBreak="0">
+  <w:abstractNum w:abstractNumId="38" w15:restartNumberingAfterBreak="0">
     <w:nsid w:val="392615D2"/>
     <w:multiLevelType w:val="multilevel"/>
     <w:tmpl w:val="AC9C6AD0"/>
@@ -8165,7 +8453,7 @@
       </w:rPr>
     </w:lvl>
   </w:abstractNum>
-  <w:abstractNum w:abstractNumId="38" w15:restartNumberingAfterBreak="0">
+  <w:abstractNum w:abstractNumId="39" w15:restartNumberingAfterBreak="0">
     <w:nsid w:val="397A4001"/>
     <w:multiLevelType w:val="multilevel"/>
     <w:tmpl w:val="69DED716"/>
@@ -8314,7 +8602,7 @@
       </w:rPr>
     </w:lvl>
   </w:abstractNum>
-  <w:abstractNum w:abstractNumId="39" w15:restartNumberingAfterBreak="0">
+  <w:abstractNum w:abstractNumId="40" w15:restartNumberingAfterBreak="0">
     <w:nsid w:val="39CD2D9A"/>
     <w:multiLevelType w:val="multilevel"/>
     <w:tmpl w:val="764EF758"/>
@@ -8463,7 +8751,7 @@
       </w:rPr>
     </w:lvl>
   </w:abstractNum>
-  <w:abstractNum w:abstractNumId="40" w15:restartNumberingAfterBreak="0">
+  <w:abstractNum w:abstractNumId="41" w15:restartNumberingAfterBreak="0">
     <w:nsid w:val="3CA96369"/>
     <w:multiLevelType w:val="multilevel"/>
     <w:tmpl w:val="0D7A587C"/>
@@ -8612,7 +8900,7 @@
       </w:rPr>
     </w:lvl>
   </w:abstractNum>
-  <w:abstractNum w:abstractNumId="41" w15:restartNumberingAfterBreak="0">
+  <w:abstractNum w:abstractNumId="42" w15:restartNumberingAfterBreak="0">
     <w:nsid w:val="3D9E23F9"/>
     <w:multiLevelType w:val="multilevel"/>
     <w:tmpl w:val="6BDA1D90"/>
@@ -8761,7 +9049,156 @@
       </w:rPr>
     </w:lvl>
   </w:abstractNum>
-  <w:abstractNum w:abstractNumId="42" w15:restartNumberingAfterBreak="0">
+  <w:abstractNum w:abstractNumId="43" w15:restartNumberingAfterBreak="0">
+    <w:nsid w:val="3E841E97"/>
+    <w:multiLevelType w:val="multilevel"/>
+    <w:tmpl w:val="5A84CE9C"/>
+    <w:lvl w:ilvl="0">
+      <w:start w:val="1"/>
+      <w:numFmt w:val="bullet"/>
+      <w:lvlText w:val=""/>
+      <w:lvlJc w:val="left"/>
+      <w:pPr>
+        <w:tabs>
+          <w:tab w:val="num" w:pos="1440"/>
+        </w:tabs>
+        <w:ind w:left="1440" w:hanging="360"/>
+      </w:pPr>
+      <w:rPr>
+        <w:rFonts w:ascii="Symbol" w:hAnsi="Symbol" w:hint="default"/>
+        <w:sz w:val="20"/>
+      </w:rPr>
+    </w:lvl>
+    <w:lvl w:ilvl="1" w:tentative="1">
+      <w:start w:val="1"/>
+      <w:numFmt w:val="bullet"/>
+      <w:lvlText w:val="o"/>
+      <w:lvlJc w:val="left"/>
+      <w:pPr>
+        <w:tabs>
+          <w:tab w:val="num" w:pos="2160"/>
+        </w:tabs>
+        <w:ind w:left="2160" w:hanging="360"/>
+      </w:pPr>
+      <w:rPr>
+        <w:rFonts w:ascii="Courier New" w:hAnsi="Courier New" w:hint="default"/>
+        <w:sz w:val="20"/>
+      </w:rPr>
+    </w:lvl>
+    <w:lvl w:ilvl="2" w:tentative="1">
+      <w:start w:val="1"/>
+      <w:numFmt w:val="bullet"/>
+      <w:lvlText w:val=""/>
+      <w:lvlJc w:val="left"/>
+      <w:pPr>
+        <w:tabs>
+          <w:tab w:val="num" w:pos="2880"/>
+        </w:tabs>
+        <w:ind w:left="2880" w:hanging="360"/>
+      </w:pPr>
+      <w:rPr>
+        <w:rFonts w:ascii="Wingdings" w:hAnsi="Wingdings" w:hint="default"/>
+        <w:sz w:val="20"/>
+      </w:rPr>
+    </w:lvl>
+    <w:lvl w:ilvl="3" w:tentative="1">
+      <w:start w:val="1"/>
+      <w:numFmt w:val="bullet"/>
+      <w:lvlText w:val=""/>
+      <w:lvlJc w:val="left"/>
+      <w:pPr>
+        <w:tabs>
+          <w:tab w:val="num" w:pos="3600"/>
+        </w:tabs>
+        <w:ind w:left="3600" w:hanging="360"/>
+      </w:pPr>
+      <w:rPr>
+        <w:rFonts w:ascii="Wingdings" w:hAnsi="Wingdings" w:hint="default"/>
+        <w:sz w:val="20"/>
+      </w:rPr>
+    </w:lvl>
+    <w:lvl w:ilvl="4" w:tentative="1">
+      <w:start w:val="1"/>
+      <w:numFmt w:val="bullet"/>
+      <w:lvlText w:val=""/>
+      <w:lvlJc w:val="left"/>
+      <w:pPr>
+        <w:tabs>
+          <w:tab w:val="num" w:pos="4320"/>
+        </w:tabs>
+        <w:ind w:left="4320" w:hanging="360"/>
+      </w:pPr>
+      <w:rPr>
+        <w:rFonts w:ascii="Wingdings" w:hAnsi="Wingdings" w:hint="default"/>
+        <w:sz w:val="20"/>
+      </w:rPr>
+    </w:lvl>
+    <w:lvl w:ilvl="5" w:tentative="1">
+      <w:start w:val="1"/>
+      <w:numFmt w:val="bullet"/>
+      <w:lvlText w:val=""/>
+      <w:lvlJc w:val="left"/>
+      <w:pPr>
+        <w:tabs>
+          <w:tab w:val="num" w:pos="5040"/>
+        </w:tabs>
+        <w:ind w:left="5040" w:hanging="360"/>
+      </w:pPr>
+      <w:rPr>
+        <w:rFonts w:ascii="Wingdings" w:hAnsi="Wingdings" w:hint="default"/>
+        <w:sz w:val="20"/>
+      </w:rPr>
+    </w:lvl>
+    <w:lvl w:ilvl="6" w:tentative="1">
+      <w:start w:val="1"/>
+      <w:numFmt w:val="bullet"/>
+      <w:lvlText w:val=""/>
+      <w:lvlJc w:val="left"/>
+      <w:pPr>
+        <w:tabs>
+          <w:tab w:val="num" w:pos="5760"/>
+        </w:tabs>
+        <w:ind w:left="5760" w:hanging="360"/>
+      </w:pPr>
+      <w:rPr>
+        <w:rFonts w:ascii="Wingdings" w:hAnsi="Wingdings" w:hint="default"/>
+        <w:sz w:val="20"/>
+      </w:rPr>
+    </w:lvl>
+    <w:lvl w:ilvl="7" w:tentative="1">
+      <w:start w:val="1"/>
+      <w:numFmt w:val="bullet"/>
+      <w:lvlText w:val=""/>
+      <w:lvlJc w:val="left"/>
+      <w:pPr>
+        <w:tabs>
+          <w:tab w:val="num" w:pos="6480"/>
+        </w:tabs>
+        <w:ind w:left="6480" w:hanging="360"/>
+      </w:pPr>
+      <w:rPr>
+        <w:rFonts w:ascii="Wingdings" w:hAnsi="Wingdings" w:hint="default"/>
+        <w:sz w:val="20"/>
+      </w:rPr>
+    </w:lvl>
+    <w:lvl w:ilvl="8" w:tentative="1">
+      <w:start w:val="1"/>
+      <w:numFmt w:val="bullet"/>
+      <w:lvlText w:val=""/>
+      <w:lvlJc w:val="left"/>
+      <w:pPr>
+        <w:tabs>
+          <w:tab w:val="num" w:pos="7200"/>
+        </w:tabs>
+        <w:ind w:left="7200" w:hanging="360"/>
+      </w:pPr>
+      <w:rPr>
+        <w:rFonts w:ascii="Wingdings" w:hAnsi="Wingdings" w:hint="default"/>
+        <w:sz w:val="20"/>
+      </w:rPr>
+    </w:lvl>
+  </w:abstractNum>
+  <w:abstractNum w:abstractNumId="44" w15:restartNumberingAfterBreak="0">
     <w:nsid w:val="405F3447"/>
     <w:multiLevelType w:val="multilevel"/>
     <w:tmpl w:val="6F76852E"/>
@@ -8910,7 +9347,7 @@
       </w:rPr>
     </w:lvl>
   </w:abstractNum>
-  <w:abstractNum w:abstractNumId="43" w15:restartNumberingAfterBreak="0">
+  <w:abstractNum w:abstractNumId="45" w15:restartNumberingAfterBreak="0">
     <w:nsid w:val="40F8230D"/>
     <w:multiLevelType w:val="multilevel"/>
     <w:tmpl w:val="C4B28E98"/>
@@ -9059,7 +9496,7 @@
       </w:rPr>
     </w:lvl>
   </w:abstractNum>
-  <w:abstractNum w:abstractNumId="44" w15:restartNumberingAfterBreak="0">
+  <w:abstractNum w:abstractNumId="46" w15:restartNumberingAfterBreak="0">
     <w:nsid w:val="42364E8A"/>
     <w:multiLevelType w:val="multilevel"/>
     <w:tmpl w:val="776621AE"/>
@@ -9208,7 +9645,7 @@
       </w:rPr>
     </w:lvl>
   </w:abstractNum>
-  <w:abstractNum w:abstractNumId="45" w15:restartNumberingAfterBreak="0">
+  <w:abstractNum w:abstractNumId="47" w15:restartNumberingAfterBreak="0">
     <w:nsid w:val="424B7BFD"/>
     <w:multiLevelType w:val="multilevel"/>
     <w:tmpl w:val="BBAE9C78"/>
@@ -9357,7 +9794,7 @@
       </w:rPr>
     </w:lvl>
   </w:abstractNum>
-  <w:abstractNum w:abstractNumId="46" w15:restartNumberingAfterBreak="0">
+  <w:abstractNum w:abstractNumId="48" w15:restartNumberingAfterBreak="0">
     <w:nsid w:val="427309C0"/>
     <w:multiLevelType w:val="multilevel"/>
     <w:tmpl w:val="94DC2C6A"/>
@@ -9506,7 +9943,7 @@
       </w:rPr>
     </w:lvl>
   </w:abstractNum>
-  <w:abstractNum w:abstractNumId="47" w15:restartNumberingAfterBreak="0">
+  <w:abstractNum w:abstractNumId="49" w15:restartNumberingAfterBreak="0">
     <w:nsid w:val="42CE2986"/>
     <w:multiLevelType w:val="multilevel"/>
     <w:tmpl w:val="78C2154E"/>
@@ -9655,7 +10092,7 @@
       </w:rPr>
     </w:lvl>
   </w:abstractNum>
-  <w:abstractNum w:abstractNumId="48" w15:restartNumberingAfterBreak="0">
+  <w:abstractNum w:abstractNumId="50" w15:restartNumberingAfterBreak="0">
     <w:nsid w:val="468A510F"/>
     <w:multiLevelType w:val="multilevel"/>
     <w:tmpl w:val="C8D08BA4"/>
@@ -9804,7 +10241,7 @@
       </w:rPr>
     </w:lvl>
   </w:abstractNum>
-  <w:abstractNum w:abstractNumId="49" w15:restartNumberingAfterBreak="0">
+  <w:abstractNum w:abstractNumId="51" w15:restartNumberingAfterBreak="0">
     <w:nsid w:val="46CE1A39"/>
     <w:multiLevelType w:val="multilevel"/>
     <w:tmpl w:val="5B8A28B2"/>
@@ -9953,7 +10390,7 @@
       </w:rPr>
     </w:lvl>
   </w:abstractNum>
-  <w:abstractNum w:abstractNumId="50" w15:restartNumberingAfterBreak="0">
+  <w:abstractNum w:abstractNumId="52" w15:restartNumberingAfterBreak="0">
     <w:nsid w:val="47997B79"/>
     <w:multiLevelType w:val="multilevel"/>
     <w:tmpl w:val="5FD28832"/>
@@ -10102,7 +10539,7 @@
       </w:rPr>
     </w:lvl>
   </w:abstractNum>
-  <w:abstractNum w:abstractNumId="51" w15:restartNumberingAfterBreak="0">
+  <w:abstractNum w:abstractNumId="53" w15:restartNumberingAfterBreak="0">
     <w:nsid w:val="47A25285"/>
     <w:multiLevelType w:val="multilevel"/>
     <w:tmpl w:val="F0300110"/>
@@ -10251,7 +10688,7 @@
       </w:rPr>
     </w:lvl>
   </w:abstractNum>
-  <w:abstractNum w:abstractNumId="52" w15:restartNumberingAfterBreak="0">
+  <w:abstractNum w:abstractNumId="54" w15:restartNumberingAfterBreak="0">
     <w:nsid w:val="489A0335"/>
     <w:multiLevelType w:val="multilevel"/>
     <w:tmpl w:val="7556CA08"/>
@@ -10400,7 +10837,7 @@
       </w:rPr>
     </w:lvl>
   </w:abstractNum>
-  <w:abstractNum w:abstractNumId="53" w15:restartNumberingAfterBreak="0">
+  <w:abstractNum w:abstractNumId="55" w15:restartNumberingAfterBreak="0">
     <w:nsid w:val="48E41235"/>
     <w:multiLevelType w:val="multilevel"/>
     <w:tmpl w:val="5A168734"/>
@@ -10549,7 +10986,7 @@
       </w:rPr>
     </w:lvl>
   </w:abstractNum>
-  <w:abstractNum w:abstractNumId="54" w15:restartNumberingAfterBreak="0">
+  <w:abstractNum w:abstractNumId="56" w15:restartNumberingAfterBreak="0">
     <w:nsid w:val="4A770594"/>
     <w:multiLevelType w:val="multilevel"/>
     <w:tmpl w:val="5588D4EC"/>
@@ -10698,7 +11135,7 @@
       </w:rPr>
     </w:lvl>
   </w:abstractNum>
-  <w:abstractNum w:abstractNumId="55" w15:restartNumberingAfterBreak="0">
+  <w:abstractNum w:abstractNumId="57" w15:restartNumberingAfterBreak="0">
     <w:nsid w:val="4B2B0071"/>
     <w:multiLevelType w:val="multilevel"/>
     <w:tmpl w:val="215E9D52"/>
@@ -10847,7 +11284,7 @@
       </w:rPr>
     </w:lvl>
   </w:abstractNum>
-  <w:abstractNum w:abstractNumId="56" w15:restartNumberingAfterBreak="0">
+  <w:abstractNum w:abstractNumId="58" w15:restartNumberingAfterBreak="0">
     <w:nsid w:val="4E612764"/>
     <w:multiLevelType w:val="multilevel"/>
     <w:tmpl w:val="D3D2B4B2"/>
@@ -10996,7 +11433,7 @@
       </w:rPr>
     </w:lvl>
   </w:abstractNum>
-  <w:abstractNum w:abstractNumId="57" w15:restartNumberingAfterBreak="0">
+  <w:abstractNum w:abstractNumId="59" w15:restartNumberingAfterBreak="0">
     <w:nsid w:val="4FEE352A"/>
     <w:multiLevelType w:val="multilevel"/>
     <w:tmpl w:val="7C4AA06A"/>
@@ -11145,7 +11582,7 @@
       </w:rPr>
     </w:lvl>
   </w:abstractNum>
-  <w:abstractNum w:abstractNumId="58" w15:restartNumberingAfterBreak="0">
+  <w:abstractNum w:abstractNumId="60" w15:restartNumberingAfterBreak="0">
     <w:nsid w:val="50FF1FEA"/>
     <w:multiLevelType w:val="multilevel"/>
     <w:tmpl w:val="29589332"/>
@@ -11294,7 +11731,7 @@
       </w:rPr>
     </w:lvl>
   </w:abstractNum>
-  <w:abstractNum w:abstractNumId="59" w15:restartNumberingAfterBreak="0">
+  <w:abstractNum w:abstractNumId="61" w15:restartNumberingAfterBreak="0">
     <w:nsid w:val="52CC2653"/>
     <w:multiLevelType w:val="multilevel"/>
     <w:tmpl w:val="DDB2897A"/>
@@ -11443,7 +11880,7 @@
       </w:rPr>
     </w:lvl>
   </w:abstractNum>
-  <w:abstractNum w:abstractNumId="60" w15:restartNumberingAfterBreak="0">
+  <w:abstractNum w:abstractNumId="62" w15:restartNumberingAfterBreak="0">
     <w:nsid w:val="541D2729"/>
     <w:multiLevelType w:val="multilevel"/>
     <w:tmpl w:val="170810C2"/>
@@ -11592,7 +12029,7 @@
       </w:rPr>
     </w:lvl>
   </w:abstractNum>
-  <w:abstractNum w:abstractNumId="61" w15:restartNumberingAfterBreak="0">
+  <w:abstractNum w:abstractNumId="63" w15:restartNumberingAfterBreak="0">
     <w:nsid w:val="54F04378"/>
     <w:multiLevelType w:val="multilevel"/>
     <w:tmpl w:val="169A5998"/>
@@ -11741,7 +12178,7 @@
       </w:rPr>
     </w:lvl>
   </w:abstractNum>
-  <w:abstractNum w:abstractNumId="62" w15:restartNumberingAfterBreak="0">
+  <w:abstractNum w:abstractNumId="64" w15:restartNumberingAfterBreak="0">
     <w:nsid w:val="589229D4"/>
     <w:multiLevelType w:val="multilevel"/>
     <w:tmpl w:val="A5AC4208"/>
@@ -11890,7 +12327,7 @@
       </w:rPr>
     </w:lvl>
   </w:abstractNum>
-  <w:abstractNum w:abstractNumId="63" w15:restartNumberingAfterBreak="0">
+  <w:abstractNum w:abstractNumId="65" w15:restartNumberingAfterBreak="0">
     <w:nsid w:val="595B30A7"/>
     <w:multiLevelType w:val="multilevel"/>
     <w:tmpl w:val="7AE2AE8C"/>
@@ -12039,7 +12476,7 @@
       </w:rPr>
     </w:lvl>
   </w:abstractNum>
-  <w:abstractNum w:abstractNumId="64" w15:restartNumberingAfterBreak="0">
+  <w:abstractNum w:abstractNumId="66" w15:restartNumberingAfterBreak="0">
     <w:nsid w:val="5C39353B"/>
     <w:multiLevelType w:val="multilevel"/>
     <w:tmpl w:val="BCD0F41A"/>
@@ -12188,7 +12625,7 @@
       </w:rPr>
     </w:lvl>
   </w:abstractNum>
-  <w:abstractNum w:abstractNumId="65" w15:restartNumberingAfterBreak="0">
+  <w:abstractNum w:abstractNumId="67" w15:restartNumberingAfterBreak="0">
     <w:nsid w:val="5C3B1F4E"/>
     <w:multiLevelType w:val="multilevel"/>
     <w:tmpl w:val="4168A238"/>
@@ -12337,7 +12774,7 @@
       </w:rPr>
     </w:lvl>
   </w:abstractNum>
-  <w:abstractNum w:abstractNumId="66" w15:restartNumberingAfterBreak="0">
+  <w:abstractNum w:abstractNumId="68" w15:restartNumberingAfterBreak="0">
     <w:nsid w:val="5CB95E1C"/>
     <w:multiLevelType w:val="multilevel"/>
     <w:tmpl w:val="347E5616"/>
@@ -12486,7 +12923,7 @@
       </w:rPr>
     </w:lvl>
   </w:abstractNum>
-  <w:abstractNum w:abstractNumId="67" w15:restartNumberingAfterBreak="0">
+  <w:abstractNum w:abstractNumId="69" w15:restartNumberingAfterBreak="0">
     <w:nsid w:val="5D140E89"/>
     <w:multiLevelType w:val="multilevel"/>
     <w:tmpl w:val="BAC251EE"/>
@@ -12635,7 +13072,7 @@
       </w:rPr>
     </w:lvl>
   </w:abstractNum>
-  <w:abstractNum w:abstractNumId="68" w15:restartNumberingAfterBreak="0">
+  <w:abstractNum w:abstractNumId="70" w15:restartNumberingAfterBreak="0">
     <w:nsid w:val="5D9B4895"/>
     <w:multiLevelType w:val="multilevel"/>
     <w:tmpl w:val="96744ED8"/>
@@ -12784,7 +13221,7 @@
       </w:rPr>
     </w:lvl>
   </w:abstractNum>
-  <w:abstractNum w:abstractNumId="69" w15:restartNumberingAfterBreak="0">
+  <w:abstractNum w:abstractNumId="71" w15:restartNumberingAfterBreak="0">
     <w:nsid w:val="5DAC69F2"/>
     <w:multiLevelType w:val="multilevel"/>
     <w:tmpl w:val="51B4B8F8"/>
@@ -12933,7 +13370,7 @@
       </w:rPr>
     </w:lvl>
   </w:abstractNum>
-  <w:abstractNum w:abstractNumId="70" w15:restartNumberingAfterBreak="0">
+  <w:abstractNum w:abstractNumId="72" w15:restartNumberingAfterBreak="0">
     <w:nsid w:val="5EB47A82"/>
     <w:multiLevelType w:val="multilevel"/>
     <w:tmpl w:val="37980B2C"/>
@@ -13082,7 +13519,7 @@
       </w:rPr>
     </w:lvl>
   </w:abstractNum>
-  <w:abstractNum w:abstractNumId="71" w15:restartNumberingAfterBreak="0">
+  <w:abstractNum w:abstractNumId="73" w15:restartNumberingAfterBreak="0">
     <w:nsid w:val="5F2B4345"/>
     <w:multiLevelType w:val="multilevel"/>
     <w:tmpl w:val="D562C796"/>
@@ -13231,7 +13668,7 @@
       </w:rPr>
     </w:lvl>
   </w:abstractNum>
-  <w:abstractNum w:abstractNumId="72" w15:restartNumberingAfterBreak="0">
+  <w:abstractNum w:abstractNumId="74" w15:restartNumberingAfterBreak="0">
     <w:nsid w:val="60CE030E"/>
     <w:multiLevelType w:val="multilevel"/>
     <w:tmpl w:val="BB0A0640"/>
@@ -13380,7 +13817,7 @@
       </w:rPr>
     </w:lvl>
   </w:abstractNum>
-  <w:abstractNum w:abstractNumId="73" w15:restartNumberingAfterBreak="0">
+  <w:abstractNum w:abstractNumId="75" w15:restartNumberingAfterBreak="0">
     <w:nsid w:val="64FC5AF1"/>
     <w:multiLevelType w:val="multilevel"/>
     <w:tmpl w:val="455A114E"/>
@@ -13529,7 +13966,7 @@
       </w:rPr>
     </w:lvl>
   </w:abstractNum>
-  <w:abstractNum w:abstractNumId="74" w15:restartNumberingAfterBreak="0">
+  <w:abstractNum w:abstractNumId="76" w15:restartNumberingAfterBreak="0">
     <w:nsid w:val="667E2A2C"/>
     <w:multiLevelType w:val="multilevel"/>
     <w:tmpl w:val="1A86F908"/>
@@ -13678,7 +14115,7 @@
       </w:rPr>
     </w:lvl>
   </w:abstractNum>
-  <w:abstractNum w:abstractNumId="75" w15:restartNumberingAfterBreak="0">
+  <w:abstractNum w:abstractNumId="77" w15:restartNumberingAfterBreak="0">
     <w:nsid w:val="68D51146"/>
     <w:multiLevelType w:val="multilevel"/>
     <w:tmpl w:val="B0CE53EC"/>
@@ -13827,7 +14264,7 @@
       </w:rPr>
     </w:lvl>
   </w:abstractNum>
-  <w:abstractNum w:abstractNumId="76" w15:restartNumberingAfterBreak="0">
+  <w:abstractNum w:abstractNumId="78" w15:restartNumberingAfterBreak="0">
     <w:nsid w:val="6A3B1D7B"/>
     <w:multiLevelType w:val="multilevel"/>
     <w:tmpl w:val="3D4AB994"/>
@@ -13976,7 +14413,7 @@
       </w:rPr>
     </w:lvl>
   </w:abstractNum>
-  <w:abstractNum w:abstractNumId="77" w15:restartNumberingAfterBreak="0">
+  <w:abstractNum w:abstractNumId="79" w15:restartNumberingAfterBreak="0">
     <w:nsid w:val="6C46024E"/>
     <w:multiLevelType w:val="multilevel"/>
     <w:tmpl w:val="500671A6"/>
@@ -14125,7 +14562,7 @@
       </w:rPr>
     </w:lvl>
   </w:abstractNum>
-  <w:abstractNum w:abstractNumId="78" w15:restartNumberingAfterBreak="0">
+  <w:abstractNum w:abstractNumId="80" w15:restartNumberingAfterBreak="0">
     <w:nsid w:val="70763AD2"/>
     <w:multiLevelType w:val="multilevel"/>
     <w:tmpl w:val="772E9EAE"/>
@@ -14274,7 +14711,7 @@
       </w:rPr>
     </w:lvl>
   </w:abstractNum>
-  <w:abstractNum w:abstractNumId="79" w15:restartNumberingAfterBreak="0">
+  <w:abstractNum w:abstractNumId="81" w15:restartNumberingAfterBreak="0">
     <w:nsid w:val="736E26B3"/>
     <w:multiLevelType w:val="multilevel"/>
     <w:tmpl w:val="C3029BAE"/>
@@ -14423,7 +14860,7 @@
       </w:rPr>
     </w:lvl>
   </w:abstractNum>
-  <w:abstractNum w:abstractNumId="80" w15:restartNumberingAfterBreak="0">
+  <w:abstractNum w:abstractNumId="82" w15:restartNumberingAfterBreak="0">
     <w:nsid w:val="74E66EA7"/>
     <w:multiLevelType w:val="multilevel"/>
     <w:tmpl w:val="88A0F08A"/>
@@ -14572,7 +15009,7 @@
       </w:rPr>
     </w:lvl>
   </w:abstractNum>
-  <w:abstractNum w:abstractNumId="81" w15:restartNumberingAfterBreak="0">
+  <w:abstractNum w:abstractNumId="83" w15:restartNumberingAfterBreak="0">
     <w:nsid w:val="770552D8"/>
     <w:multiLevelType w:val="multilevel"/>
     <w:tmpl w:val="E7AA19A4"/>
@@ -14721,7 +15158,7 @@
       </w:rPr>
     </w:lvl>
   </w:abstractNum>
-  <w:abstractNum w:abstractNumId="82" w15:restartNumberingAfterBreak="0">
+  <w:abstractNum w:abstractNumId="84" w15:restartNumberingAfterBreak="0">
     <w:nsid w:val="7738032F"/>
     <w:multiLevelType w:val="multilevel"/>
     <w:tmpl w:val="BA8E5A16"/>
@@ -14870,7 +15307,7 @@
       </w:rPr>
     </w:lvl>
   </w:abstractNum>
-  <w:abstractNum w:abstractNumId="83" w15:restartNumberingAfterBreak="0">
+  <w:abstractNum w:abstractNumId="85" w15:restartNumberingAfterBreak="0">
     <w:nsid w:val="784E2C84"/>
     <w:multiLevelType w:val="multilevel"/>
     <w:tmpl w:val="01BA846C"/>
@@ -15019,7 +15456,7 @@
       </w:rPr>
     </w:lvl>
   </w:abstractNum>
-  <w:abstractNum w:abstractNumId="84" w15:restartNumberingAfterBreak="0">
+  <w:abstractNum w:abstractNumId="86" w15:restartNumberingAfterBreak="0">
     <w:nsid w:val="78553491"/>
     <w:multiLevelType w:val="multilevel"/>
     <w:tmpl w:val="A044F188"/>
@@ -15168,7 +15605,7 @@
       </w:rPr>
     </w:lvl>
   </w:abstractNum>
-  <w:abstractNum w:abstractNumId="85" w15:restartNumberingAfterBreak="0">
+  <w:abstractNum w:abstractNumId="87" w15:restartNumberingAfterBreak="0">
     <w:nsid w:val="78B45D32"/>
     <w:multiLevelType w:val="multilevel"/>
     <w:tmpl w:val="19428030"/>
@@ -15317,7 +15754,156 @@
       </w:rPr>
     </w:lvl>
   </w:abstractNum>
-  <w:abstractNum w:abstractNumId="86" w15:restartNumberingAfterBreak="0">
+  <w:abstractNum w:abstractNumId="88" w15:restartNumberingAfterBreak="0">
+    <w:nsid w:val="78D4248E"/>
+    <w:multiLevelType w:val="multilevel"/>
+    <w:tmpl w:val="4942DD18"/>
+    <w:lvl w:ilvl="0">
+      <w:start w:val="1"/>
+      <w:numFmt w:val="bullet"/>
+      <w:lvlText w:val=""/>
+      <w:lvlJc w:val="left"/>
+      <w:pPr>
+        <w:tabs>
+          <w:tab w:val="num" w:pos="1440"/>
+        </w:tabs>
+        <w:ind w:left="1440" w:hanging="360"/>
+      </w:pPr>
+      <w:rPr>
+        <w:rFonts w:ascii="Symbol" w:hAnsi="Symbol" w:hint="default"/>
+        <w:sz w:val="20"/>
+      </w:rPr>
+    </w:lvl>
+    <w:lvl w:ilvl="1" w:tentative="1">
+      <w:start w:val="1"/>
+      <w:numFmt w:val="bullet"/>
+      <w:lvlText w:val="o"/>
+      <w:lvlJc w:val="left"/>
+      <w:pPr>
+        <w:tabs>
+          <w:tab w:val="num" w:pos="2160"/>
+        </w:tabs>
+        <w:ind w:left="2160" w:hanging="360"/>
+      </w:pPr>
+      <w:rPr>
+        <w:rFonts w:ascii="Courier New" w:hAnsi="Courier New" w:hint="default"/>
+        <w:sz w:val="20"/>
+      </w:rPr>
+    </w:lvl>
+    <w:lvl w:ilvl="2" w:tentative="1">
+      <w:start w:val="1"/>
+      <w:numFmt w:val="bullet"/>
+      <w:lvlText w:val=""/>
+      <w:lvlJc w:val="left"/>
+      <w:pPr>
+        <w:tabs>
+          <w:tab w:val="num" w:pos="2880"/>
+        </w:tabs>
+        <w:ind w:left="2880" w:hanging="360"/>
+      </w:pPr>
+      <w:rPr>
+        <w:rFonts w:ascii="Wingdings" w:hAnsi="Wingdings" w:hint="default"/>
+        <w:sz w:val="20"/>
+      </w:rPr>
+    </w:lvl>
+    <w:lvl w:ilvl="3" w:tentative="1">
+      <w:start w:val="1"/>
+      <w:numFmt w:val="bullet"/>
+      <w:lvlText w:val=""/>
+      <w:lvlJc w:val="left"/>
+      <w:pPr>
+        <w:tabs>
+          <w:tab w:val="num" w:pos="3600"/>
+        </w:tabs>
+        <w:ind w:left="3600" w:hanging="360"/>
+      </w:pPr>
+      <w:rPr>
+        <w:rFonts w:ascii="Wingdings" w:hAnsi="Wingdings" w:hint="default"/>
+        <w:sz w:val="20"/>
+      </w:rPr>
+    </w:lvl>
+    <w:lvl w:ilvl="4" w:tentative="1">
+      <w:start w:val="1"/>
+      <w:numFmt w:val="bullet"/>
+      <w:lvlText w:val=""/>
+      <w:lvlJc w:val="left"/>
+      <w:pPr>
+        <w:tabs>
+          <w:tab w:val="num" w:pos="4320"/>
+        </w:tabs>
+        <w:ind w:left="4320" w:hanging="360"/>
+      </w:pPr>
+      <w:rPr>
+        <w:rFonts w:ascii="Wingdings" w:hAnsi="Wingdings" w:hint="default"/>
+        <w:sz w:val="20"/>
+      </w:rPr>
+    </w:lvl>
+    <w:lvl w:ilvl="5" w:tentative="1">
+      <w:start w:val="1"/>
+      <w:numFmt w:val="bullet"/>
+      <w:lvlText w:val=""/>
+      <w:lvlJc w:val="left"/>
+      <w:pPr>
+        <w:tabs>
+          <w:tab w:val="num" w:pos="5040"/>
+        </w:tabs>
+        <w:ind w:left="5040" w:hanging="360"/>
+      </w:pPr>
+      <w:rPr>
+        <w:rFonts w:ascii="Wingdings" w:hAnsi="Wingdings" w:hint="default"/>
+        <w:sz w:val="20"/>
+      </w:rPr>
+    </w:lvl>
+    <w:lvl w:ilvl="6" w:tentative="1">
+      <w:start w:val="1"/>
+      <w:numFmt w:val="bullet"/>
+      <w:lvlText w:val=""/>
+      <w:lvlJc w:val="left"/>
+      <w:pPr>
+        <w:tabs>
+          <w:tab w:val="num" w:pos="5760"/>
+        </w:tabs>
+        <w:ind w:left="5760" w:hanging="360"/>
+      </w:pPr>
+      <w:rPr>
+        <w:rFonts w:ascii="Wingdings" w:hAnsi="Wingdings" w:hint="default"/>
+        <w:sz w:val="20"/>
+      </w:rPr>
+    </w:lvl>
+    <w:lvl w:ilvl="7" w:tentative="1">
+      <w:start w:val="1"/>
+      <w:numFmt w:val="bullet"/>
+      <w:lvlText w:val=""/>
+      <w:lvlJc w:val="left"/>
+      <w:pPr>
+        <w:tabs>
+          <w:tab w:val="num" w:pos="6480"/>
+        </w:tabs>
+        <w:ind w:left="6480" w:hanging="360"/>
+      </w:pPr>
+      <w:rPr>
+        <w:rFonts w:ascii="Wingdings" w:hAnsi="Wingdings" w:hint="default"/>
+        <w:sz w:val="20"/>
+      </w:rPr>
+    </w:lvl>
+    <w:lvl w:ilvl="8" w:tentative="1">
+      <w:start w:val="1"/>
+      <w:numFmt w:val="bullet"/>
+      <w:lvlText w:val=""/>
+      <w:lvlJc w:val="left"/>
+      <w:pPr>
+        <w:tabs>
+          <w:tab w:val="num" w:pos="7200"/>
+        </w:tabs>
+        <w:ind w:left="7200" w:hanging="360"/>
+      </w:pPr>
+      <w:rPr>
+        <w:rFonts w:ascii="Wingdings" w:hAnsi="Wingdings" w:hint="default"/>
+        <w:sz w:val="20"/>
+      </w:rPr>
+    </w:lvl>
+  </w:abstractNum>
+  <w:abstractNum w:abstractNumId="89" w15:restartNumberingAfterBreak="0">
     <w:nsid w:val="7A69644D"/>
     <w:multiLevelType w:val="multilevel"/>
     <w:tmpl w:val="697657FC"/>
@@ -15466,7 +16052,7 @@
       </w:rPr>
     </w:lvl>
   </w:abstractNum>
-  <w:abstractNum w:abstractNumId="87" w15:restartNumberingAfterBreak="0">
+  <w:abstractNum w:abstractNumId="90" w15:restartNumberingAfterBreak="0">
     <w:nsid w:val="7CA10D01"/>
     <w:multiLevelType w:val="multilevel"/>
     <w:tmpl w:val="19320642"/>
@@ -15616,10 +16202,10 @@
     </w:lvl>
   </w:abstractNum>
   <w:num w:numId="1" w16cid:durableId="394008686">
-    <w:abstractNumId w:val="85"/>
+    <w:abstractNumId w:val="87"/>
   </w:num>
   <w:num w:numId="2" w16cid:durableId="1240552510">
-    <w:abstractNumId w:val="80"/>
+    <w:abstractNumId w:val="82"/>
   </w:num>
   <w:num w:numId="3" w16cid:durableId="669211974">
     <w:abstractNumId w:val="3"/>
@@ -15631,22 +16217,22 @@
     <w:abstractNumId w:val="15"/>
   </w:num>
   <w:num w:numId="6" w16cid:durableId="1123576063">
-    <w:abstractNumId w:val="29"/>
+    <w:abstractNumId w:val="30"/>
   </w:num>
   <w:num w:numId="7" w16cid:durableId="977226698">
-    <w:abstractNumId w:val="59"/>
+    <w:abstractNumId w:val="61"/>
   </w:num>
   <w:num w:numId="8" w16cid:durableId="432015627">
-    <w:abstractNumId w:val="52"/>
+    <w:abstractNumId w:val="54"/>
   </w:num>
   <w:num w:numId="9" w16cid:durableId="493648365">
-    <w:abstractNumId w:val="45"/>
+    <w:abstractNumId w:val="47"/>
   </w:num>
   <w:num w:numId="10" w16cid:durableId="344213054">
-    <w:abstractNumId w:val="46"/>
+    <w:abstractNumId w:val="48"/>
   </w:num>
   <w:num w:numId="11" w16cid:durableId="1998610581">
-    <w:abstractNumId w:val="79"/>
+    <w:abstractNumId w:val="81"/>
   </w:num>
   <w:num w:numId="12" w16cid:durableId="542376058">
     <w:abstractNumId w:val="0"/>
@@ -15655,46 +16241,46 @@
     <w:abstractNumId w:val="14"/>
   </w:num>
   <w:num w:numId="14" w16cid:durableId="1079524773">
-    <w:abstractNumId w:val="50"/>
+    <w:abstractNumId w:val="52"/>
   </w:num>
   <w:num w:numId="15" w16cid:durableId="2134712057">
     <w:abstractNumId w:val="12"/>
   </w:num>
   <w:num w:numId="16" w16cid:durableId="1902909463">
-    <w:abstractNumId w:val="86"/>
+    <w:abstractNumId w:val="89"/>
   </w:num>
   <w:num w:numId="17" w16cid:durableId="1785886849">
-    <w:abstractNumId w:val="76"/>
+    <w:abstractNumId w:val="78"/>
   </w:num>
   <w:num w:numId="18" w16cid:durableId="1089695684">
-    <w:abstractNumId w:val="49"/>
+    <w:abstractNumId w:val="51"/>
   </w:num>
   <w:num w:numId="19" w16cid:durableId="984697768">
     <w:abstractNumId w:val="9"/>
   </w:num>
   <w:num w:numId="20" w16cid:durableId="1323893631">
-    <w:abstractNumId w:val="35"/>
+    <w:abstractNumId w:val="36"/>
   </w:num>
   <w:num w:numId="21" w16cid:durableId="1270233574">
-    <w:abstractNumId w:val="67"/>
+    <w:abstractNumId w:val="69"/>
   </w:num>
   <w:num w:numId="22" w16cid:durableId="1369840318">
-    <w:abstractNumId w:val="84"/>
+    <w:abstractNumId w:val="86"/>
   </w:num>
   <w:num w:numId="23" w16cid:durableId="2061054887">
     <w:abstractNumId w:val="21"/>
   </w:num>
   <w:num w:numId="24" w16cid:durableId="1084183834">
-    <w:abstractNumId w:val="44"/>
+    <w:abstractNumId w:val="46"/>
   </w:num>
   <w:num w:numId="25" w16cid:durableId="754321216">
-    <w:abstractNumId w:val="87"/>
+    <w:abstractNumId w:val="90"/>
   </w:num>
   <w:num w:numId="26" w16cid:durableId="176116110">
-    <w:abstractNumId w:val="68"/>
+    <w:abstractNumId w:val="70"/>
   </w:num>
   <w:num w:numId="27" w16cid:durableId="1964992685">
-    <w:abstractNumId w:val="81"/>
+    <w:abstractNumId w:val="83"/>
   </w:num>
   <w:num w:numId="28" w16cid:durableId="1983777358">
     <w:abstractNumId w:val="4"/>
@@ -15703,19 +16289,19 @@
     <w:abstractNumId w:val="11"/>
   </w:num>
   <w:num w:numId="30" w16cid:durableId="188958933">
-    <w:abstractNumId w:val="40"/>
+    <w:abstractNumId w:val="41"/>
   </w:num>
   <w:num w:numId="31" w16cid:durableId="635067894">
-    <w:abstractNumId w:val="58"/>
+    <w:abstractNumId w:val="60"/>
   </w:num>
   <w:num w:numId="32" w16cid:durableId="665087431">
     <w:abstractNumId w:val="1"/>
   </w:num>
   <w:num w:numId="33" w16cid:durableId="1161190978">
-    <w:abstractNumId w:val="41"/>
+    <w:abstractNumId w:val="42"/>
   </w:num>
   <w:num w:numId="34" w16cid:durableId="128480471">
-    <w:abstractNumId w:val="72"/>
+    <w:abstractNumId w:val="74"/>
   </w:num>
   <w:num w:numId="35" w16cid:durableId="441341694">
     <w:abstractNumId w:val="19"/>
@@ -15724,106 +16310,106 @@
     <w:abstractNumId w:val="20"/>
   </w:num>
   <w:num w:numId="37" w16cid:durableId="698160046">
-    <w:abstractNumId w:val="73"/>
+    <w:abstractNumId w:val="75"/>
   </w:num>
   <w:num w:numId="38" w16cid:durableId="787090011">
-    <w:abstractNumId w:val="31"/>
+    <w:abstractNumId w:val="32"/>
   </w:num>
   <w:num w:numId="39" w16cid:durableId="1577014890">
-    <w:abstractNumId w:val="83"/>
+    <w:abstractNumId w:val="85"/>
   </w:num>
   <w:num w:numId="40" w16cid:durableId="371074342">
-    <w:abstractNumId w:val="64"/>
+    <w:abstractNumId w:val="66"/>
   </w:num>
   <w:num w:numId="41" w16cid:durableId="1981373961">
-    <w:abstractNumId w:val="55"/>
+    <w:abstractNumId w:val="57"/>
   </w:num>
   <w:num w:numId="42" w16cid:durableId="1865510187">
+    <w:abstractNumId w:val="67"/>
+  </w:num>
+  <w:num w:numId="43" w16cid:durableId="1857839858">
     <w:abstractNumId w:val="65"/>
   </w:num>
-  <w:num w:numId="43" w16cid:durableId="1857839858">
-    <w:abstractNumId w:val="63"/>
-  </w:num>
   <w:num w:numId="44" w16cid:durableId="311326505">
-    <w:abstractNumId w:val="37"/>
+    <w:abstractNumId w:val="38"/>
   </w:num>
   <w:num w:numId="45" w16cid:durableId="1917399004">
     <w:abstractNumId w:val="23"/>
   </w:num>
   <w:num w:numId="46" w16cid:durableId="1695229449">
-    <w:abstractNumId w:val="42"/>
+    <w:abstractNumId w:val="44"/>
   </w:num>
   <w:num w:numId="47" w16cid:durableId="1862544825">
-    <w:abstractNumId w:val="66"/>
+    <w:abstractNumId w:val="68"/>
   </w:num>
   <w:num w:numId="48" w16cid:durableId="1042710121">
-    <w:abstractNumId w:val="62"/>
+    <w:abstractNumId w:val="64"/>
   </w:num>
   <w:num w:numId="49" w16cid:durableId="459302887">
-    <w:abstractNumId w:val="51"/>
+    <w:abstractNumId w:val="53"/>
   </w:num>
   <w:num w:numId="50" w16cid:durableId="1013726545">
-    <w:abstractNumId w:val="57"/>
+    <w:abstractNumId w:val="59"/>
   </w:num>
   <w:num w:numId="51" w16cid:durableId="654143133">
     <w:abstractNumId w:val="22"/>
   </w:num>
   <w:num w:numId="52" w16cid:durableId="1550655144">
-    <w:abstractNumId w:val="61"/>
+    <w:abstractNumId w:val="63"/>
   </w:num>
   <w:num w:numId="53" w16cid:durableId="1537423802">
-    <w:abstractNumId w:val="39"/>
+    <w:abstractNumId w:val="40"/>
   </w:num>
   <w:num w:numId="54" w16cid:durableId="793259108">
-    <w:abstractNumId w:val="60"/>
+    <w:abstractNumId w:val="62"/>
   </w:num>
   <w:num w:numId="55" w16cid:durableId="1745105143">
-    <w:abstractNumId w:val="34"/>
+    <w:abstractNumId w:val="35"/>
   </w:num>
   <w:num w:numId="56" w16cid:durableId="839078998">
-    <w:abstractNumId w:val="30"/>
+    <w:abstractNumId w:val="31"/>
   </w:num>
   <w:num w:numId="57" w16cid:durableId="2053994237">
-    <w:abstractNumId w:val="32"/>
+    <w:abstractNumId w:val="33"/>
   </w:num>
   <w:num w:numId="58" w16cid:durableId="889027042">
     <w:abstractNumId w:val="17"/>
   </w:num>
   <w:num w:numId="59" w16cid:durableId="1310093690">
-    <w:abstractNumId w:val="26"/>
+    <w:abstractNumId w:val="27"/>
   </w:num>
   <w:num w:numId="60" w16cid:durableId="1335572978">
     <w:abstractNumId w:val="18"/>
   </w:num>
   <w:num w:numId="61" w16cid:durableId="486434867">
-    <w:abstractNumId w:val="53"/>
+    <w:abstractNumId w:val="55"/>
   </w:num>
   <w:num w:numId="62" w16cid:durableId="1586106940">
-    <w:abstractNumId w:val="47"/>
+    <w:abstractNumId w:val="49"/>
   </w:num>
   <w:num w:numId="63" w16cid:durableId="244534175">
-    <w:abstractNumId w:val="28"/>
+    <w:abstractNumId w:val="29"/>
   </w:num>
   <w:num w:numId="64" w16cid:durableId="213932653">
-    <w:abstractNumId w:val="54"/>
+    <w:abstractNumId w:val="56"/>
   </w:num>
   <w:num w:numId="65" w16cid:durableId="1139687495">
-    <w:abstractNumId w:val="48"/>
+    <w:abstractNumId w:val="50"/>
   </w:num>
   <w:num w:numId="66" w16cid:durableId="1769080675">
-    <w:abstractNumId w:val="27"/>
+    <w:abstractNumId w:val="28"/>
   </w:num>
   <w:num w:numId="67" w16cid:durableId="204174802">
     <w:abstractNumId w:val="8"/>
   </w:num>
   <w:num w:numId="68" w16cid:durableId="74018265">
-    <w:abstractNumId w:val="43"/>
+    <w:abstractNumId w:val="45"/>
   </w:num>
   <w:num w:numId="69" w16cid:durableId="1451778068">
-    <w:abstractNumId w:val="69"/>
+    <w:abstractNumId w:val="71"/>
   </w:num>
   <w:num w:numId="70" w16cid:durableId="1379402881">
-    <w:abstractNumId w:val="36"/>
+    <w:abstractNumId w:val="37"/>
   </w:num>
   <w:num w:numId="71" w16cid:durableId="1845589216">
     <w:abstractNumId w:val="5"/>
@@ -15832,34 +16418,34 @@
     <w:abstractNumId w:val="6"/>
   </w:num>
   <w:num w:numId="73" w16cid:durableId="1463301471">
-    <w:abstractNumId w:val="25"/>
+    <w:abstractNumId w:val="26"/>
   </w:num>
   <w:num w:numId="74" w16cid:durableId="274483621">
-    <w:abstractNumId w:val="38"/>
+    <w:abstractNumId w:val="39"/>
   </w:num>
   <w:num w:numId="75" w16cid:durableId="1121799244">
     <w:abstractNumId w:val="10"/>
   </w:num>
   <w:num w:numId="76" w16cid:durableId="1089934116">
-    <w:abstractNumId w:val="56"/>
+    <w:abstractNumId w:val="58"/>
   </w:num>
   <w:num w:numId="77" w16cid:durableId="933631660">
-    <w:abstractNumId w:val="82"/>
+    <w:abstractNumId w:val="84"/>
   </w:num>
   <w:num w:numId="78" w16cid:durableId="2084717542">
-    <w:abstractNumId w:val="78"/>
+    <w:abstractNumId w:val="80"/>
   </w:num>
   <w:num w:numId="79" w16cid:durableId="1768382047">
     <w:abstractNumId w:val="24"/>
   </w:num>
   <w:num w:numId="80" w16cid:durableId="741870004">
-    <w:abstractNumId w:val="33"/>
+    <w:abstractNumId w:val="34"/>
   </w:num>
   <w:num w:numId="81" w16cid:durableId="831065564">
-    <w:abstractNumId w:val="77"/>
+    <w:abstractNumId w:val="79"/>
   </w:num>
   <w:num w:numId="82" w16cid:durableId="1030494683">
-    <w:abstractNumId w:val="71"/>
+    <w:abstractNumId w:val="73"/>
   </w:num>
   <w:num w:numId="83" w16cid:durableId="371657654">
     <w:abstractNumId w:val="13"/>
@@ -15868,16 +16454,25 @@
     <w:abstractNumId w:val="7"/>
   </w:num>
   <w:num w:numId="85" w16cid:durableId="2146459930">
-    <w:abstractNumId w:val="70"/>
+    <w:abstractNumId w:val="72"/>
   </w:num>
   <w:num w:numId="86" w16cid:durableId="444931596">
-    <w:abstractNumId w:val="74"/>
+    <w:abstractNumId w:val="76"/>
   </w:num>
   <w:num w:numId="87" w16cid:durableId="217596948">
-    <w:abstractNumId w:val="75"/>
+    <w:abstractNumId w:val="77"/>
   </w:num>
   <w:num w:numId="88" w16cid:durableId="700474574">
     <w:abstractNumId w:val="2"/>
+  </w:num>
+  <w:num w:numId="89" w16cid:durableId="1754202235">
+    <w:abstractNumId w:val="43"/>
+  </w:num>
+  <w:num w:numId="90" w16cid:durableId="985015237">
+    <w:abstractNumId w:val="25"/>
+  </w:num>
+  <w:num w:numId="91" w16cid:durableId="1389576432">
+    <w:abstractNumId w:val="88"/>
   </w:num>
 </w:numbering>
 </file>
@@ -16482,7 +17077,6 @@
   <w:style w:type="character" w:default="1" w:styleId="DefaultParagraphFont">
     <w:name w:val="Default Paragraph Font"/>
     <w:uiPriority w:val="1"/>
-    <w:semiHidden/>
     <w:unhideWhenUsed/>
   </w:style>
   <w:style w:type="table" w:default="1" w:styleId="TableNormal">

</xml_diff>

<commit_message>
Added Calvin's part to the User Group document
</commit_message>
<xml_diff>
--- a/Documents/User Groups & Profiles.docx
+++ b/Documents/User Groups & Profiles.docx
@@ -35,6 +35,9 @@
       </w:r>
       <w:r>
         <w:t>&amp; Subgroups</w:t>
+      </w:r>
+      <w:r>
+        <w:t xml:space="preserve"> </w:t>
       </w:r>
       <w:r>
         <w:t>(Dylan)</w:t>
@@ -208,6 +211,7 @@
         <w:ind w:firstLine="360"/>
       </w:pPr>
       <w:r>
+        <w:lastRenderedPageBreak/>
         <w:t>3) Veterinary Technicians</w:t>
       </w:r>
     </w:p>
@@ -284,12 +288,375 @@
         <w:t xml:space="preserve"> (Calvin)</w:t>
       </w:r>
     </w:p>
+    <w:p>
+      <w:pPr>
+        <w:pStyle w:val="Heading3"/>
+        <w:ind w:firstLine="360"/>
+      </w:pPr>
+      <w:r>
+        <w:t>Pet Owners</w:t>
+      </w:r>
+    </w:p>
+    <w:p>
+      <w:pPr>
+        <w:pStyle w:val="Heading4"/>
+        <w:ind w:firstLine="720"/>
+      </w:pPr>
+      <w:r>
+        <w:t xml:space="preserve"> What they need: </w:t>
+      </w:r>
+    </w:p>
+    <w:p>
+      <w:pPr>
+        <w:ind w:left="720" w:firstLine="360"/>
+      </w:pPr>
+      <w:r>
+        <w:t xml:space="preserve">• A way to pick a time for an appointment without having to call the office. </w:t>
+      </w:r>
+    </w:p>
+    <w:p>
+      <w:pPr>
+        <w:ind w:left="720" w:firstLine="360"/>
+      </w:pPr>
+      <w:proofErr w:type="gramStart"/>
+      <w:r>
+        <w:t>• To see</w:t>
+      </w:r>
+      <w:proofErr w:type="gramEnd"/>
+      <w:r>
+        <w:t xml:space="preserve"> their pet’s shots and records whenever they want. </w:t>
+      </w:r>
+    </w:p>
+    <w:p>
+      <w:pPr>
+        <w:ind w:left="720" w:firstLine="360"/>
+      </w:pPr>
+      <w:r>
+        <w:t xml:space="preserve">• Simple instructions on what to do before they show up. </w:t>
+      </w:r>
+    </w:p>
+    <w:p>
+      <w:pPr>
+        <w:pStyle w:val="Heading4"/>
+        <w:ind w:firstLine="720"/>
+      </w:pPr>
+      <w:r>
+        <w:t>What they want:</w:t>
+      </w:r>
+    </w:p>
+    <w:p>
+      <w:pPr>
+        <w:ind w:left="720" w:firstLine="360"/>
+      </w:pPr>
+      <w:r>
+        <w:t xml:space="preserve"> • To fill out forms on their phone while sitting on the couch. </w:t>
+      </w:r>
+    </w:p>
+    <w:p>
+      <w:pPr>
+        <w:ind w:left="720" w:firstLine="360"/>
+      </w:pPr>
+      <w:r>
+        <w:t xml:space="preserve">• Text messages for reminders instead of phone calls. </w:t>
+      </w:r>
+    </w:p>
+    <w:p>
+      <w:pPr>
+        <w:ind w:left="720" w:firstLine="360"/>
+      </w:pPr>
+      <w:r>
+        <w:t xml:space="preserve">• To know how much things are going to cost ahead of time. </w:t>
+      </w:r>
+    </w:p>
+    <w:p>
+      <w:pPr>
+        <w:pStyle w:val="Heading4"/>
+        <w:ind w:firstLine="720"/>
+      </w:pPr>
+      <w:r>
+        <w:t xml:space="preserve">Pain Points: </w:t>
+      </w:r>
+    </w:p>
+    <w:p>
+      <w:pPr>
+        <w:ind w:left="720" w:firstLine="360"/>
+      </w:pPr>
+      <w:r>
+        <w:t xml:space="preserve">• Being put on hold for a long time when they call. </w:t>
+      </w:r>
+    </w:p>
+    <w:p>
+      <w:pPr>
+        <w:ind w:left="1080"/>
+      </w:pPr>
+      <w:r>
+        <w:t xml:space="preserve">• Forgetting to tell the vet something important because they were nervous or rushed. </w:t>
+      </w:r>
+    </w:p>
+    <w:p>
+      <w:pPr>
+        <w:ind w:left="720" w:firstLine="360"/>
+      </w:pPr>
+      <w:r>
+        <w:t xml:space="preserve">• Not being able to find their pet’s paperwork when they need it for a trip. </w:t>
+      </w:r>
+    </w:p>
+    <w:p>
+      <w:pPr>
+        <w:pStyle w:val="Heading3"/>
+        <w:ind w:firstLine="360"/>
+      </w:pPr>
+      <w:r>
+        <w:lastRenderedPageBreak/>
+        <w:t xml:space="preserve">Vet Techs </w:t>
+      </w:r>
+    </w:p>
+    <w:p>
+      <w:pPr>
+        <w:pStyle w:val="Heading4"/>
+        <w:ind w:firstLine="720"/>
+      </w:pPr>
+      <w:r>
+        <w:t xml:space="preserve">What they need: </w:t>
+      </w:r>
+    </w:p>
+    <w:p>
+      <w:pPr>
+        <w:ind w:left="720" w:firstLine="360"/>
+      </w:pPr>
+      <w:r>
+        <w:t>• To know why the pet is there before they walk into the room.</w:t>
+      </w:r>
+    </w:p>
+    <w:p>
+      <w:pPr>
+        <w:ind w:left="720" w:firstLine="360"/>
+      </w:pPr>
+      <w:r>
+        <w:t xml:space="preserve">• A fast way to type in notes so they don't fall behind. </w:t>
+      </w:r>
+    </w:p>
+    <w:p>
+      <w:pPr>
+        <w:ind w:left="720" w:firstLine="360"/>
+      </w:pPr>
+      <w:r>
+        <w:t xml:space="preserve">• A clear list of what the pet is currently taking for medicine. </w:t>
+      </w:r>
+    </w:p>
+    <w:p>
+      <w:pPr>
+        <w:pStyle w:val="Heading4"/>
+        <w:ind w:firstLine="720"/>
+      </w:pPr>
+      <w:r>
+        <w:t xml:space="preserve">What they want: </w:t>
+      </w:r>
+    </w:p>
+    <w:p>
+      <w:pPr>
+        <w:ind w:left="720" w:firstLine="360"/>
+      </w:pPr>
+      <w:r>
+        <w:t xml:space="preserve">• To spend more time with the animals and less time doing paperwork. </w:t>
+      </w:r>
+    </w:p>
+    <w:p>
+      <w:pPr>
+        <w:ind w:left="720" w:firstLine="360"/>
+      </w:pPr>
+      <w:r>
+        <w:t xml:space="preserve">• For owners to have all their answers ready before the appointment starts. </w:t>
+      </w:r>
+    </w:p>
+    <w:p>
+      <w:pPr>
+        <w:ind w:left="1080"/>
+      </w:pPr>
+      <w:r>
+        <w:t xml:space="preserve">• A system that </w:t>
+      </w:r>
+      <w:proofErr w:type="gramStart"/>
+      <w:r>
+        <w:t>actually works</w:t>
+      </w:r>
+      <w:proofErr w:type="gramEnd"/>
+      <w:r>
+        <w:t xml:space="preserve"> so they aren't constantly running back to the front desk. </w:t>
+      </w:r>
+    </w:p>
+    <w:p>
+      <w:pPr>
+        <w:pStyle w:val="Heading4"/>
+        <w:ind w:firstLine="720"/>
+      </w:pPr>
+      <w:r>
+        <w:t xml:space="preserve">Pain Points: </w:t>
+      </w:r>
+    </w:p>
+    <w:p>
+      <w:pPr>
+        <w:ind w:left="720" w:firstLine="360"/>
+      </w:pPr>
+      <w:r>
+        <w:t xml:space="preserve">• Owners who aren't prepared or don't know their pet's history. </w:t>
+      </w:r>
+    </w:p>
+    <w:p>
+      <w:pPr>
+        <w:ind w:left="720" w:firstLine="360"/>
+      </w:pPr>
+      <w:r>
+        <w:t xml:space="preserve">• When people show up late and it ruins the schedule for the whole day. </w:t>
+      </w:r>
+    </w:p>
+    <w:p>
+      <w:pPr>
+        <w:ind w:left="720" w:firstLine="360"/>
+      </w:pPr>
+      <w:r>
+        <w:t xml:space="preserve">• Having to ask the same basic questions </w:t>
+      </w:r>
+      <w:proofErr w:type="gramStart"/>
+      <w:r>
+        <w:t>over and over again</w:t>
+      </w:r>
+      <w:proofErr w:type="gramEnd"/>
+      <w:r>
+        <w:t xml:space="preserve">. </w:t>
+      </w:r>
+    </w:p>
+    <w:p>
+      <w:pPr>
+        <w:pStyle w:val="Heading3"/>
+        <w:ind w:firstLine="360"/>
+      </w:pPr>
+      <w:r>
+        <w:t xml:space="preserve">Front Desk </w:t>
+      </w:r>
+    </w:p>
+    <w:p>
+      <w:pPr>
+        <w:pStyle w:val="Heading4"/>
+        <w:ind w:firstLine="720"/>
+      </w:pPr>
+      <w:r>
+        <w:t xml:space="preserve">What they need: </w:t>
+      </w:r>
+    </w:p>
+    <w:p>
+      <w:pPr>
+        <w:ind w:left="720" w:firstLine="360"/>
+      </w:pPr>
+      <w:r>
+        <w:t xml:space="preserve">• A calendar that is easy to read and doesn’t let people double-book. </w:t>
+      </w:r>
+    </w:p>
+    <w:p>
+      <w:pPr>
+        <w:ind w:left="720" w:firstLine="360"/>
+      </w:pPr>
+      <w:r>
+        <w:t xml:space="preserve">• To see which rooms </w:t>
+      </w:r>
+      <w:proofErr w:type="gramStart"/>
+      <w:r>
+        <w:t>are empty and which pets</w:t>
+      </w:r>
+      <w:proofErr w:type="gramEnd"/>
+      <w:r>
+        <w:t xml:space="preserve"> are ready to leave. </w:t>
+      </w:r>
+    </w:p>
+    <w:p>
+      <w:pPr>
+        <w:ind w:left="720" w:firstLine="360"/>
+      </w:pPr>
+      <w:r>
+        <w:t xml:space="preserve">• A quick way to look up a customer's phone number or name. </w:t>
+      </w:r>
+    </w:p>
+    <w:p>
+      <w:pPr>
+        <w:pStyle w:val="Heading4"/>
+        <w:ind w:firstLine="720"/>
+      </w:pPr>
+      <w:r>
+        <w:t xml:space="preserve">What they want: </w:t>
+      </w:r>
+    </w:p>
+    <w:p>
+      <w:pPr>
+        <w:ind w:left="720" w:firstLine="360"/>
+      </w:pPr>
+      <w:r>
+        <w:t xml:space="preserve">• The phones to stop ringing so much so they can talk to the people in the lobby. </w:t>
+      </w:r>
+    </w:p>
+    <w:p>
+      <w:pPr>
+        <w:ind w:left="720" w:firstLine="360"/>
+      </w:pPr>
+      <w:r>
+        <w:t xml:space="preserve">• A website that handles </w:t>
+      </w:r>
+      <w:proofErr w:type="gramStart"/>
+      <w:r>
+        <w:t>the easy</w:t>
+      </w:r>
+      <w:proofErr w:type="gramEnd"/>
+      <w:r>
+        <w:t xml:space="preserve"> stuff like booking or reminders automatically. </w:t>
+      </w:r>
+    </w:p>
+    <w:p>
+      <w:pPr>
+        <w:ind w:left="720" w:firstLine="360"/>
+      </w:pPr>
+      <w:r>
+        <w:t xml:space="preserve">• Everything to be organized so they aren't stressed out. </w:t>
+      </w:r>
+    </w:p>
+    <w:p>
+      <w:pPr>
+        <w:pStyle w:val="Heading4"/>
+        <w:ind w:firstLine="720"/>
+      </w:pPr>
+      <w:r>
+        <w:t xml:space="preserve">Pain Points: </w:t>
+      </w:r>
+    </w:p>
+    <w:p>
+      <w:pPr>
+        <w:ind w:left="720" w:firstLine="360"/>
+      </w:pPr>
+      <w:r>
+        <w:t xml:space="preserve">• Having to answer the same three questions all day long. </w:t>
+      </w:r>
+    </w:p>
+    <w:p>
+      <w:pPr>
+        <w:ind w:left="720" w:firstLine="360"/>
+      </w:pPr>
+      <w:r>
+        <w:t xml:space="preserve">• Trying to talk to a person at the desk while three phones are ringing at once. </w:t>
+      </w:r>
+    </w:p>
+    <w:p>
+      <w:pPr>
+        <w:ind w:left="720" w:firstLine="360"/>
+      </w:pPr>
+      <w:r>
+        <w:t>• Dealing with mean or grumpy customers when the schedule is backed up.</w:t>
+      </w:r>
+    </w:p>
     <w:p/>
     <w:p>
       <w:pPr>
         <w:pStyle w:val="Heading2"/>
       </w:pPr>
       <w:r>
+        <w:lastRenderedPageBreak/>
         <w:t>Key Behaviors/Needs &amp; Sample Functionalit</w:t>
       </w:r>
       <w:r>
@@ -340,8 +707,13 @@
         </w:numPr>
         <w:ind w:left="1440"/>
       </w:pPr>
-      <w:r>
-        <w:t>Contacts the clinic with questions </w:t>
+      <w:proofErr w:type="gramStart"/>
+      <w:r>
+        <w:t>Contacts</w:t>
+      </w:r>
+      <w:proofErr w:type="gramEnd"/>
+      <w:r>
+        <w:t xml:space="preserve"> the clinic with questions </w:t>
       </w:r>
     </w:p>
     <w:p>
@@ -352,8 +724,13 @@
         </w:numPr>
         <w:ind w:left="1440"/>
       </w:pPr>
-      <w:r>
-        <w:t>Reviews treatment plans and cost estimates </w:t>
+      <w:proofErr w:type="gramStart"/>
+      <w:r>
+        <w:t>Reviews</w:t>
+      </w:r>
+      <w:proofErr w:type="gramEnd"/>
+      <w:r>
+        <w:t xml:space="preserve"> treatment plans and cost estimates </w:t>
       </w:r>
     </w:p>
     <w:p>
@@ -655,6 +1032,7 @@
         <w:ind w:left="1440"/>
       </w:pPr>
       <w:r>
+        <w:lastRenderedPageBreak/>
         <w:t>Digital forms. </w:t>
       </w:r>
     </w:p>
@@ -671,7 +1049,15 @@
         <w:ind w:left="1440"/>
       </w:pPr>
       <w:r>
-        <w:t>Online bill pay and stored payment methods. </w:t>
+        <w:t xml:space="preserve">Online </w:t>
+      </w:r>
+      <w:proofErr w:type="gramStart"/>
+      <w:r>
+        <w:t>bill</w:t>
+      </w:r>
+      <w:proofErr w:type="gramEnd"/>
+      <w:r>
+        <w:t xml:space="preserve"> pay and stored payment methods. </w:t>
       </w:r>
     </w:p>
     <w:p>
@@ -922,7 +1308,6 @@
         <w:ind w:left="1440"/>
       </w:pPr>
       <w:r>
-        <w:lastRenderedPageBreak/>
         <w:t>Reliable inventory availability. </w:t>
       </w:r>
     </w:p>
@@ -1044,6 +1429,7 @@
         <w:ind w:left="1440"/>
       </w:pPr>
       <w:r>
+        <w:lastRenderedPageBreak/>
         <w:t>Automated dosage calculator. </w:t>
       </w:r>
     </w:p>
@@ -1222,7 +1608,15 @@
         <w:ind w:left="1440"/>
       </w:pPr>
       <w:r>
-        <w:t>Processes payments and prints invoices. </w:t>
+        <w:t xml:space="preserve">Processes payments and </w:t>
+      </w:r>
+      <w:proofErr w:type="gramStart"/>
+      <w:r>
+        <w:t>prints</w:t>
+      </w:r>
+      <w:proofErr w:type="gramEnd"/>
+      <w:r>
+        <w:t xml:space="preserve"> invoices. </w:t>
       </w:r>
     </w:p>
     <w:p>
@@ -1237,8 +1631,13 @@
         </w:tabs>
         <w:ind w:left="1440"/>
       </w:pPr>
-      <w:r>
-        <w:t>Sends reminders and follow-ups. </w:t>
+      <w:proofErr w:type="gramStart"/>
+      <w:r>
+        <w:t>Sends</w:t>
+      </w:r>
+      <w:proofErr w:type="gramEnd"/>
+      <w:r>
+        <w:t xml:space="preserve"> reminders and follow-ups. </w:t>
       </w:r>
     </w:p>
     <w:p>
@@ -1295,7 +1694,6 @@
         <w:ind w:firstLine="720"/>
       </w:pPr>
       <w:r>
-        <w:lastRenderedPageBreak/>
         <w:t>Key Needs: </w:t>
       </w:r>
     </w:p>
@@ -1433,6 +1831,7 @@
         <w:ind w:firstLine="720"/>
       </w:pPr>
       <w:r>
+        <w:lastRenderedPageBreak/>
         <w:t>Sample Functionalities: </w:t>
       </w:r>
     </w:p>
@@ -1683,7 +2082,6 @@
           <w:b/>
           <w:bCs/>
         </w:rPr>
-        <w:lastRenderedPageBreak/>
         <w:t>Location:</w:t>
       </w:r>
       <w:r>
@@ -1708,7 +2106,15 @@
         <w:t>Occupation:</w:t>
       </w:r>
       <w:r>
-        <w:t xml:space="preserve"> Working adult, student, parent, or retired</w:t>
+        <w:t xml:space="preserve"> </w:t>
+      </w:r>
+      <w:proofErr w:type="gramStart"/>
+      <w:r>
+        <w:t>Working</w:t>
+      </w:r>
+      <w:proofErr w:type="gramEnd"/>
+      <w:r>
+        <w:t xml:space="preserve"> adult, student, parent, or retired</w:t>
       </w:r>
     </w:p>
     <w:p>
@@ -1752,8 +2158,13 @@
           <w:tab w:val="num" w:pos="720"/>
         </w:tabs>
       </w:pPr>
-      <w:r>
-        <w:t>Uses smartphone the most</w:t>
+      <w:proofErr w:type="gramStart"/>
+      <w:r>
+        <w:t>Uses</w:t>
+      </w:r>
+      <w:proofErr w:type="gramEnd"/>
+      <w:r>
+        <w:t xml:space="preserve"> smartphone the most</w:t>
       </w:r>
     </w:p>
     <w:p>
@@ -1766,8 +2177,21 @@
           <w:tab w:val="num" w:pos="720"/>
         </w:tabs>
       </w:pPr>
-      <w:r>
-        <w:t>Sometimes uses a laptop to book appointments</w:t>
+      <w:proofErr w:type="gramStart"/>
+      <w:r>
+        <w:t>Sometimes</w:t>
+      </w:r>
+      <w:proofErr w:type="gramEnd"/>
+      <w:r>
+        <w:t xml:space="preserve"> </w:t>
+      </w:r>
+      <w:proofErr w:type="gramStart"/>
+      <w:r>
+        <w:t>uses</w:t>
+      </w:r>
+      <w:proofErr w:type="gramEnd"/>
+      <w:r>
+        <w:t xml:space="preserve"> a laptop to book appointments</w:t>
       </w:r>
     </w:p>
     <w:p>
@@ -1809,6 +2233,7 @@
         </w:tabs>
       </w:pPr>
       <w:r>
+        <w:lastRenderedPageBreak/>
         <w:t>Reads reviews before choosing a vet</w:t>
       </w:r>
     </w:p>
@@ -1822,8 +2247,13 @@
           <w:tab w:val="num" w:pos="720"/>
         </w:tabs>
       </w:pPr>
-      <w:r>
-        <w:t>Likes clear buttons and simple steps</w:t>
+      <w:proofErr w:type="gramStart"/>
+      <w:r>
+        <w:t>Likes</w:t>
+      </w:r>
+      <w:proofErr w:type="gramEnd"/>
+      <w:r>
+        <w:t xml:space="preserve"> clear buttons and simple steps</w:t>
       </w:r>
     </w:p>
     <w:p/>
@@ -1982,8 +2412,13 @@
           <w:tab w:val="num" w:pos="720"/>
         </w:tabs>
       </w:pPr>
-      <w:r>
-        <w:t>Website not working well on phone</w:t>
+      <w:proofErr w:type="gramStart"/>
+      <w:r>
+        <w:t>Website not working</w:t>
+      </w:r>
+      <w:proofErr w:type="gramEnd"/>
+      <w:r>
+        <w:t xml:space="preserve"> well on phone</w:t>
       </w:r>
     </w:p>
     <w:p>
@@ -2004,7 +2439,6 @@
         <w:ind w:firstLine="360"/>
       </w:pPr>
       <w:r>
-        <w:lastRenderedPageBreak/>
         <w:t>Veterinary Technician</w:t>
       </w:r>
     </w:p>
@@ -2118,6 +2552,7 @@
         </w:numPr>
       </w:pPr>
       <w:r>
+        <w:lastRenderedPageBreak/>
         <w:t>Uses scheduling software during work hours</w:t>
       </w:r>
     </w:p>
@@ -2140,7 +2575,15 @@
         </w:numPr>
       </w:pPr>
       <w:r>
-        <w:t>Sometimes answers calls about bookings</w:t>
+        <w:t xml:space="preserve">Sometimes answers </w:t>
+      </w:r>
+      <w:proofErr w:type="gramStart"/>
+      <w:r>
+        <w:t>calls</w:t>
+      </w:r>
+      <w:proofErr w:type="gramEnd"/>
+      <w:r>
+        <w:t xml:space="preserve"> about bookings</w:t>
       </w:r>
     </w:p>
     <w:p/>
@@ -2280,7 +2723,6 @@
         <w:ind w:firstLine="360"/>
       </w:pPr>
       <w:r>
-        <w:lastRenderedPageBreak/>
         <w:t>Front-End Staff (Reception)</w:t>
       </w:r>
     </w:p>
@@ -2385,8 +2827,21 @@
           <w:tab w:val="num" w:pos="720"/>
         </w:tabs>
       </w:pPr>
-      <w:r>
-        <w:t>Uses office computer all day</w:t>
+      <w:proofErr w:type="gramStart"/>
+      <w:r>
+        <w:t>Uses</w:t>
+      </w:r>
+      <w:proofErr w:type="gramEnd"/>
+      <w:r>
+        <w:t xml:space="preserve"> office </w:t>
+      </w:r>
+      <w:proofErr w:type="gramStart"/>
+      <w:r>
+        <w:t>computer</w:t>
+      </w:r>
+      <w:proofErr w:type="gramEnd"/>
+      <w:r>
+        <w:t xml:space="preserve"> all day</w:t>
       </w:r>
     </w:p>
     <w:p>
@@ -2400,6 +2855,7 @@
         </w:tabs>
       </w:pPr>
       <w:r>
+        <w:lastRenderedPageBreak/>
         <w:t>Answers phone calls for appointments</w:t>
       </w:r>
     </w:p>
@@ -2427,8 +2883,13 @@
           <w:tab w:val="num" w:pos="720"/>
         </w:tabs>
       </w:pPr>
-      <w:r>
-        <w:t>Sends reminder emails or texts</w:t>
+      <w:proofErr w:type="gramStart"/>
+      <w:r>
+        <w:t>Sends</w:t>
+      </w:r>
+      <w:proofErr w:type="gramEnd"/>
+      <w:r>
+        <w:t xml:space="preserve"> reminder emails or texts</w:t>
       </w:r>
     </w:p>
     <w:p/>
@@ -2597,7 +3058,6 @@
         <w:pStyle w:val="Heading2"/>
       </w:pPr>
       <w:r>
-        <w:lastRenderedPageBreak/>
         <w:t>Group Priorities &amp; Why</w:t>
       </w:r>
       <w:r>
@@ -17077,6 +17537,7 @@
   <w:style w:type="character" w:default="1" w:styleId="DefaultParagraphFont">
     <w:name w:val="Default Paragraph Font"/>
     <w:uiPriority w:val="1"/>
+    <w:semiHidden/>
     <w:unhideWhenUsed/>
   </w:style>
   <w:style w:type="table" w:default="1" w:styleId="TableNormal">

</xml_diff>